<commit_message>
Polish paper in competition style
</commit_message>
<xml_diff>
--- a/deliverables/polished_20260912/A题论文_可编辑版.docx
+++ b/deliverables/polished_20260912/A题论文_可编辑版.docx
@@ -56,7 +56,7 @@
           <w:sz w:val="24"/>
           <w:szCs w:val="24"/>
         </w:rPr>
-        <w:t xml:space="preserve">药材烘干过程中，内部升温与水分迁移的快慢不同，物性变化和几何收缩又共同影响干燥终点。为求得圆柱形药材的径向温度、干基含水率及烘干时长，本文建立一维径向传热传质模型，依次引入变物性和实测收缩，以环形有限体积法离散空间，结合隐式时间积分与 Richardson 外推求解。</w:t>
+        <w:t xml:space="preserve">药材烘干时，热量由表面传入，水分由内部向外迁移，二者的速率并不相同；同时，物性变化和几何收缩会影响干燥终点。为描述这一过程，本文建立圆柱形药材的一维径向传热传质模型，采用环形有限体积法离散空间，并用隐式时间积分和 Richardson 外推求解。</w:t>
       </w:r>
     </w:p>
     <w:p>
@@ -73,7 +73,7 @@
           <w:sz w:val="24"/>
           <w:szCs w:val="24"/>
         </w:rPr>
-        <w:t xml:space="preserve">针对问题一，在固定半径下分别求解常热物性导热方程与含水率相关扩散方程。1800 s 时，中心和表面温度分别为 33.5753 ℃、36.7856 ℃，干基含水率分别为 2.5500 kg/kg、1.5102 kg/kg。预热阶段中心水分变化较小，失水主要发生在表层。</w:t>
+        <w:t xml:space="preserve">关于问题一，在固定半径和常热物性条件下，分别求解温度场和含水率场。计算得到 1800 s 时中心、表面温度分别为 33.5753 ℃和 36.7856 ℃，对应含水率分别为 2.5500 kg/kg 和 1.5102 kg/kg。由此可见，预热阶段中心水分变化很小，失水主要集中在表层。</w:t>
       </w:r>
     </w:p>
     <w:p>
@@ -90,7 +90,7 @@
           <w:sz w:val="24"/>
           <w:szCs w:val="24"/>
         </w:rPr>
-        <w:t xml:space="preserve">针对问题二，将题设物性写为局部温度与含水率的函数，联立求解温湿耦合方程。3 h 时，中心和表面温度分别为 49.8495 ℃、49.9664 ℃，含水率分别为 1.7662 kg/kg、1.0081 kg/kg。此时温度已接近均匀，水分仍存在明显径向梯度，表明升温完成后仍需持续干燥。</w:t>
+        <w:t xml:space="preserve">关于问题二，将题设中的物性参数表示为温度和含水率的函数，建立温湿耦合模型。3 h 时中心、表面温度分别为 49.8495 ℃和 49.9664 ℃，含水率分别为 1.7662 kg/kg 和 1.0081 kg/kg。可以看出，此时温度已经接近均匀，但水分仍有明显的径向梯度，升温完成后还需要继续干燥。</w:t>
       </w:r>
     </w:p>
     <w:p>
@@ -107,7 +107,7 @@
           <w:sz w:val="24"/>
           <w:szCs w:val="24"/>
         </w:rPr>
-        <w:t xml:space="preserve">针对问题三，以附件 1 最后一小时的环境均值延拓长期边界，并以全域最大含水率低于 0.15 kg/kg 判定干燥完成。固定半径模型的临界时长为 57.4740 h，首个严格达标整分钟为 57.4833 h。不同长期环境设定下，临界时长约为 57.24—57.83 h，说明终点预测对环境延拓假设较为敏感。</w:t>
+        <w:t xml:space="preserve">关于问题三，以附件 1 最后一小时的环境均值延拓长期边界，并把全域最大含水率低于 0.15 kg/kg 作为干燥完成的判据。固定半径模型的临界时长为 57.4740 h，首个严格达标整分钟为 57.4833 h。在不同长期环境设定下，临界时长约为 57.24—57.83 h，说明结果对环境延拓方式较为敏感。</w:t>
       </w:r>
     </w:p>
     <w:p>
@@ -124,7 +124,7 @@
           <w:sz w:val="24"/>
           <w:szCs w:val="24"/>
         </w:rPr>
-        <w:t xml:space="preserve">针对问题四，由均匀收缩下的干物质与水分守恒建立移动边界模型，通过归一化径向坐标将变动区域映射到固定区间。计算得临界时长为 51.0920 h，首个严格达标整分钟为 51.1000 h。保持本问物性而固定初始半径时，对照时长为 129.8481 h，表明收缩对该模型的干燥进程具有较大影响。</w:t>
+        <w:t xml:space="preserve">关于问题四，根据均匀收缩条件下的干物质和水分守恒建立移动边界模型，并用归一化径向坐标把变化区域映射到固定区间。计算得到临界时长为 51.0920 h，首个严格达标整分钟为 51.1000 h。若保持本问物性而固定初始半径，对照时长为 129.8481 h，说明收缩会明显加快本模型中的干燥过程。</w:t>
       </w:r>
     </w:p>
     <w:p>
@@ -141,7 +141,7 @@
           <w:sz w:val="24"/>
           <w:szCs w:val="24"/>
         </w:rPr>
-        <w:t xml:space="preserve">网格加密、通量平衡和独立离散检验支持了数值结果的一致性，两类终点的相邻外推估计差均约为 1 s。所给时长仍受一维近似、有效传质边界及经验密度与收缩关系相容性的限制，属于上述假设下的模型预测。</w:t>
+        <w:t xml:space="preserve">网格加密、通量平衡和独立离散计算均支持上述结果。两类终点的相邻外推值相差约 1 s。需要指出的是，所得时长依赖一维近似、有效传质边界以及经验密度与收缩关系等假设，应理解为相应模型条件下的预测。</w:t>
       </w:r>
     </w:p>
     <w:p>
@@ -226,7 +226,7 @@
           <w:sz w:val="24"/>
           <w:szCs w:val="24"/>
         </w:rPr>
-        <w:t xml:space="preserve">题目研究长 25 cm、初始半径 2 cm 的圆柱形药材，其初始温度为 28 ℃，初始干基含水率为 2.55 kg/kg。附件 1 提供烘房初期温度及含湿量，附件 2 提供药材半径随时间的变化。所求结果不仅包含平均干燥趋势，还包括指定物理半径处的局部温度和含水率，因此必须建立具有空间分辨能力的模型 [1]。</w:t>
+        <w:t xml:space="preserve">题目研究一根长 25 cm、初始半径为 2 cm 的圆柱形药材。烘干开始时，药材温度为 28 ℃，干基含水率为 2.55 kg/kg；附件 1 给出了烘房初期的温度和含湿量，附件 2 给出了药材半径随时间的变化。题目既要求考察整体干燥趋势，又要求给出指定位置的温度和含水率，因此需要建立具有空间分辨能力的模型 [1]。</w:t>
       </w:r>
     </w:p>
     <w:p>
@@ -243,7 +243,7 @@
           <w:sz w:val="24"/>
           <w:szCs w:val="24"/>
         </w:rPr>
-        <w:t xml:space="preserve">四问依次考察预热、变物性干燥、终点判定和几何收缩。第一问计算固定半径下的 30 min 预热过程；第二问从初始时刻采用附录 3 的物性，求解全程温湿分布并列出前三小时结果；第三问沿用第二问模型，确定各处含水率均低于 0.15 kg/kg 的时间；第四问引入附录 4 物性和实测半径，重新计算干燥终点。第二问独立从题设初值起算，第三问则是其长期延伸。</w:t>
+        <w:t xml:space="preserve">四个问题分别考察预热过程、变物性干燥、干燥终点和几何收缩。问题一计算固定半径下 30 min 内的温度和含水率；问题二从题设初值出发，采用附录 3 物性计算全程温湿分布，并列出前三小时结果；问题三沿用问题二模型，确定各处含水率均低于 0.15 kg/kg 的时间；问题四采用附录 4 物性和实测半径，重新计算干燥终点。问题二从初始时刻独立计算，问题三是在此基础上的长期延伸。</w:t>
       </w:r>
     </w:p>
     <w:p>
@@ -281,7 +281,7 @@
           <w:sz w:val="24"/>
           <w:szCs w:val="24"/>
         </w:rPr>
-        <w:t xml:space="preserve">题目要求同时给出局部分布和全域达标时间，仅用平均水分比的经验曲线难以完成这两项任务。因此，本文采用 Fourier 导热和 Fick 有效扩散描述内部输运，以表面对流边界连接烘房环境。圆柱物料的热质耦合模型 [2] 和非等温移动边界模型 [3] 为这一选择提供了参考，具体物性与观测输入均取自本题。</w:t>
+        <w:t xml:space="preserve">本题要求给出药材内部的局部分布和全域达标时间，仅用平均含水率经验曲线无法完成上述任务。为此，本文采用 Fourier 导热方程和 Fick 有效扩散方程描述内部输运，再用表面对流边界连接药材与烘房环境。圆柱物料的热质耦合模型 [2] 以及非等温移动边界模型 [3] 为模型选择提供了参考，具体物性和观测数据均采用题目给定值。</w:t>
       </w:r>
     </w:p>
     <w:p>
@@ -298,7 +298,7 @@
           <w:sz w:val="24"/>
           <w:szCs w:val="24"/>
         </w:rPr>
-        <w:t xml:space="preserve">药材长径比为 6.25，本文将径向结果解释为圆柱中截面的分布，采用一维轴对称近似。由常物性到变物性，再到移动边界，逐层增加题目提供的信息，避免引入无法从附件识别的力学参数。第四问的半径是观测输入，不再另设需要拟合的收缩预测方程；这与根据局部收缩速度预测几何的文献模型 [3] 有所区别。</w:t>
+        <w:t xml:space="preserve">药材长径比为 6.25，本文把径向结果理解为圆柱中截面的分布，并采用一维轴对称近似。建模时先考虑常物性，再引入变物性，最后加入移动边界，逐步使用题目提供的信息。问题四直接把半径观测作为输入，不再拟合额外的收缩方程；这与根据局部收缩速度预测几何的文献模型 [3] 不同。</w:t>
       </w:r>
     </w:p>
     <w:p>
@@ -2110,7 +2110,7 @@
           <w:sz w:val="24"/>
           <w:szCs w:val="24"/>
         </w:rPr>
-        <w:t xml:space="preserve">附件 1 含 241 组记录，覆盖 0—14400 s，间隔 60 s；附件 2 含 145 组记录，覆盖 0—259200 s，间隔 1800 s。提取后的两份 CSV 与原始工作簿逐值相同。半径从 2.000 cm 降至末段的 1.198 cm；原始观测值保留，不以拟合曲线代替输入。</w:t>
+        <w:t xml:space="preserve">附件 1 共有 241 组记录，时间范围为 0—14400 s，采样间隔为 60 s；附件 2 共有 145 组记录，时间范围为 0—259200 s，采样间隔为 1800 s。经核对，提取后的两份 CSV 与原始工作簿逐值相同。药材半径由 2.000 cm 逐渐减小到 1.198 cm，计算时直接使用原始观测值，不另用拟合曲线代替。</w:t>
       </w:r>
     </w:p>
     <w:p>
@@ -2388,7 +2388,7 @@
           <w:sz w:val="24"/>
           <w:szCs w:val="24"/>
         </w:rPr>
-        <w:t xml:space="preserve">附件 1 最后一小时包含 61 个观测点，温度和含湿量均值分别为 49.998934 ℃、0.04998754 kg/kg，标准差分别为 0.154353 ℃、0.00015013 kg/kg；对应线性趋势约为 0.002824 ℃/h 和 −0.00001288 kg/(kg·h)。尾段波动较小，因此选取该时段均值作为长期平台。由于观测仅覆盖前 4 h，第 8.3 节进一步检验延拓方式对终点的影响。</w:t>
+        <w:t xml:space="preserve">附件 1 只记录了前 4 h 的烘房环境，而问题三、四需要计算更长时间。最后一小时共有 61 个观测点，温度和含湿量的均值分别为 49.998934 ℃和 0.04998754 kg/kg，标准差分别为 0.154353 ℃和 0.00015013 kg/kg；相应线性趋势约为 0.002824 ℃/h 和 −0.00001288 kg/(kg·h)。这一时段波动较小，因此取其均值作为后续环境平台，并在第 8.3 节比较其他延拓方式。</w:t>
       </w:r>
     </w:p>
     <w:p>
@@ -2426,7 +2426,7 @@
           <w:sz w:val="24"/>
           <w:szCs w:val="24"/>
         </w:rPr>
-        <w:t xml:space="preserve">在径向节点周围构造环形控制体。省略所有单元共有的轴向长度后，控制体体积与外侧面积分别为 </w:t>
+        <w:t xml:space="preserve">为了计算温度和含水率随半径的变化，在各径向节点周围划分环形控制体。省略各单元共有的轴向长度后，控制体体积为 </w:t>
       </w:r>
       <m:oMath>
         <m:sSub>
@@ -2524,7 +2524,7 @@
           <w:sz w:val="24"/>
           <w:szCs w:val="24"/>
         </w:rPr>
-        <w:t xml:space="preserve">、</w:t>
+        <w:t xml:space="preserve">，外侧面积为 </w:t>
       </w:r>
       <m:oMath>
         <m:sSub>
@@ -2592,7 +2592,7 @@
           <w:sz w:val="24"/>
           <w:szCs w:val="24"/>
         </w:rPr>
-        <w:t xml:space="preserve">，令蓄积系数为 </w:t>
+        <w:t xml:space="preserve">，记蓄积系数为 </w:t>
       </w:r>
       <m:oMath>
         <m:r>
@@ -2624,7 +2624,7 @@
           <w:sz w:val="24"/>
           <w:szCs w:val="24"/>
         </w:rPr>
-        <w:t xml:space="preserve">，半离散方程为</w:t>
+        <w:t xml:space="preserve">，可得半离散方程</w:t>
       </w:r>
     </w:p>
     <w:p>
@@ -3170,30 +3170,15 @@
           <w:sz w:val="24"/>
           <w:szCs w:val="24"/>
         </w:rPr>
-        <w:t xml:space="preserve">圆心控制体的内侧面积为零，因此不直接计算 </w:t>
+        <w:t xml:space="preserve">圆心控制体的内侧面积为零，可以自然处理 </w:t>
       </w:r>
       <m:oMath>
-        <m:f>
-          <m:fPr>
-            <m:type m:val="lin"/>
-          </m:fPr>
-          <m:num>
-            <m:r>
-              <w:rPr>
-                <w:sz w:val="24"/>
-              </w:rPr>
-              <m:t>1</m:t>
-            </m:r>
-          </m:num>
-          <m:den>
-            <m:r>
-              <w:rPr>
-                <w:sz w:val="24"/>
-              </w:rPr>
-              <m:t>r</m:t>
-            </m:r>
-          </m:den>
-        </m:f>
+        <m:r>
+          <w:rPr>
+            <w:sz w:val="24"/>
+          </w:rPr>
+          <m:t>r=0</m:t>
+        </m:r>
       </m:oMath>
       <w:r>
         <w:rPr>
@@ -3201,7 +3186,7 @@
           <w:sz w:val="24"/>
           <w:szCs w:val="24"/>
         </w:rPr>
-        <w:t xml:space="preserve"> 的奇异表达；表面控制体将外侧项替换为题设 Robin 通量。相邻单元的内部通量大小相等、符号相反，求和后只剩边界通量，便于独立核查离散平衡。</w:t>
+        <w:t xml:space="preserve"> 处的对称条件；最外层控制体则用题设的 Robin 通量代替外侧通量。相邻控制体交界面上的通量大小相等、方向相反，因而对所有单元求和后只剩表面通量，这也为后续的平衡检验提供了依据。</w:t>
       </w:r>
     </w:p>
     <w:p>
@@ -3239,7 +3224,7 @@
           <w:sz w:val="24"/>
           <w:szCs w:val="24"/>
         </w:rPr>
-        <w:t xml:space="preserve">空间离散后得到刚性常微分方程组，采用后向差分公式（BDF）隐式积分。为保持含水率为正，令 </w:t>
+        <w:t xml:space="preserve">空间离散后，偏微分方程转化为刚性常微分方程组，本文采用后向差分公式（BDF）进行隐式积分。为避免计算中出现负含水率，令 </w:t>
       </w:r>
       <m:oMath>
         <m:r>
@@ -3328,7 +3313,7 @@
           <w:sz w:val="24"/>
           <w:szCs w:val="24"/>
         </w:rPr>
-        <w:t xml:space="preserve"> 更新，并由 </w:t>
+        <w:t xml:space="preserve"> 更新，再由 </w:t>
       </w:r>
       <m:oMath>
         <m:r>
@@ -3359,7 +3344,7 @@
           <w:sz w:val="24"/>
           <w:szCs w:val="24"/>
         </w:rPr>
-        <w:t xml:space="preserve"> 恢复含水率。这一变量替换保持原水分方程不变。积分器自适应选取步长，再在题设时刻输出结果。</w:t>
+        <w:t xml:space="preserve"> 还原含水率。积分器自动调整步长，并在题目要求的时刻输出结果。</w:t>
       </w:r>
     </w:p>
     <w:p>
@@ -3542,7 +3527,7 @@
           <w:sz w:val="24"/>
           <w:szCs w:val="24"/>
         </w:rPr>
-        <w:t xml:space="preserve">第一问使用 5120/10240 区间，第二、三问使用 2560/5120 区间，第四问使用 640/1280 区间。外推以渐近二阶误差为前提，精度由网格加密结果评估，四位小数仅作为题设输出格式。第二问按 600 s 分段求解，每段均传递未舍入的完整节点终态。</w:t>
+        <w:t xml:space="preserve">问题一采用 5120/10240 两级网格，问题二、三采用 2560/5120 两级网格，问题四采用 640/1280 两级网格。计算结果经式（4）外推后，再按题意保留四位小数。问题二每 600 s 分段积分，段与段之间传递未舍入的完整节点值，从而避免舍入误差累积。</w:t>
       </w:r>
     </w:p>
     <w:p>
@@ -4560,7 +4545,7 @@
           <w:sz w:val="24"/>
           <w:szCs w:val="24"/>
         </w:rPr>
-        <w:t xml:space="preserve">当烘房温度高于表面时，向外热通量为负，热量进入药材；当表面含水率高于有效环境值时，水分向外迁移。第一问热物性为常数、扩散率不依赖温度，因此温度与水分可以分别求解。</w:t>
+        <w:t xml:space="preserve">由式（7）可知，当烘房温度高于药材表面温度时，热量由环境进入药材；当表面含水率高于环境有效含湿量时，水分由药材向外迁移。问题一中的热物性为常数，扩散率也不随温度变化，因此温度方程和水分方程可以分别求解。</w:t>
       </w:r>
     </w:p>
     <w:p>
@@ -4598,7 +4583,7 @@
           <w:sz w:val="24"/>
           <w:szCs w:val="24"/>
         </w:rPr>
-        <w:t xml:space="preserve">表 1、表 2 按题目时刻和位置列出结果。完整 1—1800 s、径向间隔 0.1 cm 的两类场见支撑材料 result1.xlsx。所有浓度和温度按题意保留四位小数。</w:t>
+        <w:t xml:space="preserve">将上述方程代入附件 1 的环境数据进行计算，得到表 1、表 2。表中列出题目指定时刻和位置的结果，完整的 1—1800 s 温度场和含水率场保存在支撑材料 result1.xlsx 中，径向间隔为 0.1 cm。所有结果均按题意保留四位小数。</w:t>
       </w:r>
     </w:p>
     <w:p>
@@ -8281,7 +8266,7 @@
           <w:sz w:val="24"/>
           <w:szCs w:val="24"/>
         </w:rPr>
-        <w:t xml:space="preserve">由图 1 可见，热量由表面逐渐传向中心，水分损失则主要集中在表层。1800 s 时，表面与中心温差为 3.2103 ℃，表面含水率降至 1.5102 kg/kg，中心仍接近初值。热量与水分的迁移速度不同，使预热末期形成了不同程度的径向梯度。</w:t>
+        <w:t xml:space="preserve">由图 1 可以看到，随着烘干时间增加，热量逐渐由表面传向中心，而水分损失主要发生在表层。1800 s 时，表面与中心的温差为 3.2103 ℃；表面含水率已经降至 1.5102 kg/kg，中心含水率仍接近初值。说明在预热阶段，温度传播快于内部水分迁移，药材表层先出现明显失水。</w:t>
       </w:r>
     </w:p>
     <w:p>
@@ -8637,7 +8622,7 @@
           <w:sz w:val="24"/>
           <w:szCs w:val="24"/>
         </w:rPr>
-        <w:t xml:space="preserve">将式（8）—（9）代入式（5），在题设初值和式（7）的边界下联立求解。含水率改变密度、比热和导热系数，温度则通过扩散率影响水分迁移，二者由此构成非线性耦合。离散时保留导热系数在通量散度内的位置，并将 Arrhenius 项中的温度换算为开尔文温度。</w:t>
+        <w:t xml:space="preserve">把式（8）—（9）代入式（5），并结合题设初值和式（7）的边界条件，即可得到问题二的温湿耦合模型。含水率变化会引起密度、比热和导热系数变化，温度又通过扩散率影响水分迁移，因此两个方程需要联立求解。计算 Arrhenius 项时，将药材温度由摄氏度换算为开尔文温度。</w:t>
       </w:r>
     </w:p>
     <w:p>
@@ -8654,7 +8639,7 @@
           <w:sz w:val="24"/>
           <w:szCs w:val="24"/>
         </w:rPr>
-        <w:t xml:space="preserve">水分方程基于固定骨架和空间均匀干密度的有效扩散近似。能量方程中的经验 </w:t>
+        <w:t xml:space="preserve">这里将水分迁移看作固定骨架中的有效扩散过程，并用经验量 </w:t>
       </w:r>
       <m:oMath>
         <m:r>
@@ -8663,6 +8648,30 @@
           </w:rPr>
           <m:t>ρ(C)</m:t>
         </m:r>
+        <m:sSub>
+          <m:e>
+            <m:r>
+              <w:rPr>
+                <w:sz w:val="24"/>
+              </w:rPr>
+              <m:t>c</m:t>
+            </m:r>
+          </m:e>
+          <m:sub>
+            <m:r>
+              <w:rPr>
+                <w:sz w:val="24"/>
+              </w:rPr>
+              <m:t>p</m:t>
+            </m:r>
+          </m:sub>
+        </m:sSub>
+        <m:r>
+          <w:rPr>
+            <w:sz w:val="24"/>
+          </w:rPr>
+          <m:t>(C)</m:t>
+        </m:r>
       </m:oMath>
       <w:r>
         <w:rPr>
@@ -8670,7 +8679,7 @@
           <w:sz w:val="24"/>
           <w:szCs w:val="24"/>
         </w:rPr>
-        <w:t xml:space="preserve"> 用于构造有效体积热容；若将 </w:t>
+        <w:t xml:space="preserve"> 表示体积热容。若进一步把 </w:t>
       </w:r>
       <m:oMath>
         <m:r>
@@ -8686,7 +8695,7 @@
           <w:sz w:val="24"/>
           <w:szCs w:val="24"/>
         </w:rPr>
-        <w:t xml:space="preserve"> 同时解释为静止骨架的守恒干密度，两种定义将不再相容。本文保留有效模型的解释，并在第 8.5 节讨论该限制。</w:t>
+        <w:t xml:space="preserve"> 解释为严格守恒的干物质密度，会与后续收缩关系产生矛盾，因此本文只把它作为有效物性使用，具体相容性见第 8.5 节。</w:t>
       </w:r>
     </w:p>
     <w:p>
@@ -11892,7 +11901,7 @@
           <w:sz w:val="24"/>
           <w:szCs w:val="24"/>
         </w:rPr>
-        <w:t xml:space="preserve">3 h 时中心与表面温差仅为 0.1169 ℃，但含水率差仍为 0.7581 kg/kg，且各处均未达到 0.15 kg/kg 阈值。升温基本完成后，低含水率区的扩散率继续减小，内部水分向表面的迁移仍需较长时间。这也解释了为什么不能以表面温度稳定作为烘干结束判据。</w:t>
+        <w:t xml:space="preserve">从表 3、表 4 和图 2 可以看出，3 h 时中心与表面的温差只有 0.1169 ℃，药材内部温度已经接近均匀；但中心与表面的含水率仍相差 0.7581 kg/kg，且各处都没有达到 0.15 kg/kg。随着表层含水率降低，扩散率继续减小，内部水分向外迁移还需要较长时间。因此，表面温度趋于稳定并不意味着烘干已经完成。</w:t>
       </w:r>
     </w:p>
     <w:p>
@@ -11909,7 +11918,7 @@
           <w:sz w:val="24"/>
           <w:szCs w:val="24"/>
         </w:rPr>
-        <w:t xml:space="preserve">表 3、表 4 列出前三小时结果；全程温湿场按 1 s 时间间隔和 0.1 cm 径向间隔输出，延伸至第三问首个严格达标整分钟。长期计算采用第 3.1 节的环境边界，前 4 h 最大积分步长为 2 s，此后为 60 s，相对容差为 2×10⁻¹⁰。输出文件、无损压缩方式及跨问一致性检查见附录 A.2。</w:t>
+        <w:t xml:space="preserve">表 3、表 4 给出了前三小时的计算结果。全程温湿场按 1 s 时间间隔、0.1 cm 径向间隔输出，并一直计算到问题三的首个严格达标整分钟。长期环境按第 3.1 节处理，具体输出和跨问题核对方式见附录 A.2。</w:t>
       </w:r>
     </w:p>
     <w:p>
@@ -12084,7 +12093,7 @@
           <w:sz w:val="24"/>
           <w:szCs w:val="24"/>
         </w:rPr>
-        <w:t xml:space="preserve">在终点邻域内，含水率连续下降，临界时刻满足 </w:t>
+        <w:t xml:space="preserve">问题三要求药材各处的含水率都低于 0.15 kg/kg，因此不能只考察表面值或平均值。计算时遍历全部径向节点，并以最大含水率判断是否达标。结果表明，含水率由中心向表面逐渐减小，所以本题的干燥终点由中心位置决定。在临界时刻有 </w:t>
       </w:r>
       <m:oMath>
         <m:r>
@@ -12124,7 +12133,7 @@
           <w:sz w:val="24"/>
           <w:szCs w:val="24"/>
         </w:rPr>
-        <w:t xml:space="preserve">，其后才满足严格不等式。计算时遍历所有径向节点取最大值；外推结果显示含水率沿半径向外非增，因而本算例由中心位置控制干燥终点。</w:t>
+        <w:t xml:space="preserve">，严格低于阈值则发生在其后。</w:t>
       </w:r>
     </w:p>
     <w:p>
@@ -12141,7 +12150,7 @@
           <w:sz w:val="24"/>
           <w:szCs w:val="24"/>
         </w:rPr>
-        <w:t xml:space="preserve">在阈值两侧，对各径向位置的未舍入含水率分别插值，并取其中最晚的阈值到达时间。这样可保留最湿位置随时间变化的可能性。若以整分钟为停止时刻，则定义</w:t>
+        <w:t xml:space="preserve">为准确确定终点，本文在阈值两侧分别对各径向位置的未舍入含水率进行时间插值，并取最晚达到阈值的位置。若设备只能按整分钟停止，则取临界时刻之后的第一个整分钟，即</w:t>
       </w:r>
     </w:p>
     <w:p>
@@ -14719,7 +14728,7 @@
           <w:sz w:val="24"/>
           <w:szCs w:val="24"/>
         </w:rPr>
-        <w:t xml:space="preserve">表 5 最后一行为临界时刻结果，中心显示值 0.1500 对应阈值边界。严格达标的停止时刻按式（11）另行确定；工作簿同时列出分钟序列、临界行和首个严格达标整分钟行。</w:t>
+        <w:t xml:space="preserve">表 5 最后一行给出了临界时刻的含水率，此时中心显示为 0.1500，恰好位于阈值边界。按式（11）计算，下一整分钟才严格满足题目要求。完整工作簿同时保留了分钟序列、临界行和首个严格达标整分钟行。</w:t>
       </w:r>
     </w:p>
     <w:p>
@@ -14802,7 +14811,7 @@
           <w:sz w:val="24"/>
           <w:szCs w:val="24"/>
         </w:rPr>
-        <w:t xml:space="preserve">图 3 显示，表面含水率先于中心下降，后期各位置的变化均趋缓。干燥终点因此应由全域最大含水率控制，表面或平均值达标不足以保证内部干燥完成。上述时长以所选长期环境平台为条件，其敏感性见第 8.3 节。</w:t>
+        <w:t xml:space="preserve">由图 3 可以看到，表面含水率下降最快，中心下降最慢；进入干燥后期后，各位置的变化逐渐变缓。因此，只判断表面或平均含水率会提前结束烘干，必须以全域最大值作为终点判据。上述时长是在第 3.1 节长期环境假设下得到的，其敏感性将在第 8.3 节分析。</w:t>
       </w:r>
     </w:p>
     <w:p>
@@ -14861,7 +14870,7 @@
           <w:sz w:val="24"/>
           <w:szCs w:val="24"/>
         </w:rPr>
-        <w:t xml:space="preserve">附件 2 给出 </w:t>
+        <w:t xml:space="preserve">问题四与前三问的主要区别是药材半径随时间变化。附件 2 已经给出 </w:t>
       </w:r>
       <m:oMath>
         <m:r>
@@ -14877,7 +14886,7 @@
           <w:sz w:val="24"/>
           <w:szCs w:val="24"/>
         </w:rPr>
-        <w:t xml:space="preserve">，在均匀径向收缩、长度不变假设下，材料速度为 </w:t>
+        <w:t xml:space="preserve">，因此直接把实测半径引入模型。在均匀径向收缩且长度不变的条件下，材料速度为 </w:t>
       </w:r>
       <m:oMath>
         <m:sSub>
@@ -14994,7 +15003,7 @@
           <w:sz w:val="24"/>
           <w:szCs w:val="24"/>
         </w:rPr>
-        <w:t xml:space="preserve">，则</w:t>
+        <w:t xml:space="preserve">，则干物质和水分分别满足</w:t>
       </w:r>
     </w:p>
     <w:p>
@@ -15236,7 +15245,7 @@
           <w:sz w:val="24"/>
           <w:szCs w:val="24"/>
         </w:rPr>
-        <w:t xml:space="preserve">采用有效 Fick 通量 </w:t>
+        <w:t xml:space="preserve">取有效 Fick 通量 </w:t>
       </w:r>
       <m:oMath>
         <m:sSub>
@@ -15297,7 +15306,7 @@
           <w:sz w:val="24"/>
           <w:szCs w:val="24"/>
         </w:rPr>
-        <w:t xml:space="preserve">，从两式消去干物质连续方程，得</w:t>
+        <w:t xml:space="preserve">，并从上述两式中消去干物质连续方程，得到</w:t>
       </w:r>
     </w:p>
     <w:p>
@@ -15449,7 +15458,7 @@
           <w:sz w:val="24"/>
           <w:szCs w:val="24"/>
         </w:rPr>
-        <w:t xml:space="preserve">均匀初始干密度与均匀径向收缩给出 </w:t>
+        <w:t xml:space="preserve">由于初始干密度均匀，且截面作均匀径向收缩，干物质守恒给出 </w:t>
       </w:r>
       <m:oMath>
         <m:sSub>
@@ -15551,7 +15560,35 @@
           <w:sz w:val="24"/>
           <w:szCs w:val="24"/>
         </w:rPr>
-        <w:t xml:space="preserve">，故干密度在空间上均匀，才可在式（13）的散度内外约去，得到</w:t>
+        <w:t xml:space="preserve">。此时干密度只随时间变化，式（13）中的 </w:t>
+      </w:r>
+      <m:oMath>
+        <m:sSub>
+          <m:e>
+            <m:r>
+              <w:rPr>
+                <w:sz w:val="24"/>
+              </w:rPr>
+              <m:t>ρ</m:t>
+            </m:r>
+          </m:e>
+          <m:sub>
+            <m:r>
+              <w:rPr>
+                <w:sz w:val="24"/>
+              </w:rPr>
+              <m:t>d</m:t>
+            </m:r>
+          </m:sub>
+        </m:sSub>
+      </m:oMath>
+      <w:r>
+        <w:rPr>
+          <w:rFonts w:ascii="Times New Roman" w:cs="Times New Roman" w:eastAsia="宋体" w:hAnsi="Times New Roman"/>
+          <w:sz w:val="24"/>
+          <w:szCs w:val="24"/>
+        </w:rPr>
+        <w:t xml:space="preserve"> 可以约去，从而得到</w:t>
       </w:r>
     </w:p>
     <w:p>
@@ -15770,7 +15807,7 @@
           <w:sz w:val="24"/>
           <w:szCs w:val="24"/>
         </w:rPr>
-        <w:t xml:space="preserve">由于 </w:t>
+        <w:t xml:space="preserve">式（14）中的 </w:t>
       </w:r>
       <m:oMath>
         <m:r>
@@ -15786,7 +15823,7 @@
           <w:sz w:val="24"/>
           <w:szCs w:val="24"/>
         </w:rPr>
-        <w:t xml:space="preserve"> 表示单位干物质量所含的水分，体积变化已由骨架输运与干物质连续方程共同描述，式（14）无需再加入体积压缩源项。</w:t>
+        <w:t xml:space="preserve"> 是单位干物质量所含的水分，几何收缩已经通过骨架运动和干物质守恒体现，因此不需要再加入体积压缩源项。</w:t>
       </w:r>
     </w:p>
     <w:p>
@@ -15824,7 +15861,7 @@
           <w:sz w:val="24"/>
           <w:szCs w:val="24"/>
         </w:rPr>
-        <w:t xml:space="preserve">令 </w:t>
+        <w:t xml:space="preserve">为避免不断改变计算区域，令 </w:t>
       </w:r>
       <m:oMath>
         <m:r>
@@ -15840,7 +15877,23 @@
           <w:sz w:val="24"/>
           <w:szCs w:val="24"/>
         </w:rPr>
-        <w:t xml:space="preserve">，则固定 </w:t>
+        <w:t xml:space="preserve">，把收缩的物理区域映射到固定区间 </w:t>
+      </w:r>
+      <m:oMath>
+        <m:r>
+          <w:rPr>
+            <w:sz w:val="24"/>
+          </w:rPr>
+          <m:t>0&lt;ξ&lt;1</m:t>
+        </m:r>
+      </m:oMath>
+      <w:r>
+        <w:rPr>
+          <w:rFonts w:ascii="Times New Roman" w:cs="Times New Roman" w:eastAsia="宋体" w:hAnsi="Times New Roman"/>
+          <w:sz w:val="24"/>
+          <w:szCs w:val="24"/>
+        </w:rPr>
+        <w:t xml:space="preserve">。由于固定 </w:t>
       </w:r>
       <m:oMath>
         <m:r>
@@ -15856,23 +15909,7 @@
           <w:sz w:val="24"/>
           <w:szCs w:val="24"/>
         </w:rPr>
-        <w:t xml:space="preserve"> 的网格速度与骨架速度一致，坐标变换项与式（14）的对流项相消。在 </w:t>
-      </w:r>
-      <m:oMath>
-        <m:r>
-          <w:rPr>
-            <w:sz w:val="24"/>
-          </w:rPr>
-          <m:t>0&lt;ξ&lt;1</m:t>
-        </m:r>
-      </m:oMath>
-      <w:r>
-        <w:rPr>
-          <w:rFonts w:ascii="Times New Roman" w:cs="Times New Roman" w:eastAsia="宋体" w:hAnsi="Times New Roman"/>
-          <w:sz w:val="24"/>
-          <w:szCs w:val="24"/>
-        </w:rPr>
-        <w:t xml:space="preserve"> 内，采用</w:t>
+        <w:t xml:space="preserve"> 的网格速度与骨架速度相同，坐标变换产生的项恰好与式（14）中的对流项抵消，于是得到</w:t>
       </w:r>
     </w:p>
     <w:p>
@@ -16323,7 +16360,7 @@
           <w:sz w:val="24"/>
           <w:szCs w:val="24"/>
         </w:rPr>
-        <w:t xml:space="preserve">热方程沿材料坐标采用有效热容近似，不额外计入变形功及相变热。圆心为 </w:t>
+        <w:t xml:space="preserve">热方程仍采用有效热容近似，不计变形功和相变热。圆心满足对称条件 </w:t>
       </w:r>
       <m:oMath>
         <m:sSub>
@@ -16680,7 +16717,7 @@
           <w:sz w:val="24"/>
           <w:szCs w:val="24"/>
         </w:rPr>
-        <w:t xml:space="preserve">变换后，内部扩散项含 </w:t>
+        <w:t xml:space="preserve">从式（15）—（17）可以看出，内部扩散项随 </w:t>
       </w:r>
       <m:oMath>
         <m:sSup>
@@ -16708,7 +16745,7 @@
           <w:sz w:val="24"/>
           <w:szCs w:val="24"/>
         </w:rPr>
-        <w:t xml:space="preserve"> 尺度，表面通量含 </w:t>
+        <w:t xml:space="preserve"> 变化，表面通量随 </w:t>
       </w:r>
       <m:oMath>
         <m:sSup>
@@ -16736,7 +16773,7 @@
           <w:sz w:val="24"/>
           <w:szCs w:val="24"/>
         </w:rPr>
-        <w:t xml:space="preserve"> 尺度，收缩由这两处共同进入离散方程。</w:t>
+        <w:t xml:space="preserve"> 变化。随着半径减小，内部传递距离缩短，收缩因而会影响干燥速度。</w:t>
       </w:r>
     </w:p>
     <w:p>
@@ -17041,7 +17078,7 @@
           <w:sz w:val="24"/>
           <w:szCs w:val="24"/>
         </w:rPr>
-        <w:t xml:space="preserve">每个时刻以 </w:t>
+        <w:t xml:space="preserve">题目要求给出固定物理位置的含水率，因此在每个时刻用 </w:t>
       </w:r>
       <m:oMath>
         <m:r>
@@ -17057,7 +17094,7 @@
           <w:sz w:val="24"/>
           <w:szCs w:val="24"/>
         </w:rPr>
-        <w:t xml:space="preserve"> 将题设固定物理位置映射到计算网格。当 </w:t>
+        <w:t xml:space="preserve"> 把相应位置映射到计算网格。当 </w:t>
       </w:r>
       <m:oMath>
         <m:r>
@@ -17073,7 +17110,7 @@
           <w:sz w:val="24"/>
           <w:szCs w:val="24"/>
         </w:rPr>
-        <w:t xml:space="preserve"> 时，该位置已在药材之外，工作簿对应单元格留空；“药材表面”列始终取 </w:t>
+        <w:t xml:space="preserve"> 时，该位置已经位于药材之外，工作簿中的相应单元格留空；“药材表面”一列始终取 </w:t>
       </w:r>
       <m:oMath>
         <m:r>
@@ -17089,7 +17126,7 @@
           <w:sz w:val="24"/>
           <w:szCs w:val="24"/>
         </w:rPr>
-        <w:t xml:space="preserve">，随实际边界移动。</w:t>
+        <w:t xml:space="preserve">，随真实边界移动。</w:t>
       </w:r>
     </w:p>
     <w:p>
@@ -18971,7 +19008,7 @@
           <w:sz w:val="24"/>
           <w:szCs w:val="24"/>
         </w:rPr>
-        <w:t xml:space="preserve">6 h 时半径已为 1.374 cm，之后继续非增；因此表 6 所列时刻的 1.5 cm 和 2 cm 均在实体外，只保留 0、0.5、1 cm 及实际表面。完整 result4.xlsx 仍保留全部 0.1 cm 固定位置与真实表面列，并以空白标记实体外位置。</w:t>
+        <w:t xml:space="preserve">由附件 2 可知，6 h 时药材半径已经减小到 1.374 cm，此后还将继续减小。因此，在表 6 所列时刻，距中心 1.5 cm 和 2 cm 的位置均已位于药材之外，表中只列出 0、0.5、1 cm 和实际表面。完整的 result4.xlsx 仍保留所有间隔为 0.1 cm 的固定位置，并用空白表示实体外位置。</w:t>
       </w:r>
     </w:p>
     <w:p>
@@ -19120,7 +19157,7 @@
           <w:sz w:val="24"/>
           <w:szCs w:val="24"/>
         </w:rPr>
-        <w:t xml:space="preserve">第三、四问的临界时长相差约 6.38 h，这一差异同时包含物性与几何变化的影响。为单独考察收缩作用，第 8.4 节保持附录 4 物性不变，仅将半径固定为初始值进行对照。</w:t>
+        <w:t xml:space="preserve">问题三和问题四的临界时长相差约 6.38 h，但两问同时改变了物性和几何条件，不能把这一差值全部归因于收缩。为进一步考察几何收缩的作用，第 8.4 节保持附录 4 物性不变，只把半径固定为初始值进行对照。</w:t>
       </w:r>
     </w:p>
     <w:p>
@@ -19179,7 +19216,7 @@
           <w:sz w:val="24"/>
           <w:szCs w:val="24"/>
         </w:rPr>
-        <w:t xml:space="preserve">第一问两级网格在全部输出节点的最大温度和含水率差分别约为 1.03×10⁻⁶ ℃、4.57×10⁻⁶ kg/kg；第二问前三小时对应最大差约为 8.14×10⁻⁷ ℃、1.49×10⁻⁵ kg/kg。最终结果采用式（4）的外推值，网格差用于评估数值误差，保留四位小数则服务于题设表格要求。</w:t>
+        <w:t xml:space="preserve">首先对空间网格进行加密计算。第一问两级网格在全部输出节点的最大温度和含水率差分别约为 1.03×10⁻⁶ ℃和 4.57×10⁻⁶ kg/kg；第二问前三小时的最大差分别约为 8.14×10⁻⁷ ℃和 1.49×10⁻⁵ kg/kg。由此可见，网格加密后结果变化很小，本文取式（4）的外推值作为最终计算结果。</w:t>
       </w:r>
     </w:p>
     <w:p>
@@ -20120,7 +20157,7 @@
           <w:sz w:val="24"/>
           <w:szCs w:val="24"/>
         </w:rPr>
-        <w:t xml:space="preserve">第三、四问相邻外推组合的终点差分别约为 1.02 s、0.98 s。第四问另用单元中心有限体积程序复算，1600/3200 单元外推得到 51.0919474 h，表 6 代表时刻的含水率与主程序保留四位小数后的值一致。独立计算支持了结果的一致性；由于观测收敛阶仍低于 2，外推差仅作为误差量级参考。</w:t>
+        <w:t xml:space="preserve">表 7 中第三、四问相邻外推组合的终点差分别约为 1.02 s 和 0.98 s。第四问再采用单元中心有限体积程序独立计算，1600/3200 单元外推得到 51.0919474 h，表 6 的代表时刻结果与主程序保留四位小数后的结果一致。以上结果说明数值计算具有较好的一致性；考虑到实际观测收敛阶低于 2，外推差只作为误差量级参考。</w:t>
       </w:r>
     </w:p>
     <w:p>
@@ -20137,7 +20174,7 @@
           <w:sz w:val="24"/>
           <w:szCs w:val="24"/>
         </w:rPr>
-        <w:t xml:space="preserve">程序同时检验了平衡场保持、边界通量方向、固定半径退化和阈值插值等情形，95 项自动化测试全部通过。表 1—6 与对应数值输出一致；工作簿回读和跨问比较的详细记录列于附录 A.2。</w:t>
+        <w:t xml:space="preserve">此外，程序还检验了平衡场保持、边界通量方向、固定半径退化和阈值插值等情形，共有 95 项自动化测试通过。表 1—6 与数值输出一致，工作簿回读和跨问题比较的详细记录见附录 A.2。</w:t>
       </w:r>
     </w:p>
     <w:p>
@@ -20670,7 +20707,7 @@
           <w:sz w:val="24"/>
           <w:szCs w:val="24"/>
         </w:rPr>
-        <w:t xml:space="preserve">以前 600 s 的逐秒输出和后续分钟输出积分边界通量，第三问两级网格的相对最大残差约为 1.21×10⁻⁶，第四问分别约为 1.61×10⁻⁶、1.69×10⁻⁶。残差较小，说明离散解与模型自身的水分通量平衡关系一致。</w:t>
+        <w:t xml:space="preserve">利用前 600 s 的逐秒输出和后续分钟输出，对边界通量进行积分。第三问两级网格的相对最大残差约为 1.21×10⁻⁶，第四问分别约为 1.61×10⁻⁶ 和 1.69×10⁻⁶。残差均较小，说明离散结果与模型自身的水分通量平衡关系相符。</w:t>
       </w:r>
     </w:p>
     <w:p>
@@ -21199,7 +21236,7 @@
           <w:sz w:val="24"/>
           <w:szCs w:val="24"/>
         </w:rPr>
-        <w:t xml:space="preserve">表 8 各情景采用相同网格，临界时长的跨度约为 0.59 h，明显大于相邻网格外推的差异。该范围表示指定环境设定下的预测变化，并非统计置信区间；比较时均以表内基准为参照。</w:t>
+        <w:t xml:space="preserve">表 8 中各情景采用相同网格，临界时长的跨度约为 0.59 h，明显大于相邻网格外推的差异。可见，长期环境设定对终点的影响大于当前空间离散误差；表中范围是指定情景下的预测变化，不是统计置信区间。</w:t>
       </w:r>
     </w:p>
     <w:p>
@@ -21691,7 +21728,7 @@
           <w:sz w:val="24"/>
           <w:szCs w:val="24"/>
         </w:rPr>
-        <w:t xml:space="preserve">在表 9 的取值范围内，传质系数变化引起的终点偏移大于传热系数变化的影响。这与后期主要受水分迁移制约的结果相符。0.8 倍和 1.2 倍为指定扰动幅度，实际参数的不确定性仍需实验标定。</w:t>
+        <w:t xml:space="preserve">由表 9 可以看出，在给定取值范围内，传质系数变化引起的终点偏移明显大于传热系数变化的影响。这说明干燥后期主要受水分迁移控制。0.8 倍和 1.2 倍只是设定的扰动幅度，实际参数还需要实验标定。</w:t>
       </w:r>
     </w:p>
     <w:p>
@@ -21729,7 +21766,7 @@
           <w:sz w:val="24"/>
           <w:szCs w:val="24"/>
         </w:rPr>
-        <w:t xml:space="preserve">保持附件 2 全部观测点不变，将线性插值替换为单调 PCHIP，在相同 320 区间下终点提前约 12.603 s。另将内部半径观测时刻统一提前或推后 15 min，终点相对同组基准改变约 −0.135 h、+0.137 h。前者比较插值方法，后者改变观测时刻，二者不是同一种检验。</w:t>
+        <w:t xml:space="preserve">在保持附件 2 观测点不变的情况下，将分段线性插值改为单调 PCHIP，320 区间计算得到的终点提前约 12.603 s。进一步把半径观测时刻统一提前或推后 15 min，终点相对同组基准分别改变约 −0.135 h 和 +0.137 h。前者考察插值方法，后者考察观测时标扰动，两种检验分别反映不同的不确定性来源。</w:t>
       </w:r>
     </w:p>
     <w:p>
@@ -21746,7 +21783,7 @@
           <w:sz w:val="24"/>
           <w:szCs w:val="24"/>
         </w:rPr>
-        <w:t xml:space="preserve">使用附录 4 相同物性、但固定 </w:t>
+        <w:t xml:space="preserve">在附录 4 物性保持不变、而把半径固定为 </w:t>
       </w:r>
       <m:oMath>
         <m:r>
@@ -21780,7 +21817,7 @@
           <w:sz w:val="24"/>
           <w:szCs w:val="24"/>
         </w:rPr>
-        <w:t xml:space="preserve"> 的对照模型，640/1280 区间外推终点为 129.8481 h；实测收缩模型约为 51.0920 h。半径减小通过式（16）的扩散尺度与式（17）的表面尺度共同影响水分迁移。该对照隔离了所选模型中的几何差异，但并非对真实药材收缩效应的独立实验测量。</w:t>
+        <w:t xml:space="preserve"> 的对照模型中，640/1280 区间外推终点为 129.8481 h，而实测收缩模型约为 51.0920 h。半径减小同时改变式（16）的内部扩散尺度和式（17）的表面尺度，因此会显著影响水分迁移。该对照只用于分离所选模型中的几何因素，并不等同于真实药材收缩效应的独立实验测量。</w:t>
       </w:r>
     </w:p>
     <w:p>
@@ -21818,7 +21855,7 @@
           <w:sz w:val="24"/>
           <w:szCs w:val="24"/>
         </w:rPr>
-        <w:t xml:space="preserve">如果把附录 4 的 </w:t>
+        <w:t xml:space="preserve">为了检验密度关系与收缩假设是否相容，先把附录 4 的 </w:t>
       </w:r>
       <m:oMath>
         <m:r>
@@ -21834,7 +21871,7 @@
           <w:sz w:val="24"/>
           <w:szCs w:val="24"/>
         </w:rPr>
-        <w:t xml:space="preserve"> 强制解释为当前真实湿基密度，则应有 </w:t>
+        <w:t xml:space="preserve"> 解释为当前真实湿基密度。此时有 </w:t>
       </w:r>
       <m:oMath>
         <m:sSub>
@@ -21868,7 +21905,7 @@
           <w:sz w:val="24"/>
           <w:szCs w:val="24"/>
         </w:rPr>
-        <w:t xml:space="preserve">，相应总干物质量为</w:t>
+        <w:t xml:space="preserve">，相应的总干物质量为</w:t>
       </w:r>
     </w:p>
     <w:p>
@@ -22023,7 +22060,7 @@
           <w:sz w:val="24"/>
           <w:szCs w:val="24"/>
         </w:rPr>
-        <w:t xml:space="preserve">对非均匀含水率场积分，在 1280 区间自身临界时刻得到 </w:t>
+        <w:t xml:space="preserve">对非均匀含水率场进行积分，在 1280 区间的临界时刻得到 </w:t>
       </w:r>
       <m:oMath>
         <m:sSub>
@@ -22105,7 +22142,7 @@
           <w:sz w:val="24"/>
           <w:szCs w:val="24"/>
         </w:rPr>
-        <w:t xml:space="preserve">，隐含偏差约为 10.97%。因此，若将给定密度解释为真实湿密度，长度不变的实测收缩与干物质守恒在当前解中无法同时严格满足。该偏差用于诊断模型闭合关系，不代表实测干物质损失。</w:t>
+        <w:t xml:space="preserve">，相应偏差约为 10.97%。这说明，若把给定密度看作真实湿基密度，则长度不变的实测收缩与干物质守恒在当前计算中不能同时严格成立。这里的偏差只用于检验模型闭合关系，不表示药材实际损失了相同比例的干物质。</w:t>
       </w:r>
     </w:p>
     <w:p>
@@ -22122,7 +22159,7 @@
           <w:sz w:val="24"/>
           <w:szCs w:val="24"/>
         </w:rPr>
-        <w:t xml:space="preserve">本文将附录密度用于经验有效体积热容，水分方程中的干密度则由均匀收缩假设定义。两者分开使用给出了有效模型的适用解释，但密度与几何关系的不相容仍是其结构限制。要建立严格的多组分守恒模型，还需补充孔隙率、局部变形或长度变化等信息，现有附件不足以确定这些关系。</w:t>
+        <w:t xml:space="preserve">本文在热方程中将附录密度用于经验有效体积热容，在水分方程中则按均匀收缩假设确定干密度。这样的处理可以构成当前题设下的有效模型，但密度与几何关系的不相容仍然是模型的结构限制。若要建立严格的多组分守恒模型，还需补充孔隙率、局部变形或长度变化等信息，现有附件尚不能确定这些关系。</w:t>
       </w:r>
     </w:p>
     <w:p>
@@ -22181,7 +22218,7 @@
           <w:sz w:val="24"/>
           <w:szCs w:val="24"/>
         </w:rPr>
-        <w:t xml:space="preserve">本文以统一的有限体积离散处理常物性、变物性和实测收缩三种情形，得到题设位置的温湿分布，并以全域最大含水率确定干燥终点。移动坐标使变化的几何区域转为固定计算区间，同时保留实际表面与固定物理位置的区别。网格加密、通量平衡及独立程序比较为数值结果提供了相互补充的检查。</w:t>
+        <w:t xml:space="preserve">本文以统一的有限体积方法处理常物性、变物性和实测收缩三种情形，得到题设位置的温度、含水率分布，并用全域最大含水率确定干燥终点。问题四中引入移动坐标后，变化的几何区域被映射到固定计算区间，同时保留了实际表面与固定物理位置的区别。网格加密、通量平衡和独立程序复算相互补充，为数值结果提供了检验。</w:t>
       </w:r>
     </w:p>
     <w:p>
@@ -22219,7 +22256,7 @@
           <w:sz w:val="24"/>
           <w:szCs w:val="24"/>
         </w:rPr>
-        <w:t xml:space="preserve">预测时长主要受模型结构与输入解释约束。一维中截面近似尚未量化端面影响，长期环境依赖前 4 h 观测的延拓，气固边界采用有效浓度差并沿用题设表面系数；模型还忽略了潜热，且经验密度与收缩关系未严格闭合。现有检验支持数值求解的一致性，物理预测精度仍需独立内部含水率观测验证。</w:t>
+        <w:t xml:space="preserve">模型仍有一定局限。预测时长取决于模型结构和输入数据的解释：一维中截面近似尚未量化端面影响，长期环境由前 4 h 观测延拓得到，气固边界采用有效浓度差并沿用题设表面系数；此外，模型未计入潜热，经验密度与收缩关系也未严格闭合。现有检验能够说明数值求解相互一致，但物理预测精度仍需独立的内部含水率观测验证。</w:t>
       </w:r>
     </w:p>
     <w:p>
@@ -22236,7 +22273,7 @@
           <w:sz w:val="24"/>
           <w:szCs w:val="24"/>
         </w:rPr>
-        <w:t xml:space="preserve">后续应优先补充长期烘房记录与内部温湿测量，检验环境平台和干燥终点；再通过二维模型、吸附平衡关系及几何变形观测，评估端面效应和质量闭合对预测的影响。</w:t>
+        <w:t xml:space="preserve">后续工作可先补充长期烘房记录和内部温湿度测量，用于检验环境平台及干燥终点；再结合二维模型、吸附平衡关系和几何变形观测，进一步评估端面效应及质量闭合对预测结果的影响。</w:t>
       </w:r>
     </w:p>
     <w:p>
@@ -22274,7 +22311,7 @@
           <w:sz w:val="24"/>
           <w:szCs w:val="24"/>
         </w:rPr>
-        <w:t xml:space="preserve">四问结果共同表明，药材烘干先经历明显的表层失水，随后进入内部水分缓慢迁移的阶段；温度接近均匀时，含水率仍可能远高于达标阈值。在本文假设下，固定半径与实测收缩模型的临界时长分别为 57.4740 h、51.0920 h，若按整分钟停止则分别取 57.4833 h、51.1000 h。采用相同物性的固定几何对照进一步说明，收缩是影响预测时长的重要因素，实际工艺应用仍需结合长期环境和内部含水率测量校验。</w:t>
+        <w:t xml:space="preserve">综合四个问题可以看到，药材烘干先表现为表层快速失水，随后转为内部水分缓慢向外迁移；即使温度已经接近均匀，含水率仍可能高于达标阈值。在本文假设下，固定半径模型和实测收缩模型的临界时长分别为 57.4740 h 和 51.0920 h；若设备按整分钟停止，则分别取 57.4833 h 和 51.1000 h。相同物性下的固定几何对照表明，收缩是影响预测时长的重要因素。上述结果可为工艺估计提供参考，但实际应用仍需结合长期环境记录和内部含水率测量进行校验。</w:t>
       </w:r>
     </w:p>
     <w:p>

</xml_diff>

<commit_message>
Simplify competition paper prose
</commit_message>
<xml_diff>
--- a/deliverables/polished_20260912/A题论文_可编辑版.docx
+++ b/deliverables/polished_20260912/A题论文_可编辑版.docx
@@ -56,7 +56,7 @@
           <w:sz w:val="24"/>
           <w:szCs w:val="24"/>
         </w:rPr>
-        <w:t xml:space="preserve">药材烘干时，热量由表面传入，水分由内部向外迁移，二者的速率并不相同；同时，物性变化和几何收缩会影响干燥终点。为描述这一过程，本文建立圆柱形药材的一维径向传热传质模型，采用环形有限体积法离散空间，并用隐式时间积分和 Richardson 外推求解。</w:t>
+        <w:t xml:space="preserve">药材烘干时，热量由表面传入，水分由内部向外迁移，二者的变化速度不同；物性变化和几何收缩也会影响干燥终点。针对这一过程，本文建立圆柱形药材的一维径向传热传质模型，采用环形有限体积法和隐式时间积分进行求解，并用 Richardson 外推提高计算精度。</w:t>
       </w:r>
     </w:p>
     <w:p>
@@ -141,7 +141,7 @@
           <w:sz w:val="24"/>
           <w:szCs w:val="24"/>
         </w:rPr>
-        <w:t xml:space="preserve">网格加密、通量平衡和独立离散计算均支持上述结果。两类终点的相邻外推值相差约 1 s。需要指出的是，所得时长依赖一维近似、有效传质边界以及经验密度与收缩关系等假设，应理解为相应模型条件下的预测。</w:t>
+        <w:t xml:space="preserve">最后，对网格、通量平衡和独立程序进行检验，结果均支持上述计算。两类终点的相邻外推值相差约 1 s。所得时长是在一维近似、有效传质边界和经验密度—收缩关系等条件下得到的预测值。</w:t>
       </w:r>
     </w:p>
     <w:p>
@@ -226,7 +226,7 @@
           <w:sz w:val="24"/>
           <w:szCs w:val="24"/>
         </w:rPr>
-        <w:t xml:space="preserve">题目研究一根长 25 cm、初始半径为 2 cm 的圆柱形药材。烘干开始时，药材温度为 28 ℃，干基含水率为 2.55 kg/kg；附件 1 给出了烘房初期的温度和含湿量，附件 2 给出了药材半径随时间的变化。题目既要求考察整体干燥趋势，又要求给出指定位置的温度和含水率，因此需要建立具有空间分辨能力的模型 [1]。</w:t>
+        <w:t xml:space="preserve">题目研究一根长 25 cm、初始半径为 2 cm 的圆柱形药材。烘干开始时，药材温度为 28 ℃，干基含水率为 2.55 kg/kg。附件 1 给出了烘房初期的温度和含湿量，附件 2 给出了药材半径的变化。题目既要求考察整体干燥情况，又要求给出指定位置的温度和含水率，因此需要建立能够描述内部变化的模型 [1]。</w:t>
       </w:r>
     </w:p>
     <w:p>
@@ -281,7 +281,7 @@
           <w:sz w:val="24"/>
           <w:szCs w:val="24"/>
         </w:rPr>
-        <w:t xml:space="preserve">本题要求给出药材内部的局部分布和全域达标时间，仅用平均含水率经验曲线无法完成上述任务。为此，本文采用 Fourier 导热方程和 Fick 有效扩散方程描述内部输运，再用表面对流边界连接药材与烘房环境。圆柱物料的热质耦合模型 [2] 以及非等温移动边界模型 [3] 为模型选择提供了参考，具体物性和观测数据均采用题目给定值。</w:t>
+        <w:t xml:space="preserve">考虑到题目既要求药材内部的局部分布，又要求给出全域达标时间，只用平均含水率曲线不能满足要求。本文采用 Fourier 导热方程描述传热过程，采用 Fick 有效扩散方程描述水分迁移，再用表面对流边界联系药材和烘房环境。圆柱物料的热质耦合模型 [2] 和非等温移动边界模型 [3] 为建模提供了参考，物性和观测数据均采用题目给定值。</w:t>
       </w:r>
     </w:p>
     <w:p>
@@ -298,7 +298,7 @@
           <w:sz w:val="24"/>
           <w:szCs w:val="24"/>
         </w:rPr>
-        <w:t xml:space="preserve">药材长径比为 6.25，本文把径向结果理解为圆柱中截面的分布，并采用一维轴对称近似。建模时先考虑常物性，再引入变物性，最后加入移动边界，逐步使用题目提供的信息。问题四直接把半径观测作为输入，不再拟合额外的收缩方程；这与根据局部收缩速度预测几何的文献模型 [3] 不同。</w:t>
+        <w:t xml:space="preserve">药材长径比为 6.25，因此本文只考虑径向变化，并将结果看作圆柱中截面的分布。建模时，先处理常物性情形，再考虑物性变化，最后加入实测收缩。问题四直接使用附件给出的半径数据，不再另外拟合收缩方程。</w:t>
       </w:r>
     </w:p>
     <w:p>
@@ -2388,7 +2388,7 @@
           <w:sz w:val="24"/>
           <w:szCs w:val="24"/>
         </w:rPr>
-        <w:t xml:space="preserve">附件 1 只记录了前 4 h 的烘房环境，而问题三、四需要计算更长时间。最后一小时共有 61 个观测点，温度和含湿量的均值分别为 49.998934 ℃和 0.04998754 kg/kg，标准差分别为 0.154353 ℃和 0.00015013 kg/kg；相应线性趋势约为 0.002824 ℃/h 和 −0.00001288 kg/(kg·h)。这一时段波动较小，因此取其均值作为后续环境平台，并在第 8.3 节比较其他延拓方式。</w:t>
+        <w:t xml:space="preserve">附件 1 只记录了前 4 h 的烘房环境，而问题三、四需要更长时间的环境条件。具体做法是：取最后一小时 61 个观测点的均值作为后续环境平台。该时段温度和含湿量的均值分别为 49.998934 ℃和 0.04998754 kg/kg，标准差分别为 0.154353 ℃和 0.00015013 kg/kg；相应线性趋势约为 0.002824 ℃/h 和 −0.00001288 kg/(kg·h)。可以看到，该时段波动较小。第 8.3 节再比较不同延拓方法对结果的影响。</w:t>
       </w:r>
     </w:p>
     <w:p>
@@ -2426,7 +2426,7 @@
           <w:sz w:val="24"/>
           <w:szCs w:val="24"/>
         </w:rPr>
-        <w:t xml:space="preserve">为了计算温度和含水率随半径的变化，在各径向节点周围划分环形控制体。省略各单元共有的轴向长度后，控制体体积为 </w:t>
+        <w:t xml:space="preserve">为计算温度和含水率在半径方向上的变化，将药材截面划分为若干同心圆环。省略各单元共有的轴向长度后，控制体体积为 </w:t>
       </w:r>
       <m:oMath>
         <m:sSub>
@@ -2624,7 +2624,7 @@
           <w:sz w:val="24"/>
           <w:szCs w:val="24"/>
         </w:rPr>
-        <w:t xml:space="preserve">，可得半离散方程</w:t>
+        <w:t xml:space="preserve">，可得</w:t>
       </w:r>
     </w:p>
     <w:p>
@@ -3170,7 +3170,7 @@
           <w:sz w:val="24"/>
           <w:szCs w:val="24"/>
         </w:rPr>
-        <w:t xml:space="preserve">圆心控制体的内侧面积为零，可以自然处理 </w:t>
+        <w:t xml:space="preserve">圆心控制体的内侧面积为零，因此可满足 </w:t>
       </w:r>
       <m:oMath>
         <m:r>
@@ -3186,7 +3186,7 @@
           <w:sz w:val="24"/>
           <w:szCs w:val="24"/>
         </w:rPr>
-        <w:t xml:space="preserve"> 处的对称条件；最外层控制体则用题设的 Robin 通量代替外侧通量。相邻控制体交界面上的通量大小相等、方向相反，因而对所有单元求和后只剩表面通量，这也为后续的平衡检验提供了依据。</w:t>
+        <w:t xml:space="preserve"> 处的对称条件；最外层控制体采用题设的 Robin 边界。相邻控制体之间的通量大小相等、方向相反，所有单元求和后只保留表面通量，后文据此检验水分平衡。</w:t>
       </w:r>
     </w:p>
     <w:p>
@@ -3224,7 +3224,7 @@
           <w:sz w:val="24"/>
           <w:szCs w:val="24"/>
         </w:rPr>
-        <w:t xml:space="preserve">空间离散后，偏微分方程转化为刚性常微分方程组，本文采用后向差分公式（BDF）进行隐式积分。为避免计算中出现负含水率，令 </w:t>
+        <w:t xml:space="preserve">空间离散后，原方程变为常微分方程组。本文采用后向差分公式（BDF）进行隐式积分。为避免出现负含水率，先令 </w:t>
       </w:r>
       <m:oMath>
         <m:r>
@@ -3313,7 +3313,7 @@
           <w:sz w:val="24"/>
           <w:szCs w:val="24"/>
         </w:rPr>
-        <w:t xml:space="preserve"> 更新，再由 </w:t>
+        <w:t xml:space="preserve"> 计算，再由 </w:t>
       </w:r>
       <m:oMath>
         <m:r>
@@ -3527,7 +3527,7 @@
           <w:sz w:val="24"/>
           <w:szCs w:val="24"/>
         </w:rPr>
-        <w:t xml:space="preserve">问题一采用 5120/10240 两级网格，问题二、三采用 2560/5120 两级网格，问题四采用 640/1280 两级网格。计算结果经式（4）外推后，再按题意保留四位小数。问题二每 600 s 分段积分，段与段之间传递未舍入的完整节点值，从而避免舍入误差累积。</w:t>
+        <w:t xml:space="preserve">问题一采用 5120/10240 两级网格，问题二、三采用 2560/5120 两级网格，问题四采用 640/1280 两级网格。计算结果先按式（4）外推，再按题意保留四位小数。问题二每 600 s 分段计算，段与段之间传递未舍入的节点值。</w:t>
       </w:r>
     </w:p>
     <w:p>
@@ -4583,7 +4583,7 @@
           <w:sz w:val="24"/>
           <w:szCs w:val="24"/>
         </w:rPr>
-        <w:t xml:space="preserve">将上述方程代入附件 1 的环境数据进行计算，得到表 1、表 2。表中列出题目指定时刻和位置的结果，完整的 1—1800 s 温度场和含水率场保存在支撑材料 result1.xlsx 中，径向间隔为 0.1 cm。所有结果均按题意保留四位小数。</w:t>
+        <w:t xml:space="preserve">将附件 1 的环境数据代入上述模型，得到表 1、表 2。表中列出题目指定时刻和位置的结果。完整的 1—1800 s 温度场和含水率场保存在支撑材料 result1.xlsx 中，径向间隔为 0.1 cm，表中结果按题意保留四位小数。</w:t>
       </w:r>
     </w:p>
     <w:p>
@@ -8622,7 +8622,7 @@
           <w:sz w:val="24"/>
           <w:szCs w:val="24"/>
         </w:rPr>
-        <w:t xml:space="preserve">把式（8）—（9）代入式（5），并结合题设初值和式（7）的边界条件，即可得到问题二的温湿耦合模型。含水率变化会引起密度、比热和导热系数变化，温度又通过扩散率影响水分迁移，因此两个方程需要联立求解。计算 Arrhenius 项时，将药材温度由摄氏度换算为开尔文温度。</w:t>
+        <w:t xml:space="preserve">将式（8）—（9）代入式（5），再结合初值和式（7）的边界条件，即可得到问题二模型。含水率变化会改变密度、比热和导热系数；温度又会通过扩散率影响水分迁移，因此需要同时求解温度和含水率。计算 Arrhenius 项时，将摄氏温度换算为开尔文温度。</w:t>
       </w:r>
     </w:p>
     <w:p>
@@ -8639,7 +8639,7 @@
           <w:sz w:val="24"/>
           <w:szCs w:val="24"/>
         </w:rPr>
-        <w:t xml:space="preserve">这里将水分迁移看作固定骨架中的有效扩散过程，并用经验量 </w:t>
+        <w:t xml:space="preserve">这里将水分迁移看作固定骨架中的有效扩散，并用经验量 </w:t>
       </w:r>
       <m:oMath>
         <m:r>
@@ -8679,7 +8679,7 @@
           <w:sz w:val="24"/>
           <w:szCs w:val="24"/>
         </w:rPr>
-        <w:t xml:space="preserve"> 表示体积热容。若进一步把 </w:t>
+        <w:t xml:space="preserve"> 表示体积热容。第 8.5 节会说明，若把 </w:t>
       </w:r>
       <m:oMath>
         <m:r>
@@ -8695,7 +8695,7 @@
           <w:sz w:val="24"/>
           <w:szCs w:val="24"/>
         </w:rPr>
-        <w:t xml:space="preserve"> 解释为严格守恒的干物质密度，会与后续收缩关系产生矛盾，因此本文只把它作为有效物性使用，具体相容性见第 8.5 节。</w:t>
+        <w:t xml:space="preserve"> 直接作为守恒干物质密度使用，则会与收缩关系不一致。</w:t>
       </w:r>
     </w:p>
     <w:p>
@@ -12093,7 +12093,7 @@
           <w:sz w:val="24"/>
           <w:szCs w:val="24"/>
         </w:rPr>
-        <w:t xml:space="preserve">问题三要求药材各处的含水率都低于 0.15 kg/kg，因此不能只考察表面值或平均值。计算时遍历全部径向节点，并以最大含水率判断是否达标。结果表明，含水率由中心向表面逐渐减小，所以本题的干燥终点由中心位置决定。在临界时刻有 </w:t>
+        <w:t xml:space="preserve">问题三要求药材各处的含水率都低于 0.15 kg/kg，因此不能只看表面值或平均值。具体计算时，遍历全部径向节点，以最大含水率判断是否达标。结果表明，中心位置的含水率最高，所以干燥终点由中心位置决定。在临界时刻有 </w:t>
       </w:r>
       <m:oMath>
         <m:r>
@@ -12133,7 +12133,7 @@
           <w:sz w:val="24"/>
           <w:szCs w:val="24"/>
         </w:rPr>
-        <w:t xml:space="preserve">，严格低于阈值则发生在其后。</w:t>
+        <w:t xml:space="preserve">，其后的时刻才严格低于阈值。</w:t>
       </w:r>
     </w:p>
     <w:p>
@@ -12150,7 +12150,7 @@
           <w:sz w:val="24"/>
           <w:szCs w:val="24"/>
         </w:rPr>
-        <w:t xml:space="preserve">为准确确定终点，本文在阈值两侧分别对各径向位置的未舍入含水率进行时间插值，并取最晚达到阈值的位置。若设备只能按整分钟停止，则取临界时刻之后的第一个整分钟，即</w:t>
+        <w:t xml:space="preserve">为确定终点，在阈值两侧对各径向位置的未舍入含水率进行时间插值，取最晚达到阈值的位置。若设备只能按整分钟停止，则取临界时刻之后的第一个整分钟，即</w:t>
       </w:r>
     </w:p>
     <w:p>
@@ -14870,7 +14870,7 @@
           <w:sz w:val="24"/>
           <w:szCs w:val="24"/>
         </w:rPr>
-        <w:t xml:space="preserve">问题四与前三问的主要区别是药材半径随时间变化。附件 2 已经给出 </w:t>
+        <w:t xml:space="preserve">问题四中药材半径随时间变化。附件 2 已经给出 </w:t>
       </w:r>
       <m:oMath>
         <m:r>
@@ -14886,7 +14886,7 @@
           <w:sz w:val="24"/>
           <w:szCs w:val="24"/>
         </w:rPr>
-        <w:t xml:space="preserve">，因此直接把实测半径引入模型。在均匀径向收缩且长度不变的条件下，材料速度为 </w:t>
+        <w:t xml:space="preserve">，因此直接把实测半径代入模型。在均匀径向收缩、长度不变的条件下，材料速度为 </w:t>
       </w:r>
       <m:oMath>
         <m:sSub>
@@ -15003,7 +15003,7 @@
           <w:sz w:val="24"/>
           <w:szCs w:val="24"/>
         </w:rPr>
-        <w:t xml:space="preserve">，则干物质和水分分别满足</w:t>
+        <w:t xml:space="preserve">，则</w:t>
       </w:r>
     </w:p>
     <w:p>
@@ -15458,7 +15458,7 @@
           <w:sz w:val="24"/>
           <w:szCs w:val="24"/>
         </w:rPr>
-        <w:t xml:space="preserve">由于初始干密度均匀，且截面作均匀径向收缩，干物质守恒给出 </w:t>
+        <w:t xml:space="preserve">初始干密度均匀，截面又作均匀径向收缩，因此干物质守恒给出 </w:t>
       </w:r>
       <m:oMath>
         <m:sSub>
@@ -15588,7 +15588,7 @@
           <w:sz w:val="24"/>
           <w:szCs w:val="24"/>
         </w:rPr>
-        <w:t xml:space="preserve"> 可以约去，从而得到</w:t>
+        <w:t xml:space="preserve"> 可以约去，得到</w:t>
       </w:r>
     </w:p>
     <w:p>
@@ -15861,7 +15861,7 @@
           <w:sz w:val="24"/>
           <w:szCs w:val="24"/>
         </w:rPr>
-        <w:t xml:space="preserve">为避免不断改变计算区域，令 </w:t>
+        <w:t xml:space="preserve">为便于计算，令 </w:t>
       </w:r>
       <m:oMath>
         <m:r>
@@ -15877,7 +15877,7 @@
           <w:sz w:val="24"/>
           <w:szCs w:val="24"/>
         </w:rPr>
-        <w:t xml:space="preserve">，把收缩的物理区域映射到固定区间 </w:t>
+        <w:t xml:space="preserve">，将收缩区域变换到固定区间 </w:t>
       </w:r>
       <m:oMath>
         <m:r>
@@ -15893,7 +15893,7 @@
           <w:sz w:val="24"/>
           <w:szCs w:val="24"/>
         </w:rPr>
-        <w:t xml:space="preserve">。由于固定 </w:t>
+        <w:t xml:space="preserve">。固定 </w:t>
       </w:r>
       <m:oMath>
         <m:r>
@@ -15909,7 +15909,7 @@
           <w:sz w:val="24"/>
           <w:szCs w:val="24"/>
         </w:rPr>
-        <w:t xml:space="preserve"> 的网格速度与骨架速度相同，坐标变换产生的项恰好与式（14）中的对流项抵消，于是得到</w:t>
+        <w:t xml:space="preserve"> 的网格速度与骨架速度相同，因此坐标变换项与式（14）中的对流项相互抵消，得到</w:t>
       </w:r>
     </w:p>
     <w:p>
@@ -16717,7 +16717,7 @@
           <w:sz w:val="24"/>
           <w:szCs w:val="24"/>
         </w:rPr>
-        <w:t xml:space="preserve">从式（15）—（17）可以看出，内部扩散项随 </w:t>
+        <w:t xml:space="preserve">由式（15）—（17）可知，内部扩散项随 </w:t>
       </w:r>
       <m:oMath>
         <m:sSup>
@@ -16773,7 +16773,7 @@
           <w:sz w:val="24"/>
           <w:szCs w:val="24"/>
         </w:rPr>
-        <w:t xml:space="preserve"> 变化。随着半径减小，内部传递距离缩短，收缩因而会影响干燥速度。</w:t>
+        <w:t xml:space="preserve"> 变化。随着半径减小，内部传递距离变短，因此收缩会影响干燥速度。</w:t>
       </w:r>
     </w:p>
     <w:p>
@@ -17078,7 +17078,7 @@
           <w:sz w:val="24"/>
           <w:szCs w:val="24"/>
         </w:rPr>
-        <w:t xml:space="preserve">题目要求给出固定物理位置的含水率，因此在每个时刻用 </w:t>
+        <w:t xml:space="preserve">题目要求给出固定位置的含水率，因此每个时刻都用 </w:t>
       </w:r>
       <m:oMath>
         <m:r>
@@ -17094,7 +17094,7 @@
           <w:sz w:val="24"/>
           <w:szCs w:val="24"/>
         </w:rPr>
-        <w:t xml:space="preserve"> 把相应位置映射到计算网格。当 </w:t>
+        <w:t xml:space="preserve"> 找到相应的计算位置。当 </w:t>
       </w:r>
       <m:oMath>
         <m:r>
@@ -17110,7 +17110,7 @@
           <w:sz w:val="24"/>
           <w:szCs w:val="24"/>
         </w:rPr>
-        <w:t xml:space="preserve"> 时，该位置已经位于药材之外，工作簿中的相应单元格留空；“药材表面”一列始终取 </w:t>
+        <w:t xml:space="preserve"> 时，该位置已经在药材之外，工作簿中的单元格留空；“药材表面”一列始终取 </w:t>
       </w:r>
       <m:oMath>
         <m:r>
@@ -17126,7 +17126,7 @@
           <w:sz w:val="24"/>
           <w:szCs w:val="24"/>
         </w:rPr>
-        <w:t xml:space="preserve">，随真实边界移动。</w:t>
+        <w:t xml:space="preserve">，随边界移动。</w:t>
       </w:r>
     </w:p>
     <w:p>
@@ -19157,7 +19157,7 @@
           <w:sz w:val="24"/>
           <w:szCs w:val="24"/>
         </w:rPr>
-        <w:t xml:space="preserve">问题三和问题四的临界时长相差约 6.38 h，但两问同时改变了物性和几何条件，不能把这一差值全部归因于收缩。为进一步考察几何收缩的作用，第 8.4 节保持附录 4 物性不变，只把半径固定为初始值进行对照。</w:t>
+        <w:t xml:space="preserve">问题三和问题四的临界时长相差约 6.38 h，但两问同时改变了物性和几何条件。为单独考察收缩的影响，第 8.4 节保持附录 4 物性不变，只把半径固定为初始值进行对照。</w:t>
       </w:r>
     </w:p>
     <w:p>
@@ -20157,7 +20157,7 @@
           <w:sz w:val="24"/>
           <w:szCs w:val="24"/>
         </w:rPr>
-        <w:t xml:space="preserve">表 7 中第三、四问相邻外推组合的终点差分别约为 1.02 s 和 0.98 s。第四问再采用单元中心有限体积程序独立计算，1600/3200 单元外推得到 51.0919474 h，表 6 的代表时刻结果与主程序保留四位小数后的结果一致。以上结果说明数值计算具有较好的一致性；考虑到实际观测收敛阶低于 2，外推差只作为误差量级参考。</w:t>
+        <w:t xml:space="preserve">由表 7 可知，第三、四问相邻外推组合的终点差分别约为 1.02 s 和 0.98 s。第四问再用单元中心有限体积程序独立计算，1600/3200 单元外推得到 51.0919474 h，表 6 的代表时刻结果与主程序保留四位小数后的结果一致。由此可见，数值计算结果较为稳定。由于观测收敛阶低于 2，外推差只作为误差量级参考。</w:t>
       </w:r>
     </w:p>
     <w:p>
@@ -20174,7 +20174,7 @@
           <w:sz w:val="24"/>
           <w:szCs w:val="24"/>
         </w:rPr>
-        <w:t xml:space="preserve">此外，程序还检验了平衡场保持、边界通量方向、固定半径退化和阈值插值等情形，共有 95 项自动化测试通过。表 1—6 与数值输出一致，工作簿回读和跨问题比较的详细记录见附录 A.2。</w:t>
+        <w:t xml:space="preserve">此外，程序还检验了平衡场保持、边界通量方向、固定半径退化和阈值插值等情况，95 项自动化测试均通过。表 1—6 与数值输出一致，工作簿回读和跨问题比较见附录 A.2。</w:t>
       </w:r>
     </w:p>
     <w:p>
@@ -20707,7 +20707,7 @@
           <w:sz w:val="24"/>
           <w:szCs w:val="24"/>
         </w:rPr>
-        <w:t xml:space="preserve">利用前 600 s 的逐秒输出和后续分钟输出，对边界通量进行积分。第三问两级网格的相对最大残差约为 1.21×10⁻⁶，第四问分别约为 1.61×10⁻⁶ 和 1.69×10⁻⁶。残差均较小，说明离散结果与模型自身的水分通量平衡关系相符。</w:t>
+        <w:t xml:space="preserve">利用前 600 s 的逐秒输出和后续分钟输出，对边界通量进行积分。第三问两级网格的相对最大残差约为 1.21×10⁻⁶，第四问分别约为 1.61×10⁻⁶ 和 1.69×10⁻⁶。残差很小，说明计算结果满足模型中的水分通量平衡。</w:t>
       </w:r>
     </w:p>
     <w:p>
@@ -21236,7 +21236,7 @@
           <w:sz w:val="24"/>
           <w:szCs w:val="24"/>
         </w:rPr>
-        <w:t xml:space="preserve">表 8 中各情景采用相同网格，临界时长的跨度约为 0.59 h，明显大于相邻网格外推的差异。可见，长期环境设定对终点的影响大于当前空间离散误差；表中范围是指定情景下的预测变化，不是统计置信区间。</w:t>
+        <w:t xml:space="preserve">表 8 中各情景采用相同网格，临界时长相差约 0.59 h，明显大于相邻网格外推的差异。可以看出，长期环境设定对终点的影响较大。表中数值是指定情景下的计算结果，不表示统计置信区间。</w:t>
       </w:r>
     </w:p>
     <w:p>
@@ -21766,7 +21766,7 @@
           <w:sz w:val="24"/>
           <w:szCs w:val="24"/>
         </w:rPr>
-        <w:t xml:space="preserve">在保持附件 2 观测点不变的情况下，将分段线性插值改为单调 PCHIP，320 区间计算得到的终点提前约 12.603 s。进一步把半径观测时刻统一提前或推后 15 min，终点相对同组基准分别改变约 −0.135 h 和 +0.137 h。前者考察插值方法，后者考察观测时标扰动，两种检验分别反映不同的不确定性来源。</w:t>
+        <w:t xml:space="preserve">首先保持附件 2 的观测点不变，将分段线性插值改为单调 PCHIP。320 区间计算得到的终点提前约 12.603 s。再把半径观测时刻统一提前或推后 15 min，终点相对同组基准分别改变约 −0.135 h 和 +0.137 h。这两种计算分别考察插值方法和观测时刻的影响。</w:t>
       </w:r>
     </w:p>
     <w:p>
@@ -21783,7 +21783,7 @@
           <w:sz w:val="24"/>
           <w:szCs w:val="24"/>
         </w:rPr>
-        <w:t xml:space="preserve">在附录 4 物性保持不变、而把半径固定为 </w:t>
+        <w:t xml:space="preserve">在附录 4 物性不变、半径固定为 </w:t>
       </w:r>
       <m:oMath>
         <m:r>
@@ -21817,7 +21817,7 @@
           <w:sz w:val="24"/>
           <w:szCs w:val="24"/>
         </w:rPr>
-        <w:t xml:space="preserve"> 的对照模型中，640/1280 区间外推终点为 129.8481 h，而实测收缩模型约为 51.0920 h。半径减小同时改变式（16）的内部扩散尺度和式（17）的表面尺度，因此会显著影响水分迁移。该对照只用于分离所选模型中的几何因素，并不等同于真实药材收缩效应的独立实验测量。</w:t>
+        <w:t xml:space="preserve"> 的对照模型中，640/1280 区间外推终点为 129.8481 h，而实测收缩模型约为 51.0920 h。半径减小会同时改变式（16）的内部扩散尺度和式（17）的表面尺度，因此对水分迁移影响很大。该对照只用于考察模型中的几何因素，不是对真实收缩效应的独立实验测量。</w:t>
       </w:r>
     </w:p>
     <w:p>
@@ -21855,7 +21855,7 @@
           <w:sz w:val="24"/>
           <w:szCs w:val="24"/>
         </w:rPr>
-        <w:t xml:space="preserve">为了检验密度关系与收缩假设是否相容，先把附录 4 的 </w:t>
+        <w:t xml:space="preserve">为检验密度关系与收缩假设是否相容，将附录 4 的 </w:t>
       </w:r>
       <m:oMath>
         <m:r>
@@ -21871,7 +21871,7 @@
           <w:sz w:val="24"/>
           <w:szCs w:val="24"/>
         </w:rPr>
-        <w:t xml:space="preserve"> 解释为当前真实湿基密度。此时有 </w:t>
+        <w:t xml:space="preserve"> 看作当前真实湿基密度。此时有 </w:t>
       </w:r>
       <m:oMath>
         <m:sSub>
@@ -21905,7 +21905,7 @@
           <w:sz w:val="24"/>
           <w:szCs w:val="24"/>
         </w:rPr>
-        <w:t xml:space="preserve">，相应的总干物质量为</w:t>
+        <w:t xml:space="preserve">，总干物质量为</w:t>
       </w:r>
     </w:p>
     <w:p>
@@ -22060,7 +22060,7 @@
           <w:sz w:val="24"/>
           <w:szCs w:val="24"/>
         </w:rPr>
-        <w:t xml:space="preserve">对非均匀含水率场进行积分，在 1280 区间的临界时刻得到 </w:t>
+        <w:t xml:space="preserve">对非均匀含水率场积分，在 1280 区间的临界时刻得到 </w:t>
       </w:r>
       <m:oMath>
         <m:sSub>
@@ -22142,7 +22142,7 @@
           <w:sz w:val="24"/>
           <w:szCs w:val="24"/>
         </w:rPr>
-        <w:t xml:space="preserve">，相应偏差约为 10.97%。这说明，若把给定密度看作真实湿基密度，则长度不变的实测收缩与干物质守恒在当前计算中不能同时严格成立。这里的偏差只用于检验模型闭合关系，不表示药材实际损失了相同比例的干物质。</w:t>
+        <w:t xml:space="preserve">，偏差约为 10.97%。这说明，若把给定密度看作真实湿基密度，长度不变的实测收缩与干物质守恒不能同时严格成立。该偏差用于检验模型关系，并不表示药材实际损失了相同比例的干物质。</w:t>
       </w:r>
     </w:p>
     <w:p>
@@ -22159,7 +22159,7 @@
           <w:sz w:val="24"/>
           <w:szCs w:val="24"/>
         </w:rPr>
-        <w:t xml:space="preserve">本文在热方程中将附录密度用于经验有效体积热容，在水分方程中则按均匀收缩假设确定干密度。这样的处理可以构成当前题设下的有效模型，但密度与几何关系的不相容仍然是模型的结构限制。若要建立严格的多组分守恒模型，还需补充孔隙率、局部变形或长度变化等信息，现有附件尚不能确定这些关系。</w:t>
+        <w:t xml:space="preserve">本文在热方程中用附录密度表示经验有效体积热容，在水分方程中按均匀收缩假设确定干密度。该处理可以得到当前题设下的有效模型，但密度与几何关系的不相容仍是模型限制。要建立更严格的多组分守恒模型，还需要孔隙率、局部变形或长度变化等数据，现有附件无法确定这些关系。</w:t>
       </w:r>
     </w:p>
     <w:p>
@@ -22201,7 +22201,7 @@
           <w:sz w:val="24"/>
           <w:szCs w:val="24"/>
         </w:rPr>
-        <w:t xml:space="preserve">9.1 模型特点</w:t>
+        <w:t xml:space="preserve">9.1 模型优点</w:t>
       </w:r>
     </w:p>
     <w:p>
@@ -22218,7 +22218,7 @@
           <w:sz w:val="24"/>
           <w:szCs w:val="24"/>
         </w:rPr>
-        <w:t xml:space="preserve">本文以统一的有限体积方法处理常物性、变物性和实测收缩三种情形，得到题设位置的温度、含水率分布，并用全域最大含水率确定干燥终点。问题四中引入移动坐标后，变化的几何区域被映射到固定计算区间，同时保留了实际表面与固定物理位置的区别。网格加密、通量平衡和独立程序复算相互补充，为数值结果提供了检验。</w:t>
+        <w:t xml:space="preserve">本文用统一的有限体积方法处理常物性、变物性和实测收缩三种情况，得到题设位置的温度和含水率，并以全域最大含水率确定干燥终点。问题四采用移动坐标后，可以在固定计算区间内处理收缩边界，同时区分实际表面和固定位置。网格加密、通量平衡和独立程序复算均支持计算结果。</w:t>
       </w:r>
     </w:p>
     <w:p>
@@ -22239,7 +22239,7 @@
           <w:sz w:val="24"/>
           <w:szCs w:val="24"/>
         </w:rPr>
-        <w:t xml:space="preserve">9.2 局限与改进方向</w:t>
+        <w:t xml:space="preserve">9.2 模型缺点及改进方向</w:t>
       </w:r>
     </w:p>
     <w:p>
@@ -22256,7 +22256,7 @@
           <w:sz w:val="24"/>
           <w:szCs w:val="24"/>
         </w:rPr>
-        <w:t xml:space="preserve">模型仍有一定局限。预测时长取决于模型结构和输入数据的解释：一维中截面近似尚未量化端面影响，长期环境由前 4 h 观测延拓得到，气固边界采用有效浓度差并沿用题设表面系数；此外，模型未计入潜热，经验密度与收缩关系也未严格闭合。现有检验能够说明数值求解相互一致，但物理预测精度仍需独立的内部含水率观测验证。</w:t>
+        <w:t xml:space="preserve">模型还有以下不足：一维中截面近似没有考虑端面影响；长期环境由前 4 h 观测延拓得到；气固边界采用有效浓度差并沿用题设表面系数；模型没有计入潜热，经验密度与收缩关系也未严格闭合。现有检验说明数值求解相互一致，物理预测精度仍需要内部含水率观测验证。</w:t>
       </w:r>
     </w:p>
     <w:p>
@@ -22273,7 +22273,7 @@
           <w:sz w:val="24"/>
           <w:szCs w:val="24"/>
         </w:rPr>
-        <w:t xml:space="preserve">后续工作可先补充长期烘房记录和内部温湿度测量，用于检验环境平台及干燥终点；再结合二维模型、吸附平衡关系和几何变形观测，进一步评估端面效应及质量闭合对预测结果的影响。</w:t>
+        <w:t xml:space="preserve">后续可补充长期烘房记录和内部温湿度测量，用于检验环境平台和干燥终点；再结合二维模型、吸附平衡关系和几何变形观测，进一步分析端面效应和质量闭合对结果的影响。</w:t>
       </w:r>
     </w:p>
     <w:p>
@@ -22311,7 +22311,7 @@
           <w:sz w:val="24"/>
           <w:szCs w:val="24"/>
         </w:rPr>
-        <w:t xml:space="preserve">综合四个问题可以看到，药材烘干先表现为表层快速失水，随后转为内部水分缓慢向外迁移；即使温度已经接近均匀，含水率仍可能高于达标阈值。在本文假设下，固定半径模型和实测收缩模型的临界时长分别为 57.4740 h 和 51.0920 h；若设备按整分钟停止，则分别取 57.4833 h 和 51.1000 h。相同物性下的固定几何对照表明，收缩是影响预测时长的重要因素。上述结果可为工艺估计提供参考，但实际应用仍需结合长期环境记录和内部含水率测量进行校验。</w:t>
+        <w:t xml:space="preserve">综合四个问题的结果可以看到，药材先在表层快速失水，随后内部水分缓慢向外迁移；即使温度已经接近均匀，含水率仍可能高于阈值。在本文假设下，固定半径模型和实测收缩模型的临界时长分别为 57.4740 h 和 51.0920 h；若按整分钟停止，则分别取 57.4833 h 和 51.1000 h。相同物性下的固定几何对照说明，收缩是影响预测时长的重要因素。实际应用时，还需要结合长期环境记录和内部含水率测量进行校验。</w:t>
       </w:r>
     </w:p>
     <w:p>

</xml_diff>

<commit_message>
Add team-led narrative revision
</commit_message>
<xml_diff>
--- a/deliverables/polished_20260912/A题论文_可编辑版.docx
+++ b/deliverables/polished_20260912/A题论文_可编辑版.docx
@@ -56,7 +56,7 @@
           <w:sz w:val="24"/>
           <w:szCs w:val="24"/>
         </w:rPr>
-        <w:t xml:space="preserve">药材烘干时，热量由表面传入，水分由内部向外迁移，二者的变化速度不同；物性变化和几何收缩也会影响干燥终点。针对这一过程，本文建立圆柱形药材的一维径向传热传质模型，采用环形有限体积法和隐式时间积分进行求解，并用 Richardson 外推提高计算精度。</w:t>
+        <w:t xml:space="preserve">药材烘干时，热量从表面向内部传递，水分从内部向外迁移。两者的变化速度并不相同。物性变化和几何收缩还会改变干燥终点。我们据此建立圆柱形药材的一维径向传热传质模型，用环形有限体积法和隐式时间积分求解，并用 Richardson 外推核对数值精度。</w:t>
       </w:r>
     </w:p>
     <w:p>
@@ -226,7 +226,7 @@
           <w:sz w:val="24"/>
           <w:szCs w:val="24"/>
         </w:rPr>
-        <w:t xml:space="preserve">题目研究一根长 25 cm、初始半径为 2 cm 的圆柱形药材。烘干开始时，药材温度为 28 ℃，干基含水率为 2.55 kg/kg。附件 1 给出了烘房初期的温度和含湿量，附件 2 给出了药材半径的变化。题目既要求考察整体干燥情况，又要求给出指定位置的温度和含水率，因此需要建立能够描述内部变化的模型 [1]。</w:t>
+        <w:t xml:space="preserve">题目研究一根长 25 cm、初始半径为 2 cm 的圆柱形药材。烘干开始时，药材温度为 28 ℃，干基含水率为 2.55 kg/kg。附件 1 给出了烘房初期的温度和含湿量，附件 2 给出了药材半径的变化。题目既要求整体干燥情况，也要求指定位置的温度和含水率。我们不能只计算一个平均值，必须描述药材内部的变化 [1]。</w:t>
       </w:r>
     </w:p>
     <w:p>
@@ -281,7 +281,7 @@
           <w:sz w:val="24"/>
           <w:szCs w:val="24"/>
         </w:rPr>
-        <w:t xml:space="preserve">考虑到题目既要求药材内部的局部分布，又要求给出全域达标时间，只用平均含水率曲线不能满足要求。本文采用 Fourier 导热方程描述传热过程，采用 Fick 有效扩散方程描述水分迁移，再用表面对流边界联系药材和烘房环境。圆柱物料的热质耦合模型 [2] 和非等温移动边界模型 [3] 为建模提供了参考，物性和观测数据均采用题目给定值。</w:t>
+        <w:t xml:space="preserve">考虑到题目既要求内部局部分布，又要求全域达标时间，只用平均含水率曲线不能满足要求。我们用 Fourier 导热方程描述传热，用 Fick 有效扩散方程描述水分迁移，再用表面对流边界连接药材和烘房环境。圆柱物料的热质耦合模型 [2] 和非等温移动边界模型 [3] 为建模提供了参考。物性和观测数据均采用题目给定值。</w:t>
       </w:r>
     </w:p>
     <w:p>
@@ -298,7 +298,7 @@
           <w:sz w:val="24"/>
           <w:szCs w:val="24"/>
         </w:rPr>
-        <w:t xml:space="preserve">药材长径比为 6.25，因此本文只考虑径向变化，并将结果看作圆柱中截面的分布。建模时，先处理常物性情形，再考虑物性变化，最后加入实测收缩。问题四直接使用附件给出的半径数据，不再另外拟合收缩方程。</w:t>
+        <w:t xml:space="preserve">药材长径比为 6.25。我们先忽略中段的轴向差异，只计算半径方向的变化，并将结果看作圆柱中截面的分布。建模时，先处理常物性情形，再考虑物性变化，最后加入实测收缩。问题四直接使用附件给出的半径数据，不再另外拟合收缩方程。</w:t>
       </w:r>
     </w:p>
     <w:p>
@@ -2127,15 +2127,51 @@
           <w:sz w:val="24"/>
           <w:szCs w:val="24"/>
         </w:rPr>
-        <w:t xml:space="preserve">对相邻观测点，环境或半径变量 </w:t>
+        <w:t xml:space="preserve">观测点之间没有直接给出数值。我们先按相邻两点的连线补足中间时刻。设 </w:t>
       </w:r>
       <m:oMath>
+        <m:sSub>
+          <m:e>
+            <m:r>
+              <w:rPr>
+                <w:sz w:val="24"/>
+              </w:rPr>
+              <m:t>f</m:t>
+            </m:r>
+          </m:e>
+          <m:sub>
+            <m:r>
+              <w:rPr>
+                <w:sz w:val="24"/>
+              </w:rPr>
+              <m:t>i</m:t>
+            </m:r>
+          </m:sub>
+        </m:sSub>
         <m:r>
           <w:rPr>
             <w:sz w:val="24"/>
           </w:rPr>
-          <m:t>f</m:t>
+          <m:t>,</m:t>
         </m:r>
+        <m:sSub>
+          <m:e>
+            <m:r>
+              <w:rPr>
+                <w:sz w:val="24"/>
+              </w:rPr>
+              <m:t>f</m:t>
+            </m:r>
+          </m:e>
+          <m:sub>
+            <m:r>
+              <w:rPr>
+                <w:sz w:val="24"/>
+              </w:rPr>
+              <m:t>i+1</m:t>
+            </m:r>
+          </m:sub>
+        </m:sSub>
       </m:oMath>
       <w:r>
         <w:rPr>
@@ -2143,7 +2179,7 @@
           <w:sz w:val="24"/>
           <w:szCs w:val="24"/>
         </w:rPr>
-        <w:t xml:space="preserve"> 采用</w:t>
+        <w:t xml:space="preserve"> 分别为相邻时刻的环境量或半径，比例插值得</w:t>
       </w:r>
     </w:p>
     <w:p>
@@ -2388,7 +2424,7 @@
           <w:sz w:val="24"/>
           <w:szCs w:val="24"/>
         </w:rPr>
-        <w:t xml:space="preserve">附件 1 只记录了前 4 h 的烘房环境，而问题三、四需要更长时间的环境条件。具体做法是：取最后一小时 61 个观测点的均值作为后续环境平台。该时段温度和含湿量的均值分别为 49.998934 ℃和 0.04998754 kg/kg，标准差分别为 0.154353 ℃和 0.00015013 kg/kg；相应线性趋势约为 0.002824 ℃/h 和 −0.00001288 kg/(kg·h)。可以看到，该时段波动较小。第 8.3 节再比较不同延拓方法对结果的影响。</w:t>
+        <w:t xml:space="preserve">附件 1 只记录了前 4 h 的烘房环境，而问题三、四需要更长时间的环境条件。我们取最后一小时 61 个观测点的均值作为后续环境平台。该时段温度和含湿量的均值分别为 49.998934 ℃和 0.04998754 kg/kg，标准差分别为 0.154353 ℃和 0.00015013 kg/kg；相应线性趋势约为 0.002824 ℃/h 和 −0.00001288 kg/(kg·h)。可以看到，该时段波动较小。至此，模型中的环境参数取值已知，可以用于后续计算。第 8.3 节再比较不同延拓方法对结果的影响。</w:t>
       </w:r>
     </w:p>
     <w:p>
@@ -2426,7 +2462,23 @@
           <w:sz w:val="24"/>
           <w:szCs w:val="24"/>
         </w:rPr>
-        <w:t xml:space="preserve">为计算温度和含水率在半径方向上的变化，将药材截面划分为若干同心圆环。省略各单元共有的轴向长度后，控制体体积为 </w:t>
+        <w:t xml:space="preserve">为计算温度和含水率在半径方向上的变化，我们把药材截面划分为若干同心圆环。省略各单元共有的轴向长度后，第 </w:t>
+      </w:r>
+      <m:oMath>
+        <m:r>
+          <w:rPr>
+            <w:sz w:val="24"/>
+          </w:rPr>
+          <m:t>i</m:t>
+        </m:r>
+      </m:oMath>
+      <w:r>
+        <w:rPr>
+          <w:rFonts w:ascii="Times New Roman" w:cs="Times New Roman" w:eastAsia="宋体" w:hAnsi="Times New Roman"/>
+          <w:sz w:val="24"/>
+          <w:szCs w:val="24"/>
+        </w:rPr>
+        <w:t xml:space="preserve"> 个控制体的体积为 </w:t>
       </w:r>
       <m:oMath>
         <m:sSub>
@@ -2576,7 +2628,7 @@
           <w:sz w:val="24"/>
           <w:szCs w:val="24"/>
         </w:rPr>
-        <w:t xml:space="preserve">。对一般传输变量 </w:t>
+        <w:t xml:space="preserve">。对每个圆环，先写“单元内累积量 = 外侧流入量 − 内侧流出量”。设 </w:t>
       </w:r>
       <m:oMath>
         <m:r>
@@ -2592,7 +2644,7 @@
           <w:sz w:val="24"/>
           <w:szCs w:val="24"/>
         </w:rPr>
-        <w:t xml:space="preserve">，记蓄积系数为 </w:t>
+        <w:t xml:space="preserve"> 为传输变量，</w:t>
       </w:r>
       <m:oMath>
         <m:r>
@@ -2608,7 +2660,7 @@
           <w:sz w:val="24"/>
           <w:szCs w:val="24"/>
         </w:rPr>
-        <w:t xml:space="preserve">、输运系数为 </w:t>
+        <w:t xml:space="preserve"> 为蓄积系数，</w:t>
       </w:r>
       <m:oMath>
         <m:r>
@@ -2624,7 +2676,7 @@
           <w:sz w:val="24"/>
           <w:szCs w:val="24"/>
         </w:rPr>
-        <w:t xml:space="preserve">，可得</w:t>
+        <w:t xml:space="preserve"> 为输运系数，就得到</w:t>
       </w:r>
     </w:p>
     <w:p>
@@ -2953,7 +3005,7 @@
           <w:sz w:val="24"/>
           <w:szCs w:val="24"/>
         </w:rPr>
-        <w:t xml:space="preserve">对热传导取 </w:t>
+        <w:t xml:space="preserve">式（2）左侧是圆环内变量的变化，右侧是两个界面的净通量。温度方程取 </w:t>
       </w:r>
       <m:oMath>
         <m:r>
@@ -2993,7 +3045,7 @@
           <w:sz w:val="24"/>
           <w:szCs w:val="24"/>
         </w:rPr>
-        <w:t xml:space="preserve">；对有效水分扩散取 </w:t>
+        <w:t xml:space="preserve">；水分方程取 </w:t>
       </w:r>
       <m:oMath>
         <m:r>
@@ -3009,7 +3061,7 @@
           <w:sz w:val="24"/>
           <w:szCs w:val="24"/>
         </w:rPr>
-        <w:t xml:space="preserve">。界面系数采用调和平均：</w:t>
+        <w:t xml:space="preserve">。相邻单元的物性不同，我们用调和平均计算界面系数：</w:t>
       </w:r>
     </w:p>
     <w:p>
@@ -3224,7 +3276,7 @@
           <w:sz w:val="24"/>
           <w:szCs w:val="24"/>
         </w:rPr>
-        <w:t xml:space="preserve">空间离散后，原方程变为常微分方程组。本文采用后向差分公式（BDF）进行隐式积分。为避免出现负含水率，先令 </w:t>
+        <w:t xml:space="preserve">空间离散后，偏微分方程变为常微分方程组。我们用后向差分公式（BDF）推进时间。为避免出现负含水率，先令 </w:t>
       </w:r>
       <m:oMath>
         <m:r>
@@ -3361,7 +3413,7 @@
           <w:sz w:val="24"/>
           <w:szCs w:val="24"/>
         </w:rPr>
-        <w:t xml:space="preserve">在共同的物理输出节点上，对间隔数为 </w:t>
+        <w:t xml:space="preserve">为减小空间离散误差，我们在相同物理输出节点上计算 </w:t>
       </w:r>
       <m:oMath>
         <m:r>
@@ -3377,7 +3429,7 @@
           <w:sz w:val="24"/>
           <w:szCs w:val="24"/>
         </w:rPr>
-        <w:t xml:space="preserve">、</w:t>
+        <w:t xml:space="preserve"> 和 </w:t>
       </w:r>
       <m:oMath>
         <m:r>
@@ -3393,7 +3445,7 @@
           <w:sz w:val="24"/>
           <w:szCs w:val="24"/>
         </w:rPr>
-        <w:t xml:space="preserve"> 的两级解作二阶 Richardson 外推：</w:t>
+        <w:t xml:space="preserve"> 两套网格。若误差主项近似与网格步长的平方成正比，两式相消后可得到二阶 Richardson 外推：</w:t>
       </w:r>
     </w:p>
     <w:p>
@@ -3586,7 +3638,7 @@
           <w:sz w:val="24"/>
           <w:szCs w:val="24"/>
         </w:rPr>
-        <w:t xml:space="preserve">在 </w:t>
+        <w:t xml:space="preserve">问题一先不考虑收缩，计算区域固定为 </w:t>
       </w:r>
       <m:oMath>
         <m:r>
@@ -3626,7 +3678,7 @@
           <w:sz w:val="24"/>
           <w:szCs w:val="24"/>
         </w:rPr>
-        <w:t xml:space="preserve"> m 内，采用</w:t>
+        <w:t xml:space="preserve"> m。热量守恒给出导热方程；水分守恒并取有效扩散通量后给出扩散方程。因此我们采用</w:t>
       </w:r>
     </w:p>
     <w:p>
@@ -3939,7 +3991,7 @@
           <w:sz w:val="24"/>
           <w:szCs w:val="24"/>
         </w:rPr>
-        <w:t xml:space="preserve">附录 2 给定 </w:t>
+        <w:t xml:space="preserve">附录 2 直接给出 </w:t>
       </w:r>
       <m:oMath>
         <m:r>
@@ -4005,7 +4057,7 @@
           <w:sz w:val="24"/>
           <w:szCs w:val="24"/>
         </w:rPr>
-        <w:t xml:space="preserve"> W/(m·K)，水分扩散率为</w:t>
+        <w:t xml:space="preserve"> W/(m·K)。水分扩散率随含水率变化，按题设关系取</w:t>
       </w:r>
     </w:p>
     <w:p>
@@ -4150,7 +4202,7 @@
           <w:sz w:val="24"/>
           <w:szCs w:val="24"/>
         </w:rPr>
-        <w:t xml:space="preserve">初始条件为 </w:t>
+        <w:t xml:space="preserve">烘干刚开始时，内部温度和含水率均匀，故取 </w:t>
       </w:r>
       <m:oMath>
         <m:r>
@@ -4182,7 +4234,7 @@
           <w:sz w:val="24"/>
           <w:szCs w:val="24"/>
         </w:rPr>
-        <w:t xml:space="preserve"> kg/kg；圆心满足 </w:t>
+        <w:t xml:space="preserve"> kg/kg。圆心两侧完全对称，故 </w:t>
       </w:r>
       <m:oMath>
         <m:sSub>
@@ -4240,7 +4292,7 @@
           <w:sz w:val="24"/>
           <w:szCs w:val="24"/>
         </w:rPr>
-        <w:t xml:space="preserve">。径向向外取正，表面边界为</w:t>
+        <w:t xml:space="preserve">。在表面，传导或扩散通量应等于与空气的对流交换通量。径向向外取正，于是边界条件为</w:t>
       </w:r>
     </w:p>
     <w:p>
@@ -4583,7 +4635,7 @@
           <w:sz w:val="24"/>
           <w:szCs w:val="24"/>
         </w:rPr>
-        <w:t xml:space="preserve">将附件 1 的环境数据代入上述模型，得到表 1、表 2。表中列出题目指定时刻和位置的结果。完整的 1—1800 s 温度场和含水率场保存在支撑材料 result1.xlsx 中，径向间隔为 0.1 cm，表中结果按题意保留四位小数。</w:t>
+        <w:t xml:space="preserve">将附件 1 的环境数据逐时刻代入上述模型，我们得到表 1、表 2。表中列出题目指定时刻和位置的结果。完整的 1—1800 s 温度场和含水率场保存在支撑材料 result1.xlsx 中，径向间隔为 0.1 cm，表中结果按题意保留四位小数。</w:t>
       </w:r>
     </w:p>
     <w:p>
@@ -8266,7 +8318,7 @@
           <w:sz w:val="24"/>
           <w:szCs w:val="24"/>
         </w:rPr>
-        <w:t xml:space="preserve">由图 1 可以看到，随着烘干时间增加，热量逐渐由表面传向中心，而水分损失主要发生在表层。1800 s 时，表面与中心的温差为 3.2103 ℃；表面含水率已经降至 1.5102 kg/kg，中心含水率仍接近初值。说明在预热阶段，温度传播快于内部水分迁移，药材表层先出现明显失水。</w:t>
+        <w:t xml:space="preserve">由图 1 可以看到，空间分布上温度从表面向中心逐渐降低；相同时刻，含水率从中心向表面逐渐降低。1800 s 时，表面与中心的温差为 3.2103 ℃；表面含水率已经降至 1.5102 kg/kg，中心含水率仍接近初值。我们据此判断，预热阶段温度传播快于内部水分迁移，药材表层先出现明显失水。</w:t>
       </w:r>
     </w:p>
     <w:p>
@@ -8325,7 +8377,7 @@
           <w:sz w:val="24"/>
           <w:szCs w:val="24"/>
         </w:rPr>
-        <w:t xml:space="preserve">从烘干初始时刻统一采用附录 3 物性 [1]：</w:t>
+        <w:t xml:space="preserve">问题二从烘干初始时刻重新计算。我们不再把物性看成常数，而是直接采用附录 3 给出的含水率关系 [1]：</w:t>
       </w:r>
     </w:p>
     <w:p>
@@ -8622,7 +8674,7 @@
           <w:sz w:val="24"/>
           <w:szCs w:val="24"/>
         </w:rPr>
-        <w:t xml:space="preserve">将式（8）—（9）代入式（5），再结合初值和式（7）的边界条件，即可得到问题二模型。含水率变化会改变密度、比热和导热系数；温度又会通过扩散率影响水分迁移，因此需要同时求解温度和含水率。计算 Arrhenius 项时，将摄氏温度换算为开尔文温度。</w:t>
+        <w:t xml:space="preserve">式（8）给出热方程所需的密度、比热和导热系数；式（9）给出水分方程所需的扩散率。把它们逐个代入式（5），再保留原初值和式（7）的边界条件，就得到问题二模型。含水率变化会改变密度、比热和导热系数。温度又会通过扩散率影响水分迁移。因此我们同时求解温度和含水率。计算 Arrhenius 项时，将摄氏温度换算为开尔文温度。至此，模型中的物性参数取值已知，可以用于计算温湿分布。</w:t>
       </w:r>
     </w:p>
     <w:p>
@@ -11901,7 +11953,7 @@
           <w:sz w:val="24"/>
           <w:szCs w:val="24"/>
         </w:rPr>
-        <w:t xml:space="preserve">从表 3、表 4 和图 2 可以看出，3 h 时中心与表面的温差只有 0.1169 ℃，药材内部温度已经接近均匀；但中心与表面的含水率仍相差 0.7581 kg/kg，且各处都没有达到 0.15 kg/kg。随着表层含水率降低，扩散率继续减小，内部水分向外迁移还需要较长时间。因此，表面温度趋于稳定并不意味着烘干已经完成。</w:t>
+        <w:t xml:space="preserve">从表 3、表 4 和图 2 可以看到，空间分布上温度曲线已接近平坦，而含水率曲线仍由中心向表面明显下降。3 h 时中心与表面的温差只有 0.1169 ℃；含水率仍相差 0.7581 kg/kg，且各处都没有达到 0.15 kg/kg。随着表层含水率降低，扩散率继续减小，内部水分向外迁移还需要较长时间。我们因此不能把表面温度稳定作为烘干完成的依据。</w:t>
       </w:r>
     </w:p>
     <w:p>
@@ -11977,7 +12029,7 @@
           <w:sz w:val="24"/>
           <w:szCs w:val="24"/>
         </w:rPr>
-        <w:t xml:space="preserve">沿用第二问方程，定义</w:t>
+        <w:t xml:space="preserve">问题三要求药材各处的含水率都低于 0.15 kg/kg。我们先在每一时刻找出全部径向节点中的最大值，再用该最大值和阈值的差定义判别函数：</w:t>
       </w:r>
     </w:p>
     <w:p>
@@ -12093,7 +12145,51 @@
           <w:sz w:val="24"/>
           <w:szCs w:val="24"/>
         </w:rPr>
-        <w:t xml:space="preserve">问题三要求药材各处的含水率都低于 0.15 kg/kg，因此不能只看表面值或平均值。具体计算时，遍历全部径向节点，以最大含水率判断是否达标。结果表明，中心位置的含水率最高，所以干燥终点由中心位置决定。在临界时刻有 </w:t>
+        <w:t xml:space="preserve">式（10）中，</w:t>
+      </w:r>
+      <m:oMath>
+        <m:r>
+          <w:rPr>
+            <w:sz w:val="24"/>
+          </w:rPr>
+          <m:t>g(t)</m:t>
+        </m:r>
+      </m:oMath>
+      <w:r>
+        <w:rPr>
+          <w:rFonts w:ascii="Times New Roman" w:cs="Times New Roman" w:eastAsia="宋体" w:hAnsi="Times New Roman"/>
+          <w:sz w:val="24"/>
+          <w:szCs w:val="24"/>
+        </w:rPr>
+        <w:t xml:space="preserve"> 表示最湿位置与阈值的差；</w:t>
+      </w:r>
+      <m:oMath>
+        <m:sSub>
+          <m:e>
+            <m:r>
+              <w:rPr>
+                <w:sz w:val="24"/>
+              </w:rPr>
+              <m:t>t</m:t>
+            </m:r>
+          </m:e>
+          <m:sub>
+            <m:r>
+              <w:rPr>
+                <w:sz w:val="24"/>
+              </w:rPr>
+              <m:t>*</m:t>
+            </m:r>
+          </m:sub>
+        </m:sSub>
+      </m:oMath>
+      <w:r>
+        <w:rPr>
+          <w:rFonts w:ascii="Times New Roman" w:cs="Times New Roman" w:eastAsia="宋体" w:hAnsi="Times New Roman"/>
+          <w:sz w:val="24"/>
+          <w:szCs w:val="24"/>
+        </w:rPr>
+        <w:t xml:space="preserve"> 是这个差首次变为负数的时刻。这样做保证了我们没有遗漏较湿的内部位置。计算结果表明，中心位置的含水率最高，所以干燥终点由中心位置决定。在临界时刻有 </w:t>
       </w:r>
       <m:oMath>
         <m:r>
@@ -12150,7 +12246,7 @@
           <w:sz w:val="24"/>
           <w:szCs w:val="24"/>
         </w:rPr>
-        <w:t xml:space="preserve">为确定终点，在阈值两侧对各径向位置的未舍入含水率进行时间插值，取最晚达到阈值的位置。若设备只能按整分钟停止，则取临界时刻之后的第一个整分钟，即</w:t>
+        <w:t xml:space="preserve">为确定终点，我们在阈值两侧对各径向位置的未舍入含水率作时间插值，取最晚达到阈值的位置。若设备只能按整分钟停止，就要把临界时刻向后推到下一个整分钟。因此</w:t>
       </w:r>
     </w:p>
     <w:p>
@@ -14728,7 +14824,7 @@
           <w:sz w:val="24"/>
           <w:szCs w:val="24"/>
         </w:rPr>
-        <w:t xml:space="preserve">表 5 最后一行给出了临界时刻的含水率，此时中心显示为 0.1500，恰好位于阈值边界。按式（11）计算，下一整分钟才严格满足题目要求。完整工作簿同时保留了分钟序列、临界行和首个严格达标整分钟行。</w:t>
+        <w:t xml:space="preserve">表 5 最后一行给出了临界时刻的含水率。此时中心显示为 0.1500，恰好位于阈值边界。按式（11）计算，下一整分钟才严格满足题目要求。完整工作簿同时保留了分钟序列、临界行和首个严格达标整分钟行。</w:t>
       </w:r>
     </w:p>
     <w:p>
@@ -14811,7 +14907,7 @@
           <w:sz w:val="24"/>
           <w:szCs w:val="24"/>
         </w:rPr>
-        <w:t xml:space="preserve">由图 3 可以看到，表面含水率下降最快，中心下降最慢；进入干燥后期后，各位置的变化逐渐变缓。因此，只判断表面或平均含水率会提前结束烘干，必须以全域最大值作为终点判据。上述时长是在第 3.1 节长期环境假设下得到的，其敏感性将在第 8.3 节分析。</w:t>
+        <w:t xml:space="preserve">由图 3 可以看到，三条曲线从表面到中心依次上移，表面含水率下降最快，中心下降最慢。进入干燥后期后，各位置的变化都逐渐变缓。因此，只判断表面或平均含水率会提前结束烘干。我们必须以全域最大值作为终点判据。上述时长是在第 3.1 节长期环境假设下得到的，其敏感性将在第 8.3 节分析。</w:t>
       </w:r>
     </w:p>
     <w:p>
@@ -14886,7 +14982,7 @@
           <w:sz w:val="24"/>
           <w:szCs w:val="24"/>
         </w:rPr>
-        <w:t xml:space="preserve">，因此直接把实测半径代入模型。在均匀径向收缩、长度不变的条件下，材料速度为 </w:t>
+        <w:t xml:space="preserve">，我们直接把实测半径代入模型。在均匀径向收缩、长度不变的条件下，离中心越远的材料移动越快，故材料速度为 </w:t>
       </w:r>
       <m:oMath>
         <m:sSub>
@@ -15003,7 +15099,7 @@
           <w:sz w:val="24"/>
           <w:szCs w:val="24"/>
         </w:rPr>
-        <w:t xml:space="preserve">，则</w:t>
+        <w:t xml:space="preserve">。先对干物质和水分分别写守恒关系，得到</w:t>
       </w:r>
     </w:p>
     <w:p>
@@ -15245,7 +15341,7 @@
           <w:sz w:val="24"/>
           <w:szCs w:val="24"/>
         </w:rPr>
-        <w:t xml:space="preserve">取有效 Fick 通量 </w:t>
+        <w:t xml:space="preserve">第一式表示干物质没有生成或损失；第二式表示水分随骨架运动，还会相对骨架扩散。我们取有效 Fick 通量 </w:t>
       </w:r>
       <m:oMath>
         <m:sSub>
@@ -15306,7 +15402,7 @@
           <w:sz w:val="24"/>
           <w:szCs w:val="24"/>
         </w:rPr>
-        <w:t xml:space="preserve">，并从上述两式中消去干物质连续方程，得到</w:t>
+        <w:t xml:space="preserve">，再用第一式消去第二式中的干物质连续项，得到</w:t>
       </w:r>
     </w:p>
     <w:p>
@@ -15458,7 +15554,41 @@
           <w:sz w:val="24"/>
           <w:szCs w:val="24"/>
         </w:rPr>
-        <w:t xml:space="preserve">初始干密度均匀，截面又作均匀径向收缩，因此干物质守恒给出 </w:t>
+        <w:t xml:space="preserve">初始干密度均匀，截面又作均匀径向收缩。单位长度的截面积正比于 </w:t>
+      </w:r>
+      <m:oMath>
+        <m:r>
+          <w:rPr>
+            <w:sz w:val="24"/>
+          </w:rPr>
+          <m:t>R(t</m:t>
+        </m:r>
+        <m:sSup>
+          <m:e>
+            <m:r>
+              <w:rPr>
+                <w:sz w:val="24"/>
+              </w:rPr>
+              <m:t>)</m:t>
+            </m:r>
+          </m:e>
+          <m:sup>
+            <m:r>
+              <w:rPr>
+                <w:sz w:val="24"/>
+              </w:rPr>
+              <m:t>2</m:t>
+            </m:r>
+          </m:sup>
+        </m:sSup>
+      </m:oMath>
+      <w:r>
+        <w:rPr>
+          <w:rFonts w:ascii="Times New Roman" w:cs="Times New Roman" w:eastAsia="宋体" w:hAnsi="Times New Roman"/>
+          <w:sz w:val="24"/>
+          <w:szCs w:val="24"/>
+        </w:rPr>
+        <w:t xml:space="preserve">，所以干物质守恒给出 </w:t>
       </w:r>
       <m:oMath>
         <m:sSub>
@@ -15560,7 +15690,7 @@
           <w:sz w:val="24"/>
           <w:szCs w:val="24"/>
         </w:rPr>
-        <w:t xml:space="preserve">。此时干密度只随时间变化，式（13）中的 </w:t>
+        <w:t xml:space="preserve">。此时干密度只随时间变化，式（13）右侧的 </w:t>
       </w:r>
       <m:oMath>
         <m:sSub>
@@ -15588,7 +15718,71 @@
           <w:sz w:val="24"/>
           <w:szCs w:val="24"/>
         </w:rPr>
-        <w:t xml:space="preserve"> 可以约去，得到</w:t>
+        <w:t xml:space="preserve"> 可以约去。将材料导数展开为 </w:t>
+      </w:r>
+      <m:oMath>
+        <m:r>
+          <m:rPr>
+            <m:sty m:val="p"/>
+          </m:rPr>
+          <w:rPr>
+            <w:sz w:val="24"/>
+          </w:rPr>
+          <m:t>D</m:t>
+        </m:r>
+        <m:r>
+          <w:rPr>
+            <w:sz w:val="24"/>
+          </w:rPr>
+          <m:t>C/</m:t>
+        </m:r>
+        <m:r>
+          <m:rPr>
+            <m:sty m:val="p"/>
+          </m:rPr>
+          <w:rPr>
+            <w:sz w:val="24"/>
+          </w:rPr>
+          <m:t>D</m:t>
+        </m:r>
+        <m:r>
+          <w:rPr>
+            <w:sz w:val="24"/>
+          </w:rPr>
+          <m:t>t=∂C/∂t+</m:t>
+        </m:r>
+        <m:sSub>
+          <m:e>
+            <m:r>
+              <w:rPr>
+                <w:sz w:val="24"/>
+              </w:rPr>
+              <m:t>v</m:t>
+            </m:r>
+          </m:e>
+          <m:sub>
+            <m:r>
+              <w:rPr>
+                <w:sz w:val="24"/>
+              </w:rPr>
+              <m:t>r</m:t>
+            </m:r>
+          </m:sub>
+        </m:sSub>
+        <m:r>
+          <w:rPr>
+            <w:sz w:val="24"/>
+          </w:rPr>
+          <m:t>∂C/∂r</m:t>
+        </m:r>
+      </m:oMath>
+      <w:r>
+        <w:rPr>
+          <w:rFonts w:ascii="Times New Roman" w:cs="Times New Roman" w:eastAsia="宋体" w:hAnsi="Times New Roman"/>
+          <w:sz w:val="24"/>
+          <w:szCs w:val="24"/>
+        </w:rPr>
+        <w:t xml:space="preserve">，便得到</w:t>
       </w:r>
     </w:p>
     <w:p>
@@ -15861,7 +16055,7 @@
           <w:sz w:val="24"/>
           <w:szCs w:val="24"/>
         </w:rPr>
-        <w:t xml:space="preserve">为便于计算，令 </w:t>
+        <w:t xml:space="preserve">实际区域的边界不断移动，直接离散会反复改变网格。我们令 </w:t>
       </w:r>
       <m:oMath>
         <m:r>
@@ -15877,7 +16071,7 @@
           <w:sz w:val="24"/>
           <w:szCs w:val="24"/>
         </w:rPr>
-        <w:t xml:space="preserve">，将收缩区域变换到固定区间 </w:t>
+        <w:t xml:space="preserve">，把收缩区域变换到固定区间 </w:t>
       </w:r>
       <m:oMath>
         <m:r>
@@ -15909,7 +16103,47 @@
           <w:sz w:val="24"/>
           <w:szCs w:val="24"/>
         </w:rPr>
-        <w:t xml:space="preserve"> 的网格速度与骨架速度相同，因此坐标变换项与式（14）中的对流项相互抵消，得到</w:t>
+        <w:t xml:space="preserve"> 的网格速度与骨架速度相同，因此坐标变换项与式（14）中的对流项相互抵消。再按 </w:t>
+      </w:r>
+      <m:oMath>
+        <m:r>
+          <w:rPr>
+            <w:sz w:val="24"/>
+          </w:rPr>
+          <m:t>∂/∂r=</m:t>
+        </m:r>
+        <m:sSup>
+          <m:e>
+            <m:r>
+              <w:rPr>
+                <w:sz w:val="24"/>
+              </w:rPr>
+              <m:t>R</m:t>
+            </m:r>
+          </m:e>
+          <m:sup>
+            <m:r>
+              <w:rPr>
+                <w:sz w:val="24"/>
+              </w:rPr>
+              <m:t>−1</m:t>
+            </m:r>
+          </m:sup>
+        </m:sSup>
+        <m:r>
+          <w:rPr>
+            <w:sz w:val="24"/>
+          </w:rPr>
+          <m:t>∂/∂ξ</m:t>
+        </m:r>
+      </m:oMath>
+      <w:r>
+        <w:rPr>
+          <w:rFonts w:ascii="Times New Roman" w:cs="Times New Roman" w:eastAsia="宋体" w:hAnsi="Times New Roman"/>
+          <w:sz w:val="24"/>
+          <w:szCs w:val="24"/>
+        </w:rPr>
+        <w:t xml:space="preserve"> 变换两个径向导数，就得到</w:t>
       </w:r>
     </w:p>
     <w:p>
@@ -16360,7 +16594,7 @@
           <w:sz w:val="24"/>
           <w:szCs w:val="24"/>
         </w:rPr>
-        <w:t xml:space="preserve">热方程仍采用有效热容近似，不计变形功和相变热。圆心满足对称条件 </w:t>
+        <w:t xml:space="preserve">式（15）来自热传导方程的同一坐标变换，式（16）来自式（14）的坐标变换。热方程仍采用有效热容近似，不计变形功和相变热。圆心满足对称条件 </w:t>
       </w:r>
       <m:oMath>
         <m:sSub>
@@ -16418,7 +16652,70 @@
           <w:sz w:val="24"/>
           <w:szCs w:val="24"/>
         </w:rPr>
-        <w:t xml:space="preserve">，实际表面的边界条件为</w:t>
+        <w:t xml:space="preserve">。表面仍满足“内部通量 = 与空气的对流通量”，而 </w:t>
+      </w:r>
+      <m:oMath>
+        <m:r>
+          <w:rPr>
+            <w:sz w:val="24"/>
+          </w:rPr>
+          <m:t>r</m:t>
+        </m:r>
+      </m:oMath>
+      <w:r>
+        <w:rPr>
+          <w:rFonts w:ascii="Times New Roman" w:cs="Times New Roman" w:eastAsia="宋体" w:hAnsi="Times New Roman"/>
+          <w:sz w:val="24"/>
+          <w:szCs w:val="24"/>
+        </w:rPr>
+        <w:t xml:space="preserve"> 导数换成 </w:t>
+      </w:r>
+      <m:oMath>
+        <m:r>
+          <w:rPr>
+            <w:sz w:val="24"/>
+          </w:rPr>
+          <m:t>ξ</m:t>
+        </m:r>
+      </m:oMath>
+      <w:r>
+        <w:rPr>
+          <w:rFonts w:ascii="Times New Roman" w:cs="Times New Roman" w:eastAsia="宋体" w:hAnsi="Times New Roman"/>
+          <w:sz w:val="24"/>
+          <w:szCs w:val="24"/>
+        </w:rPr>
+        <w:t xml:space="preserve"> 导数后多出 </w:t>
+      </w:r>
+      <m:oMath>
+        <m:f>
+          <m:fPr>
+            <m:type m:val="lin"/>
+          </m:fPr>
+          <m:num>
+            <m:r>
+              <w:rPr>
+                <w:sz w:val="24"/>
+              </w:rPr>
+              <m:t>1</m:t>
+            </m:r>
+          </m:num>
+          <m:den>
+            <m:r>
+              <w:rPr>
+                <w:sz w:val="24"/>
+              </w:rPr>
+              <m:t>R</m:t>
+            </m:r>
+          </m:den>
+        </m:f>
+      </m:oMath>
+      <w:r>
+        <w:rPr>
+          <w:rFonts w:ascii="Times New Roman" w:cs="Times New Roman" w:eastAsia="宋体" w:hAnsi="Times New Roman"/>
+          <w:sz w:val="24"/>
+          <w:szCs w:val="24"/>
+        </w:rPr>
+        <w:t xml:space="preserve">，所以实际表面的边界条件为</w:t>
       </w:r>
     </w:p>
     <w:p>
@@ -17078,7 +17375,7 @@
           <w:sz w:val="24"/>
           <w:szCs w:val="24"/>
         </w:rPr>
-        <w:t xml:space="preserve">题目要求给出固定位置的含水率，因此每个时刻都用 </w:t>
+        <w:t xml:space="preserve">题目要求给出固定位置的含水率。因此每个时刻我们先用 </w:t>
       </w:r>
       <m:oMath>
         <m:r>
@@ -17094,7 +17391,7 @@
           <w:sz w:val="24"/>
           <w:szCs w:val="24"/>
         </w:rPr>
-        <w:t xml:space="preserve"> 找到相应的计算位置。当 </w:t>
+        <w:t xml:space="preserve"> 找到相应的计算位置，再读取该处结果。当 </w:t>
       </w:r>
       <m:oMath>
         <m:r>
@@ -19008,7 +19305,7 @@
           <w:sz w:val="24"/>
           <w:szCs w:val="24"/>
         </w:rPr>
-        <w:t xml:space="preserve">由附件 2 可知，6 h 时药材半径已经减小到 1.374 cm，此后还将继续减小。因此，在表 6 所列时刻，距中心 1.5 cm 和 2 cm 的位置均已位于药材之外，表中只列出 0、0.5、1 cm 和实际表面。完整的 result4.xlsx 仍保留所有间隔为 0.1 cm 的固定位置，并用空白表示实体外位置。</w:t>
+        <w:t xml:space="preserve">由附件 2 可知，6 h 时药材半径已经减小到 1.374 cm，此后还将继续减小。可以看到，在表 6 所列时刻，距中心 1.5 cm 和 2 cm 的位置均已位于药材之外。我们只列出 0、0.5、1 cm 和实际表面。完整的 result4.xlsx 仍保留所有间隔为 0.1 cm 的固定位置，并用空白表示实体外位置。</w:t>
       </w:r>
     </w:p>
     <w:p>
@@ -19216,7 +19513,7 @@
           <w:sz w:val="24"/>
           <w:szCs w:val="24"/>
         </w:rPr>
-        <w:t xml:space="preserve">首先对空间网格进行加密计算。第一问两级网格在全部输出节点的最大温度和含水率差分别约为 1.03×10⁻⁶ ℃和 4.57×10⁻⁶ kg/kg；第二问前三小时的最大差分别约为 8.14×10⁻⁷ ℃和 1.49×10⁻⁵ kg/kg。由此可见，网格加密后结果变化很小，本文取式（4）的外推值作为最终计算结果。</w:t>
+        <w:t xml:space="preserve">我们先加密空间网格。第一问两级网格在全部输出节点的最大温度和含水率差分别约为 1.03×10⁻⁶ ℃和 4.57×10⁻⁶ kg/kg；第二问前三小时的最大差分别约为 8.14×10⁻⁷ ℃和 1.49×10⁻⁵ kg/kg。可以看到，网格加密后结果变化很小。因此我们取式（4）的外推值作为最终计算结果。</w:t>
       </w:r>
     </w:p>
     <w:p>
@@ -20212,7 +20509,7 @@
           <w:sz w:val="24"/>
           <w:szCs w:val="24"/>
         </w:rPr>
-        <w:t xml:space="preserve">固定半径下，截面平均含水率满足</w:t>
+        <w:t xml:space="preserve">为检查程序有没有漏掉水分，我们再对水分通量作平衡核验。固定半径下，把水分方程在截面上积分，并代入表面边界条件，截面平均含水率满足</w:t>
       </w:r>
     </w:p>
     <w:p>
@@ -20441,7 +20738,23 @@
           <w:sz w:val="24"/>
           <w:szCs w:val="24"/>
         </w:rPr>
-        <w:t xml:space="preserve">移动域中定义 </w:t>
+        <w:t xml:space="preserve">移动域中，面积权重变为 </w:t>
+      </w:r>
+      <m:oMath>
+        <m:r>
+          <w:rPr>
+            <w:sz w:val="24"/>
+          </w:rPr>
+          <m:t>2ξ</m:t>
+        </m:r>
+      </m:oMath>
+      <w:r>
+        <w:rPr>
+          <w:rFonts w:ascii="Times New Roman" w:cs="Times New Roman" w:eastAsia="宋体" w:hAnsi="Times New Roman"/>
+          <w:sz w:val="24"/>
+          <w:szCs w:val="24"/>
+        </w:rPr>
+        <w:t xml:space="preserve">，故定义 </w:t>
       </w:r>
       <m:oMath>
         <m:bar>
@@ -20518,7 +20831,23 @@
           <w:sz w:val="24"/>
           <w:szCs w:val="24"/>
         </w:rPr>
-        <w:t xml:space="preserve">，由式（16）—（17）得</w:t>
+        <w:t xml:space="preserve">。把式（16）在 </w:t>
+      </w:r>
+      <m:oMath>
+        <m:r>
+          <w:rPr>
+            <w:sz w:val="24"/>
+          </w:rPr>
+          <m:t>0≤ξ≤1</m:t>
+        </m:r>
+      </m:oMath>
+      <w:r>
+        <w:rPr>
+          <w:rFonts w:ascii="Times New Roman" w:cs="Times New Roman" w:eastAsia="宋体" w:hAnsi="Times New Roman"/>
+          <w:sz w:val="24"/>
+          <w:szCs w:val="24"/>
+        </w:rPr>
+        <w:t xml:space="preserve"> 上积分，再代入式（17），得到</w:t>
       </w:r>
     </w:p>
     <w:p>
@@ -20707,7 +21036,7 @@
           <w:sz w:val="24"/>
           <w:szCs w:val="24"/>
         </w:rPr>
-        <w:t xml:space="preserve">利用前 600 s 的逐秒输出和后续分钟输出，对边界通量进行积分。第三问两级网格的相对最大残差约为 1.21×10⁻⁶，第四问分别约为 1.61×10⁻⁶ 和 1.69×10⁻⁶。残差很小，说明计算结果满足模型中的水分通量平衡。</w:t>
+        <w:t xml:space="preserve">我们利用前 600 s 的逐秒输出和后续分钟输出，对边界通量进行积分。第三问两级网格的相对最大残差约为 1.21×10⁻⁶，第四问分别约为 1.61×10⁻⁶ 和 1.69×10⁻⁶。残差很小，说明计算结果满足模型中的水分通量平衡。</w:t>
       </w:r>
     </w:p>
     <w:p>
@@ -21855,7 +22184,7 @@
           <w:sz w:val="24"/>
           <w:szCs w:val="24"/>
         </w:rPr>
-        <w:t xml:space="preserve">为检验密度关系与收缩假设是否相容，将附录 4 的 </w:t>
+        <w:t xml:space="preserve">为检验密度关系与收缩假设是否相容，我们暂时把附录 4 的 </w:t>
       </w:r>
       <m:oMath>
         <m:r>
@@ -21871,7 +22200,39 @@
           <w:sz w:val="24"/>
           <w:szCs w:val="24"/>
         </w:rPr>
-        <w:t xml:space="preserve"> 看作当前真实湿基密度。此时有 </w:t>
+        <w:t xml:space="preserve"> 看作当前真实湿基密度。干基含水率为 </w:t>
+      </w:r>
+      <m:oMath>
+        <m:r>
+          <w:rPr>
+            <w:sz w:val="24"/>
+          </w:rPr>
+          <m:t>C</m:t>
+        </m:r>
+      </m:oMath>
+      <w:r>
+        <w:rPr>
+          <w:rFonts w:ascii="Times New Roman" w:cs="Times New Roman" w:eastAsia="宋体" w:hAnsi="Times New Roman"/>
+          <w:sz w:val="24"/>
+          <w:szCs w:val="24"/>
+        </w:rPr>
+        <w:t xml:space="preserve"> 时，湿质量是干物质量的 </w:t>
+      </w:r>
+      <m:oMath>
+        <m:r>
+          <w:rPr>
+            <w:sz w:val="24"/>
+          </w:rPr>
+          <m:t>1+C</m:t>
+        </m:r>
+      </m:oMath>
+      <w:r>
+        <w:rPr>
+          <w:rFonts w:ascii="Times New Roman" w:cs="Times New Roman" w:eastAsia="宋体" w:hAnsi="Times New Roman"/>
+          <w:sz w:val="24"/>
+          <w:szCs w:val="24"/>
+        </w:rPr>
+        <w:t xml:space="preserve"> 倍，因此有 </w:t>
       </w:r>
       <m:oMath>
         <m:sSub>
@@ -21905,7 +22266,7 @@
           <w:sz w:val="24"/>
           <w:szCs w:val="24"/>
         </w:rPr>
-        <w:t xml:space="preserve">，总干物质量为</w:t>
+        <w:t xml:space="preserve">。再把干密度在当前截面上积分，总干物质量为</w:t>
       </w:r>
     </w:p>
     <w:p>
@@ -22060,7 +22421,7 @@
           <w:sz w:val="24"/>
           <w:szCs w:val="24"/>
         </w:rPr>
-        <w:t xml:space="preserve">对非均匀含水率场积分，在 1280 区间的临界时刻得到 </w:t>
+        <w:t xml:space="preserve">我们将非均匀含水率场代入式（22）积分。在 1280 区间的临界时刻得到 </w:t>
       </w:r>
       <m:oMath>
         <m:sSub>

</xml_diff>

<commit_message>
Unify team-led paper narration
</commit_message>
<xml_diff>
--- a/deliverables/polished_20260912/A题论文_可编辑版.docx
+++ b/deliverables/polished_20260912/A题论文_可编辑版.docx
@@ -22520,7 +22520,7 @@
           <w:sz w:val="24"/>
           <w:szCs w:val="24"/>
         </w:rPr>
-        <w:t xml:space="preserve">本文在热方程中用附录密度表示经验有效体积热容，在水分方程中按均匀收缩假设确定干密度。该处理可以得到当前题设下的有效模型，但密度与几何关系的不相容仍是模型限制。要建立更严格的多组分守恒模型，还需要孔隙率、局部变形或长度变化等数据，现有附件无法确定这些关系。</w:t>
+        <w:t xml:space="preserve">我们在热方程中用附录密度表示经验有效体积热容，在水分方程中按均匀收缩假设确定干密度。这样可以得到当前题设下的有效模型，但密度与几何关系的不相容仍是模型限制。要建立更严格的多组分守恒模型，还需要孔隙率、局部变形或长度变化等数据，现有附件无法确定这些关系。</w:t>
       </w:r>
     </w:p>
     <w:p>
@@ -22579,7 +22579,7 @@
           <w:sz w:val="24"/>
           <w:szCs w:val="24"/>
         </w:rPr>
-        <w:t xml:space="preserve">本文用统一的有限体积方法处理常物性、变物性和实测收缩三种情况，得到题设位置的温度和含水率，并以全域最大含水率确定干燥终点。问题四采用移动坐标后，可以在固定计算区间内处理收缩边界，同时区分实际表面和固定位置。网格加密、通量平衡和独立程序复算均支持计算结果。</w:t>
+        <w:t xml:space="preserve">我们用统一的有限体积方法处理常物性、变物性和实测收缩三种情况，得到题设位置的温度和含水率，并以全域最大含水率确定干燥终点。问题四采用移动坐标后，我们可以在固定计算区间内处理收缩边界，同时区分实际表面和固定位置。网格加密、通量平衡和独立程序复算均支持计算结果。</w:t>
       </w:r>
     </w:p>
     <w:p>
@@ -22672,7 +22672,7 @@
           <w:sz w:val="24"/>
           <w:szCs w:val="24"/>
         </w:rPr>
-        <w:t xml:space="preserve">综合四个问题的结果可以看到，药材先在表层快速失水，随后内部水分缓慢向外迁移；即使温度已经接近均匀，含水率仍可能高于阈值。在本文假设下，固定半径模型和实测收缩模型的临界时长分别为 57.4740 h 和 51.0920 h；若按整分钟停止，则分别取 57.4833 h 和 51.1000 h。相同物性下的固定几何对照说明，收缩是影响预测时长的重要因素。实际应用时，还需要结合长期环境记录和内部含水率测量进行校验。</w:t>
+        <w:t xml:space="preserve">综合四个问题的结果我们可以看到，药材先在表层快速失水，随后内部水分缓慢向外迁移；即使温度已经接近均匀，含水率仍可能高于阈值。在上述假设下，固定半径模型和实测收缩模型的临界时长分别为 57.4740 h 和 51.0920 h；若按整分钟停止，则分别取 57.4833 h 和 51.1000 h。相同物性下的固定几何对照说明，收缩是影响预测时长的重要因素。实际应用时，还需要结合长期环境记录和内部含水率测量进行校验。</w:t>
       </w:r>
     </w:p>
     <w:p>

</xml_diff>

<commit_message>
Add comprehensive symbol definitions
</commit_message>
<xml_diff>
--- a/deliverables/polished_20260912/A题论文_可编辑版.docx
+++ b/deliverables/polished_20260912/A题论文_可编辑版.docx
@@ -481,6 +481,73 @@
           <w:szCs w:val="24"/>
         </w:rPr>
         <w:t xml:space="preserve">2.2 主要符号</w:t>
+      </w:r>
+    </w:p>
+    <w:p>
+      <w:pPr>
+        <w:widowControl/>
+        <w:overflowPunct w:val="0"/>
+        <w:spacing w:after="70" w:line="300"/>
+        <w:ind w:firstLine="480"/>
+        <w:jc w:val="both"/>
+      </w:pPr>
+      <w:r>
+        <w:rPr>
+          <w:rFonts w:ascii="Times New Roman" w:cs="Times New Roman" w:eastAsia="宋体" w:hAnsi="Times New Roman"/>
+          <w:sz w:val="24"/>
+          <w:szCs w:val="24"/>
+        </w:rPr>
+        <w:t xml:space="preserve">为便于阅读，我们先列出模型的主要状态变量、物性参数和终点时刻。这里的下标 </w:t>
+      </w:r>
+      <m:oMath>
+        <m:r>
+          <w:rPr>
+            <w:sz w:val="24"/>
+          </w:rPr>
+          <m:t>∞</m:t>
+        </m:r>
+      </m:oMath>
+      <w:r>
+        <w:rPr>
+          <w:rFonts w:ascii="Times New Roman" w:cs="Times New Roman" w:eastAsia="宋体" w:hAnsi="Times New Roman"/>
+          <w:sz w:val="24"/>
+          <w:szCs w:val="24"/>
+        </w:rPr>
+        <w:t xml:space="preserve"> 表示烘房环境，下标 </w:t>
+      </w:r>
+      <m:oMath>
+        <m:r>
+          <w:rPr>
+            <w:sz w:val="24"/>
+          </w:rPr>
+          <m:t>s</m:t>
+        </m:r>
+      </m:oMath>
+      <w:r>
+        <w:rPr>
+          <w:rFonts w:ascii="Times New Roman" w:cs="Times New Roman" w:eastAsia="宋体" w:hAnsi="Times New Roman"/>
+          <w:sz w:val="24"/>
+          <w:szCs w:val="24"/>
+        </w:rPr>
+        <w:t xml:space="preserve"> 表示药材实际表面。</w:t>
+      </w:r>
+    </w:p>
+    <w:p>
+      <w:pPr>
+        <w:keepNext/>
+        <w:widowControl/>
+        <w:overflowPunct w:val="0"/>
+        <w:spacing w:after="70" w:before="100"/>
+        <w:ind w:firstLine="0"/>
+        <w:jc w:val="center"/>
+      </w:pPr>
+      <w:r>
+        <w:rPr>
+          <w:rFonts w:ascii="Times New Roman" w:cs="Times New Roman" w:eastAsia="宋体" w:hAnsi="Times New Roman"/>
+          <w:sz w:val="21"/>
+          <w:szCs w:val="21"/>
+        </w:rPr>
+        <w:t xml:space="preserve">表 2.1 主要状态变量与物性参数说明</w:t>
       </w:r>
     </w:p>
     <w:tbl>
@@ -2039,6 +2106,27 @@
     </w:tbl>
     <w:p>
       <w:pPr>
+        <w:pStyle w:val="Heading2"/>
+        <w:keepNext/>
+        <w:keepLines/>
+        <w:overflowPunct w:val="0"/>
+        <w:spacing w:after="100" w:before="200"/>
+        <w:ind w:firstLine="0"/>
+      </w:pPr>
+      <w:r>
+        <w:rPr>
+          <w:rFonts w:ascii="Times New Roman" w:cs="Times New Roman" w:eastAsia="黑体" w:hAnsi="Times New Roman"/>
+          <w:b/>
+          <w:bCs/>
+          <w:color w:val="000000"/>
+          <w:sz w:val="24"/>
+          <w:szCs w:val="24"/>
+        </w:rPr>
+        <w:t xml:space="preserve">2.3 离散变量与中间量</w:t>
+      </w:r>
+    </w:p>
+    <w:p>
+      <w:pPr>
         <w:widowControl/>
         <w:overflowPunct w:val="0"/>
         <w:spacing w:after="70" w:line="300"/>
@@ -2051,7 +2139,1905 @@
           <w:sz w:val="24"/>
           <w:szCs w:val="24"/>
         </w:rPr>
-        <w:t xml:space="preserve">所有计算距离使用 m，表格按题意显示 cm；内部温度保存为 ℃，只在扩散率的 Arrhenius 项中换算为 K。后文的“水分浓度”均指题目定义的干基含水率。</w:t>
+        <w:t xml:space="preserve">在有限体积计算中，同一符号还会带有单元下标或界面下标。为避免将几何量、通量和终点判据混淆，补充说明如表 2.2。</w:t>
+      </w:r>
+    </w:p>
+    <w:p>
+      <w:pPr>
+        <w:keepNext/>
+        <w:widowControl/>
+        <w:overflowPunct w:val="0"/>
+        <w:spacing w:after="70" w:before="100"/>
+        <w:ind w:firstLine="0"/>
+        <w:jc w:val="center"/>
+      </w:pPr>
+      <w:r>
+        <w:rPr>
+          <w:rFonts w:ascii="Times New Roman" w:cs="Times New Roman" w:eastAsia="宋体" w:hAnsi="Times New Roman"/>
+          <w:sz w:val="21"/>
+          <w:szCs w:val="21"/>
+        </w:rPr>
+        <w:t xml:space="preserve">表 2.2 离散计算与诊断中的符号说明</w:t>
+      </w:r>
+    </w:p>
+    <w:tbl>
+      <w:tblPr>
+        <w:tblW w:type="dxa" w:w="9000"/>
+        <w:tblBorders>
+          <w:top w:val="none" w:color="FFFFFF" w:sz="0"/>
+          <w:left w:val="none" w:color="FFFFFF" w:sz="0"/>
+          <w:bottom w:val="none" w:color="FFFFFF" w:sz="0"/>
+          <w:right w:val="none" w:color="FFFFFF" w:sz="0"/>
+          <w:insideH w:val="none" w:color="FFFFFF" w:sz="0"/>
+          <w:insideV w:val="none" w:color="FFFFFF" w:sz="0"/>
+        </w:tblBorders>
+      </w:tblPr>
+      <w:tblGrid>
+        <w:gridCol w:w="1950"/>
+        <w:gridCol w:w="4200"/>
+        <w:gridCol w:w="2850"/>
+      </w:tblGrid>
+      <w:tr>
+        <w:trPr>
+          <w:cantSplit/>
+          <w:tblHeader/>
+        </w:trPr>
+        <w:tc>
+          <w:tcPr>
+            <w:tcW w:type="dxa" w:w="1950"/>
+            <w:tcBorders>
+              <w:top w:val="single" w:color="000000" w:sz="12"/>
+              <w:left w:val="none" w:color="FFFFFF" w:sz="0"/>
+              <w:bottom w:val="single" w:color="000000" w:sz="6"/>
+              <w:right w:val="none" w:color="FFFFFF" w:sz="0"/>
+            </w:tcBorders>
+            <w:tcMar>
+              <w:top w:type="dxa" w:w="65"/>
+              <w:left w:type="dxa" w:w="75"/>
+              <w:bottom w:type="dxa" w:w="65"/>
+              <w:right w:type="dxa" w:w="75"/>
+            </w:tcMar>
+          </w:tcPr>
+          <w:p>
+            <w:pPr>
+              <w:keepNext/>
+              <w:widowControl/>
+              <w:overflowPunct w:val="0"/>
+              <w:spacing w:after="0" w:line="250"/>
+              <w:ind w:firstLine="0"/>
+              <w:jc w:val="center"/>
+            </w:pPr>
+            <w:r>
+              <w:rPr>
+                <w:rFonts w:ascii="Times New Roman" w:cs="Times New Roman" w:eastAsia="宋体" w:hAnsi="Times New Roman"/>
+                <w:sz w:val="21"/>
+                <w:szCs w:val="21"/>
+              </w:rPr>
+              <w:t xml:space="preserve">符号</w:t>
+            </w:r>
+          </w:p>
+        </w:tc>
+        <w:tc>
+          <w:tcPr>
+            <w:tcW w:type="dxa" w:w="4200"/>
+            <w:tcBorders>
+              <w:top w:val="single" w:color="000000" w:sz="12"/>
+              <w:left w:val="none" w:color="FFFFFF" w:sz="0"/>
+              <w:bottom w:val="single" w:color="000000" w:sz="6"/>
+              <w:right w:val="none" w:color="FFFFFF" w:sz="0"/>
+            </w:tcBorders>
+            <w:tcMar>
+              <w:top w:type="dxa" w:w="65"/>
+              <w:left w:type="dxa" w:w="75"/>
+              <w:bottom w:type="dxa" w:w="65"/>
+              <w:right w:type="dxa" w:w="75"/>
+            </w:tcMar>
+          </w:tcPr>
+          <w:p>
+            <w:pPr>
+              <w:keepNext/>
+              <w:widowControl/>
+              <w:overflowPunct w:val="0"/>
+              <w:spacing w:after="0" w:line="250"/>
+              <w:ind w:firstLine="0"/>
+              <w:jc w:val="center"/>
+            </w:pPr>
+            <w:r>
+              <w:rPr>
+                <w:rFonts w:ascii="Times New Roman" w:cs="Times New Roman" w:eastAsia="宋体" w:hAnsi="Times New Roman"/>
+                <w:sz w:val="21"/>
+                <w:szCs w:val="21"/>
+              </w:rPr>
+              <w:t xml:space="preserve">含义</w:t>
+            </w:r>
+          </w:p>
+        </w:tc>
+        <w:tc>
+          <w:tcPr>
+            <w:tcW w:type="dxa" w:w="2850"/>
+            <w:tcBorders>
+              <w:top w:val="single" w:color="000000" w:sz="12"/>
+              <w:left w:val="none" w:color="FFFFFF" w:sz="0"/>
+              <w:bottom w:val="single" w:color="000000" w:sz="6"/>
+              <w:right w:val="none" w:color="FFFFFF" w:sz="0"/>
+            </w:tcBorders>
+            <w:tcMar>
+              <w:top w:type="dxa" w:w="65"/>
+              <w:left w:type="dxa" w:w="75"/>
+              <w:bottom w:type="dxa" w:w="65"/>
+              <w:right w:type="dxa" w:w="75"/>
+            </w:tcMar>
+          </w:tcPr>
+          <w:p>
+            <w:pPr>
+              <w:keepNext/>
+              <w:widowControl/>
+              <w:overflowPunct w:val="0"/>
+              <w:spacing w:after="0" w:line="250"/>
+              <w:ind w:firstLine="0"/>
+              <w:jc w:val="center"/>
+            </w:pPr>
+            <w:r>
+              <w:rPr>
+                <w:rFonts w:ascii="Times New Roman" w:cs="Times New Roman" w:eastAsia="宋体" w:hAnsi="Times New Roman"/>
+                <w:sz w:val="21"/>
+                <w:szCs w:val="21"/>
+              </w:rPr>
+              <w:t xml:space="preserve">单位</w:t>
+            </w:r>
+          </w:p>
+        </w:tc>
+      </w:tr>
+      <w:tr>
+        <w:trPr>
+          <w:cantSplit/>
+          <w:tblHeader w:val="false"/>
+        </w:trPr>
+        <w:tc>
+          <w:tcPr>
+            <w:tcW w:type="dxa" w:w="1950"/>
+            <w:tcBorders>
+              <w:top w:val="none" w:color="FFFFFF" w:sz="0"/>
+              <w:left w:val="none" w:color="FFFFFF" w:sz="0"/>
+              <w:bottom w:val="none" w:color="FFFFFF" w:sz="0"/>
+              <w:right w:val="none" w:color="FFFFFF" w:sz="0"/>
+            </w:tcBorders>
+            <w:tcMar>
+              <w:top w:type="dxa" w:w="65"/>
+              <w:left w:type="dxa" w:w="75"/>
+              <w:bottom w:type="dxa" w:w="65"/>
+              <w:right w:type="dxa" w:w="75"/>
+            </w:tcMar>
+          </w:tcPr>
+          <w:p>
+            <w:pPr>
+              <w:keepNext/>
+              <w:widowControl/>
+              <w:overflowPunct w:val="0"/>
+              <w:spacing w:after="0" w:line="250"/>
+              <w:ind w:firstLine="0"/>
+              <w:jc w:val="center"/>
+            </w:pPr>
+            <m:oMath>
+              <m:r>
+                <w:rPr>
+                  <w:sz w:val="21"/>
+                </w:rPr>
+                <m:t>i,N</m:t>
+              </m:r>
+            </m:oMath>
+          </w:p>
+        </w:tc>
+        <w:tc>
+          <w:tcPr>
+            <w:tcW w:type="dxa" w:w="4200"/>
+            <w:tcBorders>
+              <w:top w:val="none" w:color="FFFFFF" w:sz="0"/>
+              <w:left w:val="none" w:color="FFFFFF" w:sz="0"/>
+              <w:bottom w:val="none" w:color="FFFFFF" w:sz="0"/>
+              <w:right w:val="none" w:color="FFFFFF" w:sz="0"/>
+            </w:tcBorders>
+            <w:tcMar>
+              <w:top w:type="dxa" w:w="65"/>
+              <w:left w:type="dxa" w:w="75"/>
+              <w:bottom w:type="dxa" w:w="65"/>
+              <w:right w:type="dxa" w:w="75"/>
+            </w:tcMar>
+          </w:tcPr>
+          <w:p>
+            <w:pPr>
+              <w:keepNext/>
+              <w:widowControl/>
+              <w:overflowPunct w:val="0"/>
+              <w:spacing w:after="0" w:line="250"/>
+              <w:ind w:firstLine="0"/>
+              <w:jc w:val="center"/>
+            </w:pPr>
+            <w:r>
+              <w:rPr>
+                <w:rFonts w:ascii="Times New Roman" w:cs="Times New Roman" w:eastAsia="宋体" w:hAnsi="Times New Roman"/>
+                <w:sz w:val="21"/>
+                <w:szCs w:val="21"/>
+              </w:rPr>
+              <w:t xml:space="preserve">径向控制体编号、径向控制体总数</w:t>
+            </w:r>
+          </w:p>
+        </w:tc>
+        <w:tc>
+          <w:tcPr>
+            <w:tcW w:type="dxa" w:w="2850"/>
+            <w:tcBorders>
+              <w:top w:val="none" w:color="FFFFFF" w:sz="0"/>
+              <w:left w:val="none" w:color="FFFFFF" w:sz="0"/>
+              <w:bottom w:val="none" w:color="FFFFFF" w:sz="0"/>
+              <w:right w:val="none" w:color="FFFFFF" w:sz="0"/>
+            </w:tcBorders>
+            <w:tcMar>
+              <w:top w:type="dxa" w:w="65"/>
+              <w:left w:type="dxa" w:w="75"/>
+              <w:bottom w:type="dxa" w:w="65"/>
+              <w:right w:type="dxa" w:w="75"/>
+            </w:tcMar>
+          </w:tcPr>
+          <w:p>
+            <w:pPr>
+              <w:keepNext/>
+              <w:widowControl/>
+              <w:overflowPunct w:val="0"/>
+              <w:spacing w:after="0" w:line="250"/>
+              <w:ind w:firstLine="0"/>
+              <w:jc w:val="center"/>
+            </w:pPr>
+            <w:r>
+              <w:rPr>
+                <w:rFonts w:ascii="Times New Roman" w:cs="Times New Roman" w:eastAsia="宋体" w:hAnsi="Times New Roman"/>
+                <w:sz w:val="21"/>
+                <w:szCs w:val="21"/>
+              </w:rPr>
+              <w:t xml:space="preserve">1</w:t>
+            </w:r>
+          </w:p>
+        </w:tc>
+      </w:tr>
+      <w:tr>
+        <w:trPr>
+          <w:cantSplit/>
+          <w:tblHeader w:val="false"/>
+        </w:trPr>
+        <w:tc>
+          <w:tcPr>
+            <w:tcW w:type="dxa" w:w="1950"/>
+            <w:tcBorders>
+              <w:top w:val="none" w:color="FFFFFF" w:sz="0"/>
+              <w:left w:val="none" w:color="FFFFFF" w:sz="0"/>
+              <w:bottom w:val="none" w:color="FFFFFF" w:sz="0"/>
+              <w:right w:val="none" w:color="FFFFFF" w:sz="0"/>
+            </w:tcBorders>
+            <w:tcMar>
+              <w:top w:type="dxa" w:w="65"/>
+              <w:left w:type="dxa" w:w="75"/>
+              <w:bottom w:type="dxa" w:w="65"/>
+              <w:right w:type="dxa" w:w="75"/>
+            </w:tcMar>
+          </w:tcPr>
+          <w:p>
+            <w:pPr>
+              <w:keepNext/>
+              <w:widowControl/>
+              <w:overflowPunct w:val="0"/>
+              <w:spacing w:after="0" w:line="250"/>
+              <w:ind w:firstLine="0"/>
+              <w:jc w:val="center"/>
+            </w:pPr>
+            <m:oMath>
+              <m:sSub>
+                <m:e>
+                  <m:r>
+                    <w:rPr>
+                      <w:sz w:val="21"/>
+                    </w:rPr>
+                    <m:t>r</m:t>
+                  </m:r>
+                </m:e>
+                <m:sub>
+                  <m:r>
+                    <w:rPr>
+                      <w:sz w:val="21"/>
+                    </w:rPr>
+                    <m:t>i−1/2</m:t>
+                  </m:r>
+                </m:sub>
+              </m:sSub>
+              <m:r>
+                <w:rPr>
+                  <w:sz w:val="21"/>
+                </w:rPr>
+                <m:t>,</m:t>
+              </m:r>
+              <m:sSub>
+                <m:e>
+                  <m:r>
+                    <w:rPr>
+                      <w:sz w:val="21"/>
+                    </w:rPr>
+                    <m:t>r</m:t>
+                  </m:r>
+                </m:e>
+                <m:sub>
+                  <m:r>
+                    <w:rPr>
+                      <w:sz w:val="21"/>
+                    </w:rPr>
+                    <m:t>i+1/2</m:t>
+                  </m:r>
+                </m:sub>
+              </m:sSub>
+            </m:oMath>
+          </w:p>
+        </w:tc>
+        <w:tc>
+          <w:tcPr>
+            <w:tcW w:type="dxa" w:w="4200"/>
+            <w:tcBorders>
+              <w:top w:val="none" w:color="FFFFFF" w:sz="0"/>
+              <w:left w:val="none" w:color="FFFFFF" w:sz="0"/>
+              <w:bottom w:val="none" w:color="FFFFFF" w:sz="0"/>
+              <w:right w:val="none" w:color="FFFFFF" w:sz="0"/>
+            </w:tcBorders>
+            <w:tcMar>
+              <w:top w:type="dxa" w:w="65"/>
+              <w:left w:type="dxa" w:w="75"/>
+              <w:bottom w:type="dxa" w:w="65"/>
+              <w:right w:type="dxa" w:w="75"/>
+            </w:tcMar>
+          </w:tcPr>
+          <w:p>
+            <w:pPr>
+              <w:keepNext/>
+              <w:widowControl/>
+              <w:overflowPunct w:val="0"/>
+              <w:spacing w:after="0" w:line="250"/>
+              <w:ind w:firstLine="0"/>
+              <w:jc w:val="center"/>
+            </w:pPr>
+            <w:r>
+              <w:rPr>
+                <w:rFonts w:ascii="Times New Roman" w:cs="Times New Roman" w:eastAsia="宋体" w:hAnsi="Times New Roman"/>
+                <w:sz w:val="21"/>
+                <w:szCs w:val="21"/>
+              </w:rPr>
+              <w:t xml:space="preserve">第 </w:t>
+            </w:r>
+            <m:oMath>
+              <m:r>
+                <w:rPr>
+                  <w:sz w:val="21"/>
+                </w:rPr>
+                <m:t>i</m:t>
+              </m:r>
+            </m:oMath>
+            <w:r>
+              <w:rPr>
+                <w:rFonts w:ascii="Times New Roman" w:cs="Times New Roman" w:eastAsia="宋体" w:hAnsi="Times New Roman"/>
+                <w:sz w:val="21"/>
+                <w:szCs w:val="21"/>
+              </w:rPr>
+              <w:t xml:space="preserve"> 个控制体内、外界面的物理半径</w:t>
+            </w:r>
+          </w:p>
+        </w:tc>
+        <w:tc>
+          <w:tcPr>
+            <w:tcW w:type="dxa" w:w="2850"/>
+            <w:tcBorders>
+              <w:top w:val="none" w:color="FFFFFF" w:sz="0"/>
+              <w:left w:val="none" w:color="FFFFFF" w:sz="0"/>
+              <w:bottom w:val="none" w:color="FFFFFF" w:sz="0"/>
+              <w:right w:val="none" w:color="FFFFFF" w:sz="0"/>
+            </w:tcBorders>
+            <w:tcMar>
+              <w:top w:type="dxa" w:w="65"/>
+              <w:left w:type="dxa" w:w="75"/>
+              <w:bottom w:type="dxa" w:w="65"/>
+              <w:right w:type="dxa" w:w="75"/>
+            </w:tcMar>
+          </w:tcPr>
+          <w:p>
+            <w:pPr>
+              <w:keepNext/>
+              <w:widowControl/>
+              <w:overflowPunct w:val="0"/>
+              <w:spacing w:after="0" w:line="250"/>
+              <w:ind w:firstLine="0"/>
+              <w:jc w:val="center"/>
+            </w:pPr>
+            <w:r>
+              <w:rPr>
+                <w:rFonts w:ascii="Times New Roman" w:cs="Times New Roman" w:eastAsia="宋体" w:hAnsi="Times New Roman"/>
+                <w:sz w:val="21"/>
+                <w:szCs w:val="21"/>
+              </w:rPr>
+              <w:t xml:space="preserve">m</w:t>
+            </w:r>
+          </w:p>
+        </w:tc>
+      </w:tr>
+      <w:tr>
+        <w:trPr>
+          <w:cantSplit/>
+          <w:tblHeader w:val="false"/>
+        </w:trPr>
+        <w:tc>
+          <w:tcPr>
+            <w:tcW w:type="dxa" w:w="1950"/>
+            <w:tcBorders>
+              <w:top w:val="none" w:color="FFFFFF" w:sz="0"/>
+              <w:left w:val="none" w:color="FFFFFF" w:sz="0"/>
+              <w:bottom w:val="none" w:color="FFFFFF" w:sz="0"/>
+              <w:right w:val="none" w:color="FFFFFF" w:sz="0"/>
+            </w:tcBorders>
+            <w:tcMar>
+              <w:top w:type="dxa" w:w="65"/>
+              <w:left w:type="dxa" w:w="75"/>
+              <w:bottom w:type="dxa" w:w="65"/>
+              <w:right w:type="dxa" w:w="75"/>
+            </w:tcMar>
+          </w:tcPr>
+          <w:p>
+            <w:pPr>
+              <w:keepNext/>
+              <w:widowControl/>
+              <w:overflowPunct w:val="0"/>
+              <w:spacing w:after="0" w:line="250"/>
+              <w:ind w:firstLine="0"/>
+              <w:jc w:val="center"/>
+            </w:pPr>
+            <m:oMath>
+              <m:r>
+                <w:rPr>
+                  <w:sz w:val="21"/>
+                </w:rPr>
+                <m:t>Δr</m:t>
+              </m:r>
+            </m:oMath>
+          </w:p>
+        </w:tc>
+        <w:tc>
+          <w:tcPr>
+            <w:tcW w:type="dxa" w:w="4200"/>
+            <w:tcBorders>
+              <w:top w:val="none" w:color="FFFFFF" w:sz="0"/>
+              <w:left w:val="none" w:color="FFFFFF" w:sz="0"/>
+              <w:bottom w:val="none" w:color="FFFFFF" w:sz="0"/>
+              <w:right w:val="none" w:color="FFFFFF" w:sz="0"/>
+            </w:tcBorders>
+            <w:tcMar>
+              <w:top w:type="dxa" w:w="65"/>
+              <w:left w:type="dxa" w:w="75"/>
+              <w:bottom w:type="dxa" w:w="65"/>
+              <w:right w:type="dxa" w:w="75"/>
+            </w:tcMar>
+          </w:tcPr>
+          <w:p>
+            <w:pPr>
+              <w:keepNext/>
+              <w:widowControl/>
+              <w:overflowPunct w:val="0"/>
+              <w:spacing w:after="0" w:line="250"/>
+              <w:ind w:firstLine="0"/>
+              <w:jc w:val="center"/>
+            </w:pPr>
+            <w:r>
+              <w:rPr>
+                <w:rFonts w:ascii="Times New Roman" w:cs="Times New Roman" w:eastAsia="宋体" w:hAnsi="Times New Roman"/>
+                <w:sz w:val="21"/>
+                <w:szCs w:val="21"/>
+              </w:rPr>
+              <w:t xml:space="preserve">固定半径模型的径向网格间距</w:t>
+            </w:r>
+          </w:p>
+        </w:tc>
+        <w:tc>
+          <w:tcPr>
+            <w:tcW w:type="dxa" w:w="2850"/>
+            <w:tcBorders>
+              <w:top w:val="none" w:color="FFFFFF" w:sz="0"/>
+              <w:left w:val="none" w:color="FFFFFF" w:sz="0"/>
+              <w:bottom w:val="none" w:color="FFFFFF" w:sz="0"/>
+              <w:right w:val="none" w:color="FFFFFF" w:sz="0"/>
+            </w:tcBorders>
+            <w:tcMar>
+              <w:top w:type="dxa" w:w="65"/>
+              <w:left w:type="dxa" w:w="75"/>
+              <w:bottom w:type="dxa" w:w="65"/>
+              <w:right w:type="dxa" w:w="75"/>
+            </w:tcMar>
+          </w:tcPr>
+          <w:p>
+            <w:pPr>
+              <w:keepNext/>
+              <w:widowControl/>
+              <w:overflowPunct w:val="0"/>
+              <w:spacing w:after="0" w:line="250"/>
+              <w:ind w:firstLine="0"/>
+              <w:jc w:val="center"/>
+            </w:pPr>
+            <w:r>
+              <w:rPr>
+                <w:rFonts w:ascii="Times New Roman" w:cs="Times New Roman" w:eastAsia="宋体" w:hAnsi="Times New Roman"/>
+                <w:sz w:val="21"/>
+                <w:szCs w:val="21"/>
+              </w:rPr>
+              <w:t xml:space="preserve">m</w:t>
+            </w:r>
+          </w:p>
+        </w:tc>
+      </w:tr>
+      <w:tr>
+        <w:trPr>
+          <w:cantSplit/>
+          <w:tblHeader w:val="false"/>
+        </w:trPr>
+        <w:tc>
+          <w:tcPr>
+            <w:tcW w:type="dxa" w:w="1950"/>
+            <w:tcBorders>
+              <w:top w:val="none" w:color="FFFFFF" w:sz="0"/>
+              <w:left w:val="none" w:color="FFFFFF" w:sz="0"/>
+              <w:bottom w:val="none" w:color="FFFFFF" w:sz="0"/>
+              <w:right w:val="none" w:color="FFFFFF" w:sz="0"/>
+            </w:tcBorders>
+            <w:tcMar>
+              <w:top w:type="dxa" w:w="65"/>
+              <w:left w:type="dxa" w:w="75"/>
+              <w:bottom w:type="dxa" w:w="65"/>
+              <w:right w:type="dxa" w:w="75"/>
+            </w:tcMar>
+          </w:tcPr>
+          <w:p>
+            <w:pPr>
+              <w:keepNext/>
+              <w:widowControl/>
+              <w:overflowPunct w:val="0"/>
+              <w:spacing w:after="0" w:line="250"/>
+              <w:ind w:firstLine="0"/>
+              <w:jc w:val="center"/>
+            </w:pPr>
+            <m:oMath>
+              <m:sSub>
+                <m:e>
+                  <m:r>
+                    <w:rPr>
+                      <w:sz w:val="21"/>
+                    </w:rPr>
+                    <m:t>V</m:t>
+                  </m:r>
+                </m:e>
+                <m:sub>
+                  <m:r>
+                    <w:rPr>
+                      <w:sz w:val="21"/>
+                    </w:rPr>
+                    <m:t>i</m:t>
+                  </m:r>
+                </m:sub>
+              </m:sSub>
+              <m:r>
+                <w:rPr>
+                  <w:sz w:val="21"/>
+                </w:rPr>
+                <m:t>,</m:t>
+              </m:r>
+              <m:sSub>
+                <m:e>
+                  <m:r>
+                    <w:rPr>
+                      <w:sz w:val="21"/>
+                    </w:rPr>
+                    <m:t>A</m:t>
+                  </m:r>
+                </m:e>
+                <m:sub>
+                  <m:r>
+                    <w:rPr>
+                      <w:sz w:val="21"/>
+                    </w:rPr>
+                    <m:t>i+1/2</m:t>
+                  </m:r>
+                </m:sub>
+              </m:sSub>
+            </m:oMath>
+          </w:p>
+        </w:tc>
+        <w:tc>
+          <w:tcPr>
+            <w:tcW w:type="dxa" w:w="4200"/>
+            <w:tcBorders>
+              <w:top w:val="none" w:color="FFFFFF" w:sz="0"/>
+              <w:left w:val="none" w:color="FFFFFF" w:sz="0"/>
+              <w:bottom w:val="none" w:color="FFFFFF" w:sz="0"/>
+              <w:right w:val="none" w:color="FFFFFF" w:sz="0"/>
+            </w:tcBorders>
+            <w:tcMar>
+              <w:top w:type="dxa" w:w="65"/>
+              <w:left w:type="dxa" w:w="75"/>
+              <w:bottom w:type="dxa" w:w="65"/>
+              <w:right w:type="dxa" w:w="75"/>
+            </w:tcMar>
+          </w:tcPr>
+          <w:p>
+            <w:pPr>
+              <w:keepNext/>
+              <w:widowControl/>
+              <w:overflowPunct w:val="0"/>
+              <w:spacing w:after="0" w:line="250"/>
+              <w:ind w:firstLine="0"/>
+              <w:jc w:val="center"/>
+            </w:pPr>
+            <w:r>
+              <w:rPr>
+                <w:rFonts w:ascii="Times New Roman" w:cs="Times New Roman" w:eastAsia="宋体" w:hAnsi="Times New Roman"/>
+                <w:sz w:val="21"/>
+                <w:szCs w:val="21"/>
+              </w:rPr>
+              <w:t xml:space="preserve">单位轴向长度下第 </w:t>
+            </w:r>
+            <m:oMath>
+              <m:r>
+                <w:rPr>
+                  <w:sz w:val="21"/>
+                </w:rPr>
+                <m:t>i</m:t>
+              </m:r>
+            </m:oMath>
+            <w:r>
+              <w:rPr>
+                <w:rFonts w:ascii="Times New Roman" w:cs="Times New Roman" w:eastAsia="宋体" w:hAnsi="Times New Roman"/>
+                <w:sz w:val="21"/>
+                <w:szCs w:val="21"/>
+              </w:rPr>
+              <w:t xml:space="preserve"> 个控制体体积、外界面面积</w:t>
+            </w:r>
+          </w:p>
+        </w:tc>
+        <w:tc>
+          <w:tcPr>
+            <w:tcW w:type="dxa" w:w="2850"/>
+            <w:tcBorders>
+              <w:top w:val="none" w:color="FFFFFF" w:sz="0"/>
+              <w:left w:val="none" w:color="FFFFFF" w:sz="0"/>
+              <w:bottom w:val="none" w:color="FFFFFF" w:sz="0"/>
+              <w:right w:val="none" w:color="FFFFFF" w:sz="0"/>
+            </w:tcBorders>
+            <w:tcMar>
+              <w:top w:type="dxa" w:w="65"/>
+              <w:left w:type="dxa" w:w="75"/>
+              <w:bottom w:type="dxa" w:w="65"/>
+              <w:right w:type="dxa" w:w="75"/>
+            </w:tcMar>
+          </w:tcPr>
+          <w:p>
+            <w:pPr>
+              <w:keepNext/>
+              <w:widowControl/>
+              <w:overflowPunct w:val="0"/>
+              <w:spacing w:after="0" w:line="250"/>
+              <w:ind w:firstLine="0"/>
+              <w:jc w:val="center"/>
+            </w:pPr>
+            <w:r>
+              <w:rPr>
+                <w:rFonts w:ascii="Times New Roman" w:cs="Times New Roman" w:eastAsia="宋体" w:hAnsi="Times New Roman"/>
+                <w:sz w:val="21"/>
+                <w:szCs w:val="21"/>
+              </w:rPr>
+              <w:t xml:space="preserve">m²、m</w:t>
+            </w:r>
+          </w:p>
+        </w:tc>
+      </w:tr>
+      <w:tr>
+        <w:trPr>
+          <w:cantSplit/>
+          <w:tblHeader w:val="false"/>
+        </w:trPr>
+        <w:tc>
+          <w:tcPr>
+            <w:tcW w:type="dxa" w:w="1950"/>
+            <w:tcBorders>
+              <w:top w:val="none" w:color="FFFFFF" w:sz="0"/>
+              <w:left w:val="none" w:color="FFFFFF" w:sz="0"/>
+              <w:bottom w:val="none" w:color="FFFFFF" w:sz="0"/>
+              <w:right w:val="none" w:color="FFFFFF" w:sz="0"/>
+            </w:tcBorders>
+            <w:tcMar>
+              <w:top w:type="dxa" w:w="65"/>
+              <w:left w:type="dxa" w:w="75"/>
+              <w:bottom w:type="dxa" w:w="65"/>
+              <w:right w:type="dxa" w:w="75"/>
+            </w:tcMar>
+          </w:tcPr>
+          <w:p>
+            <w:pPr>
+              <w:keepNext/>
+              <w:widowControl/>
+              <w:overflowPunct w:val="0"/>
+              <w:spacing w:after="0" w:line="250"/>
+              <w:ind w:firstLine="0"/>
+              <w:jc w:val="center"/>
+            </w:pPr>
+            <m:oMath>
+              <m:r>
+                <w:rPr>
+                  <w:sz w:val="21"/>
+                </w:rPr>
+                <m:t>u,s,Γ</m:t>
+              </m:r>
+            </m:oMath>
+          </w:p>
+        </w:tc>
+        <w:tc>
+          <w:tcPr>
+            <w:tcW w:type="dxa" w:w="4200"/>
+            <w:tcBorders>
+              <w:top w:val="none" w:color="FFFFFF" w:sz="0"/>
+              <w:left w:val="none" w:color="FFFFFF" w:sz="0"/>
+              <w:bottom w:val="none" w:color="FFFFFF" w:sz="0"/>
+              <w:right w:val="none" w:color="FFFFFF" w:sz="0"/>
+            </w:tcBorders>
+            <w:tcMar>
+              <w:top w:type="dxa" w:w="65"/>
+              <w:left w:type="dxa" w:w="75"/>
+              <w:bottom w:type="dxa" w:w="65"/>
+              <w:right w:type="dxa" w:w="75"/>
+            </w:tcMar>
+          </w:tcPr>
+          <w:p>
+            <w:pPr>
+              <w:keepNext/>
+              <w:widowControl/>
+              <w:overflowPunct w:val="0"/>
+              <w:spacing w:after="0" w:line="250"/>
+              <w:ind w:firstLine="0"/>
+              <w:jc w:val="center"/>
+            </w:pPr>
+            <w:r>
+              <w:rPr>
+                <w:rFonts w:ascii="Times New Roman" w:cs="Times New Roman" w:eastAsia="宋体" w:hAnsi="Times New Roman"/>
+                <w:sz w:val="21"/>
+                <w:szCs w:val="21"/>
+              </w:rPr>
+              <w:t xml:space="preserve">一般守恒式中的传输变量、蓄积系数、输运系数</w:t>
+            </w:r>
+          </w:p>
+        </w:tc>
+        <w:tc>
+          <w:tcPr>
+            <w:tcW w:type="dxa" w:w="2850"/>
+            <w:tcBorders>
+              <w:top w:val="none" w:color="FFFFFF" w:sz="0"/>
+              <w:left w:val="none" w:color="FFFFFF" w:sz="0"/>
+              <w:bottom w:val="none" w:color="FFFFFF" w:sz="0"/>
+              <w:right w:val="none" w:color="FFFFFF" w:sz="0"/>
+            </w:tcBorders>
+            <w:tcMar>
+              <w:top w:type="dxa" w:w="65"/>
+              <w:left w:type="dxa" w:w="75"/>
+              <w:bottom w:type="dxa" w:w="65"/>
+              <w:right w:type="dxa" w:w="75"/>
+            </w:tcMar>
+          </w:tcPr>
+          <w:p>
+            <w:pPr>
+              <w:keepNext/>
+              <w:widowControl/>
+              <w:overflowPunct w:val="0"/>
+              <w:spacing w:after="0" w:line="250"/>
+              <w:ind w:firstLine="0"/>
+              <w:jc w:val="center"/>
+            </w:pPr>
+            <w:r>
+              <w:rPr>
+                <w:rFonts w:ascii="Times New Roman" w:cs="Times New Roman" w:eastAsia="宋体" w:hAnsi="Times New Roman"/>
+                <w:sz w:val="21"/>
+                <w:szCs w:val="21"/>
+              </w:rPr>
+              <w:t xml:space="preserve">随所取方程而定</w:t>
+            </w:r>
+          </w:p>
+        </w:tc>
+      </w:tr>
+      <w:tr>
+        <w:trPr>
+          <w:cantSplit/>
+          <w:tblHeader w:val="false"/>
+        </w:trPr>
+        <w:tc>
+          <w:tcPr>
+            <w:tcW w:type="dxa" w:w="1950"/>
+            <w:tcBorders>
+              <w:top w:val="none" w:color="FFFFFF" w:sz="0"/>
+              <w:left w:val="none" w:color="FFFFFF" w:sz="0"/>
+              <w:bottom w:val="none" w:color="FFFFFF" w:sz="0"/>
+              <w:right w:val="none" w:color="FFFFFF" w:sz="0"/>
+            </w:tcBorders>
+            <w:tcMar>
+              <w:top w:type="dxa" w:w="65"/>
+              <w:left w:type="dxa" w:w="75"/>
+              <w:bottom w:type="dxa" w:w="65"/>
+              <w:right w:type="dxa" w:w="75"/>
+            </w:tcMar>
+          </w:tcPr>
+          <w:p>
+            <w:pPr>
+              <w:keepNext/>
+              <w:widowControl/>
+              <w:overflowPunct w:val="0"/>
+              <w:spacing w:after="0" w:line="250"/>
+              <w:ind w:firstLine="0"/>
+              <w:jc w:val="center"/>
+            </w:pPr>
+            <m:oMath>
+              <m:r>
+                <w:rPr>
+                  <w:sz w:val="21"/>
+                </w:rPr>
+                <m:t>f,</m:t>
+              </m:r>
+              <m:sSub>
+                <m:e>
+                  <m:r>
+                    <w:rPr>
+                      <w:sz w:val="21"/>
+                    </w:rPr>
+                    <m:t>f</m:t>
+                  </m:r>
+                </m:e>
+                <m:sub>
+                  <m:r>
+                    <w:rPr>
+                      <w:sz w:val="21"/>
+                    </w:rPr>
+                    <m:t>i</m:t>
+                  </m:r>
+                </m:sub>
+              </m:sSub>
+              <m:r>
+                <w:rPr>
+                  <w:sz w:val="21"/>
+                </w:rPr>
+                <m:t>,</m:t>
+              </m:r>
+              <m:sSub>
+                <m:e>
+                  <m:r>
+                    <w:rPr>
+                      <w:sz w:val="21"/>
+                    </w:rPr>
+                    <m:t>t</m:t>
+                  </m:r>
+                </m:e>
+                <m:sub>
+                  <m:r>
+                    <w:rPr>
+                      <w:sz w:val="21"/>
+                    </w:rPr>
+                    <m:t>i</m:t>
+                  </m:r>
+                </m:sub>
+              </m:sSub>
+            </m:oMath>
+          </w:p>
+        </w:tc>
+        <w:tc>
+          <w:tcPr>
+            <w:tcW w:type="dxa" w:w="4200"/>
+            <w:tcBorders>
+              <w:top w:val="none" w:color="FFFFFF" w:sz="0"/>
+              <w:left w:val="none" w:color="FFFFFF" w:sz="0"/>
+              <w:bottom w:val="none" w:color="FFFFFF" w:sz="0"/>
+              <w:right w:val="none" w:color="FFFFFF" w:sz="0"/>
+            </w:tcBorders>
+            <w:tcMar>
+              <w:top w:type="dxa" w:w="65"/>
+              <w:left w:type="dxa" w:w="75"/>
+              <w:bottom w:type="dxa" w:w="65"/>
+              <w:right w:type="dxa" w:w="75"/>
+            </w:tcMar>
+          </w:tcPr>
+          <w:p>
+            <w:pPr>
+              <w:keepNext/>
+              <w:widowControl/>
+              <w:overflowPunct w:val="0"/>
+              <w:spacing w:after="0" w:line="250"/>
+              <w:ind w:firstLine="0"/>
+              <w:jc w:val="center"/>
+            </w:pPr>
+            <w:r>
+              <w:rPr>
+                <w:rFonts w:ascii="Times New Roman" w:cs="Times New Roman" w:eastAsia="宋体" w:hAnsi="Times New Roman"/>
+                <w:sz w:val="21"/>
+                <w:szCs w:val="21"/>
+              </w:rPr>
+              <w:t xml:space="preserve">插值变量、相邻观测点的变量值及其时刻</w:t>
+            </w:r>
+          </w:p>
+        </w:tc>
+        <w:tc>
+          <w:tcPr>
+            <w:tcW w:type="dxa" w:w="2850"/>
+            <w:tcBorders>
+              <w:top w:val="none" w:color="FFFFFF" w:sz="0"/>
+              <w:left w:val="none" w:color="FFFFFF" w:sz="0"/>
+              <w:bottom w:val="none" w:color="FFFFFF" w:sz="0"/>
+              <w:right w:val="none" w:color="FFFFFF" w:sz="0"/>
+            </w:tcBorders>
+            <w:tcMar>
+              <w:top w:type="dxa" w:w="65"/>
+              <w:left w:type="dxa" w:w="75"/>
+              <w:bottom w:type="dxa" w:w="65"/>
+              <w:right w:type="dxa" w:w="75"/>
+            </w:tcMar>
+          </w:tcPr>
+          <w:p>
+            <w:pPr>
+              <w:keepNext/>
+              <w:widowControl/>
+              <w:overflowPunct w:val="0"/>
+              <w:spacing w:after="0" w:line="250"/>
+              <w:ind w:firstLine="0"/>
+              <w:jc w:val="center"/>
+            </w:pPr>
+            <w:r>
+              <w:rPr>
+                <w:rFonts w:ascii="Times New Roman" w:cs="Times New Roman" w:eastAsia="宋体" w:hAnsi="Times New Roman"/>
+                <w:sz w:val="21"/>
+                <w:szCs w:val="21"/>
+              </w:rPr>
+              <w:t xml:space="preserve">随变量而定、s</w:t>
+            </w:r>
+          </w:p>
+        </w:tc>
+      </w:tr>
+      <w:tr>
+        <w:trPr>
+          <w:cantSplit/>
+          <w:tblHeader w:val="false"/>
+        </w:trPr>
+        <w:tc>
+          <w:tcPr>
+            <w:tcW w:type="dxa" w:w="1950"/>
+            <w:tcBorders>
+              <w:top w:val="none" w:color="FFFFFF" w:sz="0"/>
+              <w:left w:val="none" w:color="FFFFFF" w:sz="0"/>
+              <w:bottom w:val="none" w:color="FFFFFF" w:sz="0"/>
+              <w:right w:val="none" w:color="FFFFFF" w:sz="0"/>
+            </w:tcBorders>
+            <w:tcMar>
+              <w:top w:type="dxa" w:w="65"/>
+              <w:left w:type="dxa" w:w="75"/>
+              <w:bottom w:type="dxa" w:w="65"/>
+              <w:right w:type="dxa" w:w="75"/>
+            </w:tcMar>
+          </w:tcPr>
+          <w:p>
+            <w:pPr>
+              <w:keepNext/>
+              <w:widowControl/>
+              <w:overflowPunct w:val="0"/>
+              <w:spacing w:after="0" w:line="250"/>
+              <w:ind w:firstLine="0"/>
+              <w:jc w:val="center"/>
+            </w:pPr>
+            <m:oMath>
+              <m:r>
+                <w:rPr>
+                  <w:sz w:val="21"/>
+                </w:rPr>
+                <m:t>z</m:t>
+              </m:r>
+            </m:oMath>
+          </w:p>
+        </w:tc>
+        <w:tc>
+          <w:tcPr>
+            <w:tcW w:type="dxa" w:w="4200"/>
+            <w:tcBorders>
+              <w:top w:val="none" w:color="FFFFFF" w:sz="0"/>
+              <w:left w:val="none" w:color="FFFFFF" w:sz="0"/>
+              <w:bottom w:val="none" w:color="FFFFFF" w:sz="0"/>
+              <w:right w:val="none" w:color="FFFFFF" w:sz="0"/>
+            </w:tcBorders>
+            <w:tcMar>
+              <w:top w:type="dxa" w:w="65"/>
+              <w:left w:type="dxa" w:w="75"/>
+              <w:bottom w:type="dxa" w:w="65"/>
+              <w:right w:type="dxa" w:w="75"/>
+            </w:tcMar>
+          </w:tcPr>
+          <w:p>
+            <w:pPr>
+              <w:keepNext/>
+              <w:widowControl/>
+              <w:overflowPunct w:val="0"/>
+              <w:spacing w:after="0" w:line="250"/>
+              <w:ind w:firstLine="0"/>
+              <w:jc w:val="center"/>
+            </w:pPr>
+            <w:r>
+              <w:rPr>
+                <w:rFonts w:ascii="Times New Roman" w:cs="Times New Roman" w:eastAsia="宋体" w:hAnsi="Times New Roman"/>
+                <w:sz w:val="21"/>
+                <w:szCs w:val="21"/>
+              </w:rPr>
+              <w:t xml:space="preserve">为保证正性而引入的对数含水率，</w:t>
+            </w:r>
+            <m:oMath>
+              <m:r>
+                <w:rPr>
+                  <w:sz w:val="21"/>
+                </w:rPr>
+                <m:t>z=</m:t>
+              </m:r>
+              <m:r>
+                <m:rPr>
+                  <m:sty m:val="p"/>
+                </m:rPr>
+                <w:rPr>
+                  <w:sz w:val="21"/>
+                </w:rPr>
+                <m:t>ln</m:t>
+              </m:r>
+              <m:r>
+                <w:rPr>
+                  <w:sz w:val="21"/>
+                </w:rPr>
+                <m:t>C</m:t>
+              </m:r>
+            </m:oMath>
+          </w:p>
+        </w:tc>
+        <w:tc>
+          <w:tcPr>
+            <w:tcW w:type="dxa" w:w="2850"/>
+            <w:tcBorders>
+              <w:top w:val="none" w:color="FFFFFF" w:sz="0"/>
+              <w:left w:val="none" w:color="FFFFFF" w:sz="0"/>
+              <w:bottom w:val="none" w:color="FFFFFF" w:sz="0"/>
+              <w:right w:val="none" w:color="FFFFFF" w:sz="0"/>
+            </w:tcBorders>
+            <w:tcMar>
+              <w:top w:type="dxa" w:w="65"/>
+              <w:left w:type="dxa" w:w="75"/>
+              <w:bottom w:type="dxa" w:w="65"/>
+              <w:right w:type="dxa" w:w="75"/>
+            </w:tcMar>
+          </w:tcPr>
+          <w:p>
+            <w:pPr>
+              <w:keepNext/>
+              <w:widowControl/>
+              <w:overflowPunct w:val="0"/>
+              <w:spacing w:after="0" w:line="250"/>
+              <w:ind w:firstLine="0"/>
+              <w:jc w:val="center"/>
+            </w:pPr>
+            <w:r>
+              <w:rPr>
+                <w:rFonts w:ascii="Times New Roman" w:cs="Times New Roman" w:eastAsia="宋体" w:hAnsi="Times New Roman"/>
+                <w:sz w:val="21"/>
+                <w:szCs w:val="21"/>
+              </w:rPr>
+              <w:t xml:space="preserve">1</w:t>
+            </w:r>
+          </w:p>
+        </w:tc>
+      </w:tr>
+      <w:tr>
+        <w:trPr>
+          <w:cantSplit/>
+          <w:tblHeader w:val="false"/>
+        </w:trPr>
+        <w:tc>
+          <w:tcPr>
+            <w:tcW w:type="dxa" w:w="1950"/>
+            <w:tcBorders>
+              <w:top w:val="none" w:color="FFFFFF" w:sz="0"/>
+              <w:left w:val="none" w:color="FFFFFF" w:sz="0"/>
+              <w:bottom w:val="none" w:color="FFFFFF" w:sz="0"/>
+              <w:right w:val="none" w:color="FFFFFF" w:sz="0"/>
+            </w:tcBorders>
+            <w:tcMar>
+              <w:top w:type="dxa" w:w="65"/>
+              <w:left w:type="dxa" w:w="75"/>
+              <w:bottom w:type="dxa" w:w="65"/>
+              <w:right w:type="dxa" w:w="75"/>
+            </w:tcMar>
+          </w:tcPr>
+          <w:p>
+            <w:pPr>
+              <w:keepNext/>
+              <w:widowControl/>
+              <w:overflowPunct w:val="0"/>
+              <w:spacing w:after="0" w:line="250"/>
+              <w:ind w:firstLine="0"/>
+              <w:jc w:val="center"/>
+            </w:pPr>
+            <m:oMath>
+              <m:sSub>
+                <m:e>
+                  <m:r>
+                    <w:rPr>
+                      <w:sz w:val="21"/>
+                    </w:rPr>
+                    <m:t>u</m:t>
+                  </m:r>
+                </m:e>
+                <m:sub>
+                  <m:r>
+                    <m:rPr>
+                      <m:sty m:val="p"/>
+                    </m:rPr>
+                    <w:rPr>
+                      <w:sz w:val="21"/>
+                    </w:rPr>
+                    <m:t>ext</m:t>
+                  </m:r>
+                </m:sub>
+              </m:sSub>
+            </m:oMath>
+          </w:p>
+        </w:tc>
+        <w:tc>
+          <w:tcPr>
+            <w:tcW w:type="dxa" w:w="4200"/>
+            <w:tcBorders>
+              <w:top w:val="none" w:color="FFFFFF" w:sz="0"/>
+              <w:left w:val="none" w:color="FFFFFF" w:sz="0"/>
+              <w:bottom w:val="none" w:color="FFFFFF" w:sz="0"/>
+              <w:right w:val="none" w:color="FFFFFF" w:sz="0"/>
+            </w:tcBorders>
+            <w:tcMar>
+              <w:top w:type="dxa" w:w="65"/>
+              <w:left w:type="dxa" w:w="75"/>
+              <w:bottom w:type="dxa" w:w="65"/>
+              <w:right w:type="dxa" w:w="75"/>
+            </w:tcMar>
+          </w:tcPr>
+          <w:p>
+            <w:pPr>
+              <w:keepNext/>
+              <w:widowControl/>
+              <w:overflowPunct w:val="0"/>
+              <w:spacing w:after="0" w:line="250"/>
+              <w:ind w:firstLine="0"/>
+              <w:jc w:val="center"/>
+            </w:pPr>
+            <w:r>
+              <w:rPr>
+                <w:rFonts w:ascii="Times New Roman" w:cs="Times New Roman" w:eastAsia="宋体" w:hAnsi="Times New Roman"/>
+                <w:sz w:val="21"/>
+                <w:szCs w:val="21"/>
+              </w:rPr>
+              <w:t xml:space="preserve">由两级网格结果作 Richardson 外推后的量</w:t>
+            </w:r>
+          </w:p>
+        </w:tc>
+        <w:tc>
+          <w:tcPr>
+            <w:tcW w:type="dxa" w:w="2850"/>
+            <w:tcBorders>
+              <w:top w:val="none" w:color="FFFFFF" w:sz="0"/>
+              <w:left w:val="none" w:color="FFFFFF" w:sz="0"/>
+              <w:bottom w:val="none" w:color="FFFFFF" w:sz="0"/>
+              <w:right w:val="none" w:color="FFFFFF" w:sz="0"/>
+            </w:tcBorders>
+            <w:tcMar>
+              <w:top w:type="dxa" w:w="65"/>
+              <w:left w:type="dxa" w:w="75"/>
+              <w:bottom w:type="dxa" w:w="65"/>
+              <w:right w:type="dxa" w:w="75"/>
+            </w:tcMar>
+          </w:tcPr>
+          <w:p>
+            <w:pPr>
+              <w:keepNext/>
+              <w:widowControl/>
+              <w:overflowPunct w:val="0"/>
+              <w:spacing w:after="0" w:line="250"/>
+              <w:ind w:firstLine="0"/>
+              <w:jc w:val="center"/>
+            </w:pPr>
+            <w:r>
+              <w:rPr>
+                <w:rFonts w:ascii="Times New Roman" w:cs="Times New Roman" w:eastAsia="宋体" w:hAnsi="Times New Roman"/>
+                <w:sz w:val="21"/>
+                <w:szCs w:val="21"/>
+              </w:rPr>
+              <w:t xml:space="preserve">与 </w:t>
+            </w:r>
+            <m:oMath>
+              <m:r>
+                <w:rPr>
+                  <w:sz w:val="21"/>
+                </w:rPr>
+                <m:t>u</m:t>
+              </m:r>
+            </m:oMath>
+            <w:r>
+              <w:rPr>
+                <w:rFonts w:ascii="Times New Roman" w:cs="Times New Roman" w:eastAsia="宋体" w:hAnsi="Times New Roman"/>
+                <w:sz w:val="21"/>
+                <w:szCs w:val="21"/>
+              </w:rPr>
+              <w:t xml:space="preserve"> 相同</w:t>
+            </w:r>
+          </w:p>
+        </w:tc>
+      </w:tr>
+      <w:tr>
+        <w:trPr>
+          <w:cantSplit/>
+          <w:tblHeader w:val="false"/>
+        </w:trPr>
+        <w:tc>
+          <w:tcPr>
+            <w:tcW w:type="dxa" w:w="1950"/>
+            <w:tcBorders>
+              <w:top w:val="none" w:color="FFFFFF" w:sz="0"/>
+              <w:left w:val="none" w:color="FFFFFF" w:sz="0"/>
+              <w:bottom w:val="none" w:color="FFFFFF" w:sz="0"/>
+              <w:right w:val="none" w:color="FFFFFF" w:sz="0"/>
+            </w:tcBorders>
+            <w:tcMar>
+              <w:top w:type="dxa" w:w="65"/>
+              <w:left w:type="dxa" w:w="75"/>
+              <w:bottom w:type="dxa" w:w="65"/>
+              <w:right w:type="dxa" w:w="75"/>
+            </w:tcMar>
+          </w:tcPr>
+          <w:p>
+            <w:pPr>
+              <w:keepNext/>
+              <w:widowControl/>
+              <w:overflowPunct w:val="0"/>
+              <w:spacing w:after="0" w:line="250"/>
+              <w:ind w:firstLine="0"/>
+              <w:jc w:val="center"/>
+            </w:pPr>
+            <m:oMath>
+              <m:bar>
+                <m:barPr>
+                  <m:pos m:val="top"/>
+                </m:barPr>
+                <m:e>
+                  <m:r>
+                    <w:rPr>
+                      <w:sz w:val="21"/>
+                    </w:rPr>
+                    <m:t>C</m:t>
+                  </m:r>
+                </m:e>
+              </m:bar>
+            </m:oMath>
+          </w:p>
+        </w:tc>
+        <w:tc>
+          <w:tcPr>
+            <w:tcW w:type="dxa" w:w="4200"/>
+            <w:tcBorders>
+              <w:top w:val="none" w:color="FFFFFF" w:sz="0"/>
+              <w:left w:val="none" w:color="FFFFFF" w:sz="0"/>
+              <w:bottom w:val="none" w:color="FFFFFF" w:sz="0"/>
+              <w:right w:val="none" w:color="FFFFFF" w:sz="0"/>
+            </w:tcBorders>
+            <w:tcMar>
+              <w:top w:type="dxa" w:w="65"/>
+              <w:left w:type="dxa" w:w="75"/>
+              <w:bottom w:type="dxa" w:w="65"/>
+              <w:right w:type="dxa" w:w="75"/>
+            </w:tcMar>
+          </w:tcPr>
+          <w:p>
+            <w:pPr>
+              <w:keepNext/>
+              <w:widowControl/>
+              <w:overflowPunct w:val="0"/>
+              <w:spacing w:after="0" w:line="250"/>
+              <w:ind w:firstLine="0"/>
+              <w:jc w:val="center"/>
+            </w:pPr>
+            <w:r>
+              <w:rPr>
+                <w:rFonts w:ascii="Times New Roman" w:cs="Times New Roman" w:eastAsia="宋体" w:hAnsi="Times New Roman"/>
+                <w:sz w:val="21"/>
+                <w:szCs w:val="21"/>
+              </w:rPr>
+              <w:t xml:space="preserve">截面面积加权平均干基含水率</w:t>
+            </w:r>
+          </w:p>
+        </w:tc>
+        <w:tc>
+          <w:tcPr>
+            <w:tcW w:type="dxa" w:w="2850"/>
+            <w:tcBorders>
+              <w:top w:val="none" w:color="FFFFFF" w:sz="0"/>
+              <w:left w:val="none" w:color="FFFFFF" w:sz="0"/>
+              <w:bottom w:val="none" w:color="FFFFFF" w:sz="0"/>
+              <w:right w:val="none" w:color="FFFFFF" w:sz="0"/>
+            </w:tcBorders>
+            <w:tcMar>
+              <w:top w:type="dxa" w:w="65"/>
+              <w:left w:type="dxa" w:w="75"/>
+              <w:bottom w:type="dxa" w:w="65"/>
+              <w:right w:type="dxa" w:w="75"/>
+            </w:tcMar>
+          </w:tcPr>
+          <w:p>
+            <w:pPr>
+              <w:keepNext/>
+              <w:widowControl/>
+              <w:overflowPunct w:val="0"/>
+              <w:spacing w:after="0" w:line="250"/>
+              <w:ind w:firstLine="0"/>
+              <w:jc w:val="center"/>
+            </w:pPr>
+            <w:r>
+              <w:rPr>
+                <w:rFonts w:ascii="Times New Roman" w:cs="Times New Roman" w:eastAsia="宋体" w:hAnsi="Times New Roman"/>
+                <w:sz w:val="21"/>
+                <w:szCs w:val="21"/>
+              </w:rPr>
+              <w:t xml:space="preserve">kg/kg</w:t>
+            </w:r>
+          </w:p>
+        </w:tc>
+      </w:tr>
+      <w:tr>
+        <w:trPr>
+          <w:cantSplit/>
+          <w:tblHeader w:val="false"/>
+        </w:trPr>
+        <w:tc>
+          <w:tcPr>
+            <w:tcW w:type="dxa" w:w="1950"/>
+            <w:tcBorders>
+              <w:top w:val="none" w:color="FFFFFF" w:sz="0"/>
+              <w:left w:val="none" w:color="FFFFFF" w:sz="0"/>
+              <w:bottom w:val="none" w:color="FFFFFF" w:sz="0"/>
+              <w:right w:val="none" w:color="FFFFFF" w:sz="0"/>
+            </w:tcBorders>
+            <w:tcMar>
+              <w:top w:type="dxa" w:w="65"/>
+              <w:left w:type="dxa" w:w="75"/>
+              <w:bottom w:type="dxa" w:w="65"/>
+              <w:right w:type="dxa" w:w="75"/>
+            </w:tcMar>
+          </w:tcPr>
+          <w:p>
+            <w:pPr>
+              <w:keepNext/>
+              <w:widowControl/>
+              <w:overflowPunct w:val="0"/>
+              <w:spacing w:after="0" w:line="250"/>
+              <w:ind w:firstLine="0"/>
+              <w:jc w:val="center"/>
+            </w:pPr>
+            <m:oMath>
+              <m:r>
+                <w:rPr>
+                  <w:sz w:val="21"/>
+                </w:rPr>
+                <m:t>g(t)</m:t>
+              </m:r>
+            </m:oMath>
+          </w:p>
+        </w:tc>
+        <w:tc>
+          <w:tcPr>
+            <w:tcW w:type="dxa" w:w="4200"/>
+            <w:tcBorders>
+              <w:top w:val="none" w:color="FFFFFF" w:sz="0"/>
+              <w:left w:val="none" w:color="FFFFFF" w:sz="0"/>
+              <w:bottom w:val="none" w:color="FFFFFF" w:sz="0"/>
+              <w:right w:val="none" w:color="FFFFFF" w:sz="0"/>
+            </w:tcBorders>
+            <w:tcMar>
+              <w:top w:type="dxa" w:w="65"/>
+              <w:left w:type="dxa" w:w="75"/>
+              <w:bottom w:type="dxa" w:w="65"/>
+              <w:right w:type="dxa" w:w="75"/>
+            </w:tcMar>
+          </w:tcPr>
+          <w:p>
+            <w:pPr>
+              <w:keepNext/>
+              <w:widowControl/>
+              <w:overflowPunct w:val="0"/>
+              <w:spacing w:after="0" w:line="250"/>
+              <w:ind w:firstLine="0"/>
+              <w:jc w:val="center"/>
+            </w:pPr>
+            <w:r>
+              <w:rPr>
+                <w:rFonts w:ascii="Times New Roman" w:cs="Times New Roman" w:eastAsia="宋体" w:hAnsi="Times New Roman"/>
+                <w:sz w:val="21"/>
+                <w:szCs w:val="21"/>
+              </w:rPr>
+              <w:t xml:space="preserve">全域最大含水率与 0.15 kg/kg 阈值的差</w:t>
+            </w:r>
+          </w:p>
+        </w:tc>
+        <w:tc>
+          <w:tcPr>
+            <w:tcW w:type="dxa" w:w="2850"/>
+            <w:tcBorders>
+              <w:top w:val="none" w:color="FFFFFF" w:sz="0"/>
+              <w:left w:val="none" w:color="FFFFFF" w:sz="0"/>
+              <w:bottom w:val="none" w:color="FFFFFF" w:sz="0"/>
+              <w:right w:val="none" w:color="FFFFFF" w:sz="0"/>
+            </w:tcBorders>
+            <w:tcMar>
+              <w:top w:type="dxa" w:w="65"/>
+              <w:left w:type="dxa" w:w="75"/>
+              <w:bottom w:type="dxa" w:w="65"/>
+              <w:right w:type="dxa" w:w="75"/>
+            </w:tcMar>
+          </w:tcPr>
+          <w:p>
+            <w:pPr>
+              <w:keepNext/>
+              <w:widowControl/>
+              <w:overflowPunct w:val="0"/>
+              <w:spacing w:after="0" w:line="250"/>
+              <w:ind w:firstLine="0"/>
+              <w:jc w:val="center"/>
+            </w:pPr>
+            <w:r>
+              <w:rPr>
+                <w:rFonts w:ascii="Times New Roman" w:cs="Times New Roman" w:eastAsia="宋体" w:hAnsi="Times New Roman"/>
+                <w:sz w:val="21"/>
+                <w:szCs w:val="21"/>
+              </w:rPr>
+              <w:t xml:space="preserve">kg/kg</w:t>
+            </w:r>
+          </w:p>
+        </w:tc>
+      </w:tr>
+      <w:tr>
+        <w:trPr>
+          <w:cantSplit/>
+          <w:tblHeader w:val="false"/>
+        </w:trPr>
+        <w:tc>
+          <w:tcPr>
+            <w:tcW w:type="dxa" w:w="1950"/>
+            <w:tcBorders>
+              <w:top w:val="none" w:color="FFFFFF" w:sz="0"/>
+              <w:left w:val="none" w:color="FFFFFF" w:sz="0"/>
+              <w:bottom w:val="none" w:color="FFFFFF" w:sz="0"/>
+              <w:right w:val="none" w:color="FFFFFF" w:sz="0"/>
+            </w:tcBorders>
+            <w:tcMar>
+              <w:top w:type="dxa" w:w="65"/>
+              <w:left w:type="dxa" w:w="75"/>
+              <w:bottom w:type="dxa" w:w="65"/>
+              <w:right w:type="dxa" w:w="75"/>
+            </w:tcMar>
+          </w:tcPr>
+          <w:p>
+            <w:pPr>
+              <w:keepNext/>
+              <w:widowControl/>
+              <w:overflowPunct w:val="0"/>
+              <w:spacing w:after="0" w:line="250"/>
+              <w:ind w:firstLine="0"/>
+              <w:jc w:val="center"/>
+            </w:pPr>
+            <m:oMath>
+              <m:r>
+                <m:rPr>
+                  <m:sty m:val="b"/>
+                </m:rPr>
+                <w:rPr>
+                  <w:sz w:val="21"/>
+                </w:rPr>
+                <m:t>v</m:t>
+              </m:r>
+              <m:r>
+                <w:rPr>
+                  <w:sz w:val="21"/>
+                </w:rPr>
+                <m:t>,</m:t>
+              </m:r>
+              <m:sSub>
+                <m:e>
+                  <m:r>
+                    <m:rPr>
+                      <m:sty m:val="b"/>
+                    </m:rPr>
+                    <w:rPr>
+                      <w:sz w:val="21"/>
+                    </w:rPr>
+                    <m:t>j</m:t>
+                  </m:r>
+                </m:e>
+                <m:sub>
+                  <m:r>
+                    <w:rPr>
+                      <w:sz w:val="21"/>
+                    </w:rPr>
+                    <m:t>w</m:t>
+                  </m:r>
+                </m:sub>
+              </m:sSub>
+            </m:oMath>
+          </w:p>
+        </w:tc>
+        <w:tc>
+          <w:tcPr>
+            <w:tcW w:type="dxa" w:w="4200"/>
+            <w:tcBorders>
+              <w:top w:val="none" w:color="FFFFFF" w:sz="0"/>
+              <w:left w:val="none" w:color="FFFFFF" w:sz="0"/>
+              <w:bottom w:val="none" w:color="FFFFFF" w:sz="0"/>
+              <w:right w:val="none" w:color="FFFFFF" w:sz="0"/>
+            </w:tcBorders>
+            <w:tcMar>
+              <w:top w:type="dxa" w:w="65"/>
+              <w:left w:type="dxa" w:w="75"/>
+              <w:bottom w:type="dxa" w:w="65"/>
+              <w:right w:type="dxa" w:w="75"/>
+            </w:tcMar>
+          </w:tcPr>
+          <w:p>
+            <w:pPr>
+              <w:keepNext/>
+              <w:widowControl/>
+              <w:overflowPunct w:val="0"/>
+              <w:spacing w:after="0" w:line="250"/>
+              <w:ind w:firstLine="0"/>
+              <w:jc w:val="center"/>
+            </w:pPr>
+            <w:r>
+              <w:rPr>
+                <w:rFonts w:ascii="Times New Roman" w:cs="Times New Roman" w:eastAsia="宋体" w:hAnsi="Times New Roman"/>
+                <w:sz w:val="21"/>
+                <w:szCs w:val="21"/>
+              </w:rPr>
+              <w:t xml:space="preserve">骨架速度、水分相对骨架的扩散通量</w:t>
+            </w:r>
+          </w:p>
+        </w:tc>
+        <w:tc>
+          <w:tcPr>
+            <w:tcW w:type="dxa" w:w="2850"/>
+            <w:tcBorders>
+              <w:top w:val="none" w:color="FFFFFF" w:sz="0"/>
+              <w:left w:val="none" w:color="FFFFFF" w:sz="0"/>
+              <w:bottom w:val="none" w:color="FFFFFF" w:sz="0"/>
+              <w:right w:val="none" w:color="FFFFFF" w:sz="0"/>
+            </w:tcBorders>
+            <w:tcMar>
+              <w:top w:type="dxa" w:w="65"/>
+              <w:left w:type="dxa" w:w="75"/>
+              <w:bottom w:type="dxa" w:w="65"/>
+              <w:right w:type="dxa" w:w="75"/>
+            </w:tcMar>
+          </w:tcPr>
+          <w:p>
+            <w:pPr>
+              <w:keepNext/>
+              <w:widowControl/>
+              <w:overflowPunct w:val="0"/>
+              <w:spacing w:after="0" w:line="250"/>
+              <w:ind w:firstLine="0"/>
+              <w:jc w:val="center"/>
+            </w:pPr>
+            <w:r>
+              <w:rPr>
+                <w:rFonts w:ascii="Times New Roman" w:cs="Times New Roman" w:eastAsia="宋体" w:hAnsi="Times New Roman"/>
+                <w:sz w:val="21"/>
+                <w:szCs w:val="21"/>
+              </w:rPr>
+              <w:t xml:space="preserve">m/s、kg/(m²·s)</w:t>
+            </w:r>
+          </w:p>
+        </w:tc>
+      </w:tr>
+      <w:tr>
+        <w:trPr>
+          <w:cantSplit/>
+          <w:tblHeader w:val="false"/>
+        </w:trPr>
+        <w:tc>
+          <w:tcPr>
+            <w:tcW w:type="dxa" w:w="1950"/>
+            <w:tcBorders>
+              <w:top w:val="none" w:color="FFFFFF" w:sz="0"/>
+              <w:left w:val="none" w:color="FFFFFF" w:sz="0"/>
+              <w:bottom w:val="none" w:color="FFFFFF" w:sz="0"/>
+              <w:right w:val="none" w:color="FFFFFF" w:sz="0"/>
+            </w:tcBorders>
+            <w:tcMar>
+              <w:top w:type="dxa" w:w="65"/>
+              <w:left w:type="dxa" w:w="75"/>
+              <w:bottom w:type="dxa" w:w="65"/>
+              <w:right w:type="dxa" w:w="75"/>
+            </w:tcMar>
+          </w:tcPr>
+          <w:p>
+            <w:pPr>
+              <w:keepNext/>
+              <w:widowControl/>
+              <w:overflowPunct w:val="0"/>
+              <w:spacing w:after="0" w:line="250"/>
+              <w:ind w:firstLine="0"/>
+              <w:jc w:val="center"/>
+            </w:pPr>
+            <m:oMath>
+              <m:sSub>
+                <m:e>
+                  <m:r>
+                    <w:rPr>
+                      <w:sz w:val="21"/>
+                    </w:rPr>
+                    <m:t>ρ</m:t>
+                  </m:r>
+                </m:e>
+                <m:sub>
+                  <m:r>
+                    <w:rPr>
+                      <w:sz w:val="21"/>
+                    </w:rPr>
+                    <m:t>d0</m:t>
+                  </m:r>
+                </m:sub>
+              </m:sSub>
+              <m:r>
+                <w:rPr>
+                  <w:sz w:val="21"/>
+                </w:rPr>
+                <m:t>,</m:t>
+              </m:r>
+              <m:sSub>
+                <m:e>
+                  <m:r>
+                    <w:rPr>
+                      <w:sz w:val="21"/>
+                    </w:rPr>
+                    <m:t>M</m:t>
+                  </m:r>
+                </m:e>
+                <m:sub>
+                  <m:r>
+                    <w:rPr>
+                      <w:sz w:val="21"/>
+                    </w:rPr>
+                    <m:t>d</m:t>
+                  </m:r>
+                </m:sub>
+              </m:sSub>
+              <m:r>
+                <w:rPr>
+                  <w:sz w:val="21"/>
+                </w:rPr>
+                <m:t>,L</m:t>
+              </m:r>
+            </m:oMath>
+          </w:p>
+        </w:tc>
+        <w:tc>
+          <w:tcPr>
+            <w:tcW w:type="dxa" w:w="4200"/>
+            <w:tcBorders>
+              <w:top w:val="none" w:color="FFFFFF" w:sz="0"/>
+              <w:left w:val="none" w:color="FFFFFF" w:sz="0"/>
+              <w:bottom w:val="none" w:color="FFFFFF" w:sz="0"/>
+              <w:right w:val="none" w:color="FFFFFF" w:sz="0"/>
+            </w:tcBorders>
+            <w:tcMar>
+              <w:top w:type="dxa" w:w="65"/>
+              <w:left w:type="dxa" w:w="75"/>
+              <w:bottom w:type="dxa" w:w="65"/>
+              <w:right w:type="dxa" w:w="75"/>
+            </w:tcMar>
+          </w:tcPr>
+          <w:p>
+            <w:pPr>
+              <w:keepNext/>
+              <w:widowControl/>
+              <w:overflowPunct w:val="0"/>
+              <w:spacing w:after="0" w:line="250"/>
+              <w:ind w:firstLine="0"/>
+              <w:jc w:val="center"/>
+            </w:pPr>
+            <w:r>
+              <w:rPr>
+                <w:rFonts w:ascii="Times New Roman" w:cs="Times New Roman" w:eastAsia="宋体" w:hAnsi="Times New Roman"/>
+                <w:sz w:val="21"/>
+                <w:szCs w:val="21"/>
+              </w:rPr>
+              <w:t xml:space="preserve">初始干密度、总干物质量和药材长度</w:t>
+            </w:r>
+          </w:p>
+        </w:tc>
+        <w:tc>
+          <w:tcPr>
+            <w:tcW w:type="dxa" w:w="2850"/>
+            <w:tcBorders>
+              <w:top w:val="none" w:color="FFFFFF" w:sz="0"/>
+              <w:left w:val="none" w:color="FFFFFF" w:sz="0"/>
+              <w:bottom w:val="none" w:color="FFFFFF" w:sz="0"/>
+              <w:right w:val="none" w:color="FFFFFF" w:sz="0"/>
+            </w:tcBorders>
+            <w:tcMar>
+              <w:top w:type="dxa" w:w="65"/>
+              <w:left w:type="dxa" w:w="75"/>
+              <w:bottom w:type="dxa" w:w="65"/>
+              <w:right w:type="dxa" w:w="75"/>
+            </w:tcMar>
+          </w:tcPr>
+          <w:p>
+            <w:pPr>
+              <w:keepNext/>
+              <w:widowControl/>
+              <w:overflowPunct w:val="0"/>
+              <w:spacing w:after="0" w:line="250"/>
+              <w:ind w:firstLine="0"/>
+              <w:jc w:val="center"/>
+            </w:pPr>
+            <w:r>
+              <w:rPr>
+                <w:rFonts w:ascii="Times New Roman" w:cs="Times New Roman" w:eastAsia="宋体" w:hAnsi="Times New Roman"/>
+                <w:sz w:val="21"/>
+                <w:szCs w:val="21"/>
+              </w:rPr>
+              <w:t xml:space="preserve">kg/m³、kg、m</w:t>
+            </w:r>
+          </w:p>
+        </w:tc>
+      </w:tr>
+      <w:tr>
+        <w:trPr>
+          <w:cantSplit/>
+          <w:tblHeader w:val="false"/>
+        </w:trPr>
+        <w:tc>
+          <w:tcPr>
+            <w:tcW w:type="dxa" w:w="1950"/>
+            <w:tcBorders>
+              <w:top w:val="none" w:color="FFFFFF" w:sz="0"/>
+              <w:left w:val="none" w:color="FFFFFF" w:sz="0"/>
+              <w:bottom w:val="single" w:color="000000" w:sz="12"/>
+              <w:right w:val="none" w:color="FFFFFF" w:sz="0"/>
+            </w:tcBorders>
+            <w:tcMar>
+              <w:top w:type="dxa" w:w="65"/>
+              <w:left w:type="dxa" w:w="75"/>
+              <w:bottom w:type="dxa" w:w="65"/>
+              <w:right w:type="dxa" w:w="75"/>
+            </w:tcMar>
+          </w:tcPr>
+          <w:p>
+            <w:pPr>
+              <w:keepNext w:val="false"/>
+              <w:widowControl/>
+              <w:overflowPunct w:val="0"/>
+              <w:spacing w:after="0" w:line="250"/>
+              <w:ind w:firstLine="0"/>
+              <w:jc w:val="center"/>
+            </w:pPr>
+            <m:oMath>
+              <m:limUpp>
+                <m:e>
+                  <m:r>
+                    <w:rPr>
+                      <w:sz w:val="21"/>
+                    </w:rPr>
+                    <m:t>R</m:t>
+                  </m:r>
+                </m:e>
+                <m:lim>
+                  <m:r>
+                    <w:rPr>
+                      <w:sz w:val="21"/>
+                    </w:rPr>
+                    <m:t>˙</m:t>
+                  </m:r>
+                </m:lim>
+              </m:limUpp>
+            </m:oMath>
+          </w:p>
+        </w:tc>
+        <w:tc>
+          <w:tcPr>
+            <w:tcW w:type="dxa" w:w="4200"/>
+            <w:tcBorders>
+              <w:top w:val="none" w:color="FFFFFF" w:sz="0"/>
+              <w:left w:val="none" w:color="FFFFFF" w:sz="0"/>
+              <w:bottom w:val="single" w:color="000000" w:sz="12"/>
+              <w:right w:val="none" w:color="FFFFFF" w:sz="0"/>
+            </w:tcBorders>
+            <w:tcMar>
+              <w:top w:type="dxa" w:w="65"/>
+              <w:left w:type="dxa" w:w="75"/>
+              <w:bottom w:type="dxa" w:w="65"/>
+              <w:right w:type="dxa" w:w="75"/>
+            </w:tcMar>
+          </w:tcPr>
+          <w:p>
+            <w:pPr>
+              <w:keepNext w:val="false"/>
+              <w:widowControl/>
+              <w:overflowPunct w:val="0"/>
+              <w:spacing w:after="0" w:line="250"/>
+              <w:ind w:firstLine="0"/>
+              <w:jc w:val="center"/>
+            </w:pPr>
+            <w:r>
+              <w:rPr>
+                <w:rFonts w:ascii="Times New Roman" w:cs="Times New Roman" w:eastAsia="宋体" w:hAnsi="Times New Roman"/>
+                <w:sz w:val="21"/>
+                <w:szCs w:val="21"/>
+              </w:rPr>
+              <w:t xml:space="preserve">表面半径对时间的导数</w:t>
+            </w:r>
+          </w:p>
+        </w:tc>
+        <w:tc>
+          <w:tcPr>
+            <w:tcW w:type="dxa" w:w="2850"/>
+            <w:tcBorders>
+              <w:top w:val="none" w:color="FFFFFF" w:sz="0"/>
+              <w:left w:val="none" w:color="FFFFFF" w:sz="0"/>
+              <w:bottom w:val="single" w:color="000000" w:sz="12"/>
+              <w:right w:val="none" w:color="FFFFFF" w:sz="0"/>
+            </w:tcBorders>
+            <w:tcMar>
+              <w:top w:type="dxa" w:w="65"/>
+              <w:left w:type="dxa" w:w="75"/>
+              <w:bottom w:type="dxa" w:w="65"/>
+              <w:right w:type="dxa" w:w="75"/>
+            </w:tcMar>
+          </w:tcPr>
+          <w:p>
+            <w:pPr>
+              <w:keepNext w:val="false"/>
+              <w:widowControl/>
+              <w:overflowPunct w:val="0"/>
+              <w:spacing w:after="0" w:line="250"/>
+              <w:ind w:firstLine="0"/>
+              <w:jc w:val="center"/>
+            </w:pPr>
+            <w:r>
+              <w:rPr>
+                <w:rFonts w:ascii="Times New Roman" w:cs="Times New Roman" w:eastAsia="宋体" w:hAnsi="Times New Roman"/>
+                <w:sz w:val="21"/>
+                <w:szCs w:val="21"/>
+              </w:rPr>
+              <w:t xml:space="preserve">m/s</w:t>
+            </w:r>
+          </w:p>
+        </w:tc>
+      </w:tr>
+    </w:tbl>
+    <w:p>
+      <w:pPr>
+        <w:widowControl/>
+        <w:overflowPunct w:val="0"/>
+        <w:spacing w:after="70" w:line="300"/>
+        <w:ind w:firstLine="480"/>
+        <w:jc w:val="both"/>
+      </w:pPr>
+      <w:r>
+        <w:rPr>
+          <w:rFonts w:ascii="Times New Roman" w:cs="Times New Roman" w:eastAsia="宋体" w:hAnsi="Times New Roman"/>
+          <w:sz w:val="24"/>
+          <w:szCs w:val="24"/>
+        </w:rPr>
+        <w:t xml:space="preserve">所有计算距离使用 m，表格按题意显示 cm；内部温度保存为 ℃，只在扩散率的 Arrhenius 项中换算为 K。后文的“水分浓度”均指题目定义的干基含水率。至此，后文公式和表格中出现的主要变量均已给出定义。</w:t>
       </w:r>
     </w:p>
     <w:p>

</xml_diff>

<commit_message>
Clarify contestant-led AI usage disclosure
</commit_message>
<xml_diff>
--- a/deliverables/polished_20260912/A题论文_可编辑版.docx
+++ b/deliverables/polished_20260912/A题论文_可编辑版.docx
@@ -24696,7 +24696,7 @@
           <w:sz w:val="24"/>
           <w:szCs w:val="24"/>
         </w:rPr>
-        <w:t xml:space="preserve">本参赛队在竞赛过程中使用了AI工具，主要用于模型推导辅助、代码实现与调试、数值复算和结果核查、论文初稿组织及语言润色，详细使用情况见支撑材料。</w:t>
+        <w:t xml:space="preserve">本参赛队在竞赛过程中使用了AI工具，主要用于代码调试、重复性计算检查、文件一致性检查和语言润色，详细使用情况见支撑材料。</w:t>
       </w:r>
     </w:p>
     <w:p>
@@ -24713,7 +24713,7 @@
           <w:sz w:val="24"/>
           <w:szCs w:val="24"/>
         </w:rPr>
-        <w:t xml:space="preserve">参赛队对模型、代码、数值、参考文献和最终表述承担核验责任。工具的具体用途与核验方式见支撑材料中的《AI 工具使用详情.pdf》，本节披露不作为参考文献引用。</w:t>
+        <w:t xml:space="preserve">本题的核心建模与分析由参赛队主导：队员确定模型框架、假设、参数和边界条件，审定数值结果及其解释，并决定最终提交内容。AI 的任何建议、代码修改或文字均经队员逐项审查、修改和核验。参赛队对模型、代码、数值、参考文献和最终表述承担责任。工具的具体用途与核验方式见支撑材料中的《AI 工具使用详情.pdf》，本节披露不作为参考文献引用。</w:t>
       </w:r>
     </w:p>
     <w:p>

</xml_diff>